<commit_message>
docs: pessoas (RF43, UC36, DER), painel com veículos na DEPOL e contrato no endpoints.md
- DER e diagrama de classes com a tabela pessoa e oitiva_parte.pessoa_id
- docx: RF43, UC36, escopo, regras de acesso e MER de pessoas; RF37 com o card
  de veículos só NA_DEPOL; significado de EM_PATIO no RF25
- endpoints.md: seção 5.6 Pessoas e pessoaId nas partes da oitiva
- CLAUDE.md: Pessoa, painel e minha mesa como implementados

Co-Authored-By: Claude Opus 5.5 <noreply@anthropic.com>
Claude-Session: https://claude.ai/code/session_01GMFoBKNCA64LGtSS3QvF5S
</commit_message>
<xml_diff>
--- a/docs/SISGEP_Documentacao.docx
+++ b/docs/SISGEP_Documentacao.docx
@@ -537,7 +537,7 @@
         <w:rPr>
           <w:rtl w:val="0"/>
         </w:rPr>
-        <w:t>Solução 5</w:t>
+        <w:t>Solução 6</w:t>
       </w:r>
     </w:p>
     <w:p>
@@ -756,7 +756,7 @@
           <w:szCs w:val="22"/>
           <w:rtl w:val="0"/>
         </w:rPr>
-        <w:t>24</w:t>
+        <w:t>25</w:t>
       </w:r>
       <w:r>
         <w:rPr>
@@ -801,7 +801,7 @@
         <w:rPr>
           <w:rtl w:val="0"/>
         </w:rPr>
-        <w:t>Oitivas 24</w:t>
+        <w:t>Oitivas 25</w:t>
       </w:r>
     </w:p>
     <w:p>
@@ -857,7 +857,7 @@
         <w:rPr>
           <w:rtl w:val="0"/>
         </w:rPr>
-        <w:t>e Usuários 25</w:t>
+        <w:t>e Usuários 26</w:t>
       </w:r>
     </w:p>
     <w:p>
@@ -897,7 +897,7 @@
         <w:rPr>
           <w:rtl w:val="0"/>
         </w:rPr>
-        <w:t>Procedimentos 25</w:t>
+        <w:t>Procedimentos 26</w:t>
       </w:r>
     </w:p>
     <w:p>
@@ -953,7 +953,7 @@
         <w:rPr>
           <w:rtl w:val="0"/>
         </w:rPr>
-        <w:t>Exportacao 26</w:t>
+        <w:t>Exportacao 27</w:t>
       </w:r>
     </w:p>
     <w:p>
@@ -1009,7 +1009,7 @@
         <w:rPr>
           <w:rtl w:val="0"/>
         </w:rPr>
-        <w:t>Apreendidos 27</w:t>
+        <w:t>Apreendidos 28</w:t>
       </w:r>
     </w:p>
     <w:p>
@@ -1065,7 +1065,7 @@
         <w:rPr>
           <w:rtl w:val="0"/>
         </w:rPr>
-        <w:t>Expedidos 28</w:t>
+        <w:t>Expedidos 29</w:t>
       </w:r>
     </w:p>
     <w:p>
@@ -1091,7 +1091,7 @@
           <w:szCs w:val="22"/>
           <w:rtl w:val="0"/>
         </w:rPr>
-        <w:t>28</w:t>
+        <w:t>29</w:t>
       </w:r>
       <w:r>
         <w:rPr>
@@ -1122,7 +1122,7 @@
           <w:szCs w:val="22"/>
           <w:rtl w:val="0"/>
         </w:rPr>
-        <w:t>30</w:t>
+        <w:t>31</w:t>
       </w:r>
       <w:r>
         <w:rPr>
@@ -1151,7 +1151,7 @@
         <w:rPr>
           <w:rtl w:val="0"/>
         </w:rPr>
-        <w:t>32</w:t>
+        <w:t>33</w:t>
       </w:r>
     </w:p>
     <w:p>
@@ -1174,7 +1174,7 @@
         <w:rPr>
           <w:rtl w:val="0"/>
         </w:rPr>
-        <w:t>34</w:t>
+        <w:t>35</w:t>
       </w:r>
     </w:p>
     <w:p>
@@ -1199,7 +1199,7 @@
           <w:szCs w:val="20"/>
           <w:rtl w:val="0"/>
         </w:rPr>
-        <w:t>34</w:t>
+        <w:t>35</w:t>
       </w:r>
       <w:r>
         <w:rPr>
@@ -1229,7 +1229,7 @@
           <w:szCs w:val="20"/>
           <w:rtl w:val="0"/>
         </w:rPr>
-        <w:t>35</w:t>
+        <w:t>36</w:t>
       </w:r>
       <w:r>
         <w:rPr>
@@ -1259,7 +1259,7 @@
           <w:szCs w:val="20"/>
           <w:rtl w:val="0"/>
         </w:rPr>
-        <w:t>35</w:t>
+        <w:t>36</w:t>
       </w:r>
       <w:r>
         <w:rPr>
@@ -1289,7 +1289,7 @@
           <w:szCs w:val="20"/>
           <w:rtl w:val="0"/>
         </w:rPr>
-        <w:t>36</w:t>
+        <w:t>37</w:t>
       </w:r>
       <w:r>
         <w:rPr>
@@ -1319,7 +1319,7 @@
           <w:szCs w:val="20"/>
           <w:rtl w:val="0"/>
         </w:rPr>
-        <w:t>36</w:t>
+        <w:t>37</w:t>
       </w:r>
       <w:r>
         <w:rPr>
@@ -1349,7 +1349,7 @@
           <w:szCs w:val="20"/>
           <w:rtl w:val="0"/>
         </w:rPr>
-        <w:t>37</w:t>
+        <w:t>38</w:t>
       </w:r>
       <w:r>
         <w:rPr>
@@ -1379,7 +1379,7 @@
           <w:szCs w:val="20"/>
           <w:rtl w:val="0"/>
         </w:rPr>
-        <w:t>37</w:t>
+        <w:t>38</w:t>
       </w:r>
       <w:r>
         <w:rPr>
@@ -1409,7 +1409,7 @@
           <w:szCs w:val="22"/>
           <w:rtl w:val="0"/>
         </w:rPr>
-        <w:t>38</w:t>
+        <w:t>39</w:t>
       </w:r>
       <w:r>
         <w:rPr>
@@ -2703,7 +2703,7 @@
           <w:szCs w:val="24"/>
           <w:rtl w:val="0"/>
         </w:rPr>
-        <w:t>Painel inicial e Minha mesa: visão consolidada da rotina (oitivas do dia, procedimentos em posse do usuário, repasses pendentes, veículos sob responsabilidade da delegacia e procedimentos sem movimentação), calculada a partir dos dados já registrados.</w:t>
+        <w:t>Painel inicial e Minha mesa: visão consolidada da rotina (oitivas do dia, procedimentos em posse do usuário, repasses pendentes, veículos na DEPOL com a situação da perícia e procedimentos sem movimentação), calculada a partir dos dados já registrados.</w:t>
       </w:r>
       <w:r>
         <w:rPr>
@@ -2784,7 +2784,7 @@
           <w:szCs w:val="24"/>
           <w:rtl w:val="0"/>
         </w:rPr>
-        <w:t>Busca global (procedimento, placa, lacre e ofício), fotos da apreensão na ficha do veículo e alteração da própria senha pelo usuário.</w:t>
+        <w:t>Cadastro de pessoas (vítimas, testemunhas e investigados) com vínculo opcional às partes das oitivas, consulta das participações de cada pessoa e proteção dos dados pessoais (CPF mascarado; telefone e endereço apenas na ficha).</w:t>
       </w:r>
       <w:r>
         <w:rPr>
@@ -2865,7 +2865,7 @@
           <w:szCs w:val="24"/>
           <w:rtl w:val="0"/>
         </w:rPr>
-        <w:t xml:space="preserve">Autenticação</w:t>
+        <w:t>Busca global (procedimento, placa, lacre e ofício), fotos da apreensão na ficha do veículo e alteração da própria senha pelo usuário.</w:t>
       </w:r>
       <w:r>
         <w:rPr>
@@ -2883,15 +2883,13 @@
           <w:vertAlign w:val="baseline"/>
           <w:rtl w:val="0"/>
         </w:rPr>
-        <w:t xml:space="preserve"> JWT e </w:t>
-      </w:r>
-      <w:r>
-        <w:rPr>
-          <w:sz w:val="24"/>
-          <w:szCs w:val="24"/>
-          <w:rtl w:val="0"/>
-        </w:rPr>
-        <w:t xml:space="preserve">autorização</w:t>
+      </w:r>
+      <w:r>
+        <w:rPr>
+          <w:sz w:val="24"/>
+          <w:szCs w:val="24"/>
+          <w:rtl w:val="0"/>
+        </w:rPr>
       </w:r>
       <w:r>
         <w:rPr>
@@ -2909,7 +2907,6 @@
           <w:vertAlign w:val="baseline"/>
           <w:rtl w:val="0"/>
         </w:rPr>
-        <w:t xml:space="preserve"> por papel (role-based).</w:t>
       </w:r>
       <w:r>
         <w:rPr>
@@ -2945,6 +2942,14 @@
       </w:pPr>
       <w:r>
         <w:rPr>
+          <w:sz w:val="24"/>
+          <w:szCs w:val="24"/>
+          <w:rtl w:val="0"/>
+        </w:rPr>
+        <w:t xml:space="preserve">Autenticação</w:t>
+      </w:r>
+      <w:r>
+        <w:rPr>
           <w:rFonts w:ascii="Times New Roman" w:cs="Times New Roman" w:eastAsia="Times New Roman" w:hAnsi="Times New Roman"/>
           <w:b w:val="0"/>
           <w:bCs w:val="0"/>
@@ -2959,15 +2964,15 @@
           <w:vertAlign w:val="baseline"/>
           <w:rtl w:val="0"/>
         </w:rPr>
-        <w:t xml:space="preserve">Cadastro de </w:t>
-      </w:r>
-      <w:r>
-        <w:rPr>
-          <w:sz w:val="24"/>
-          <w:szCs w:val="24"/>
-          <w:rtl w:val="0"/>
-        </w:rPr>
-        <w:t xml:space="preserve">usuários</w:t>
+        <w:t xml:space="preserve"> JWT e </w:t>
+      </w:r>
+      <w:r>
+        <w:rPr>
+          <w:sz w:val="24"/>
+          <w:szCs w:val="24"/>
+          <w:rtl w:val="0"/>
+        </w:rPr>
+        <w:t xml:space="preserve">autorização</w:t>
       </w:r>
       <w:r>
         <w:rPr>
@@ -2985,81 +2990,12 @@
           <w:vertAlign w:val="baseline"/>
           <w:rtl w:val="0"/>
         </w:rPr>
-        <w:t xml:space="preserve"> com fluxo de </w:t>
-      </w:r>
-      <w:r>
-        <w:rPr>
-          <w:sz w:val="24"/>
-          <w:szCs w:val="24"/>
-          <w:rtl w:val="0"/>
-        </w:rPr>
-        <w:t xml:space="preserve">aprovação</w:t>
-      </w:r>
-      <w:r>
-        <w:rPr>
-          <w:rFonts w:ascii="Times New Roman" w:cs="Times New Roman" w:eastAsia="Times New Roman" w:hAnsi="Times New Roman"/>
-          <w:b w:val="0"/>
-          <w:bCs w:val="0"/>
-          <w:i w:val="0"/>
-          <w:iCs w:val="0"/>
-          <w:smallCaps w:val="0"/>
-          <w:strike w:val="0"/>
-          <w:sz w:val="24"/>
-          <w:szCs w:val="24"/>
-          <w:u w:val="none"/>
-          <w:shd w:fill="auto" w:val="clear"/>
-          <w:vertAlign w:val="baseline"/>
-          <w:rtl w:val="0"/>
-        </w:rPr>
-        <w:t xml:space="preserve"> (</w:t>
-      </w:r>
-      <w:r>
-        <w:rPr>
-          <w:sz w:val="24"/>
-          <w:szCs w:val="24"/>
-          <w:rtl w:val="0"/>
-        </w:rPr>
-        <w:t xml:space="preserve">Estagiário</w:t>
-      </w:r>
-      <w:r>
-        <w:rPr>
-          <w:rFonts w:ascii="Times New Roman" w:cs="Times New Roman" w:eastAsia="Times New Roman" w:hAnsi="Times New Roman"/>
-          <w:b w:val="0"/>
-          <w:bCs w:val="0"/>
-          <w:i w:val="0"/>
-          <w:iCs w:val="0"/>
-          <w:smallCaps w:val="0"/>
-          <w:strike w:val="0"/>
-          <w:sz w:val="24"/>
-          <w:szCs w:val="24"/>
-          <w:u w:val="none"/>
-          <w:shd w:fill="auto" w:val="clear"/>
-          <w:vertAlign w:val="baseline"/>
-          <w:rtl w:val="0"/>
-        </w:rPr>
-        <w:t xml:space="preserve">/Policial/Delegado -&gt; pendente -&gt; aprovado por Admin).</w:t>
-      </w:r>
-      <w:r>
-        <w:rPr>
-          <w:rtl w:val="0"/>
-        </w:rPr>
-      </w:r>
-    </w:p>
-    <w:p>
-      <w:pPr>
-        <w:pStyle w:val="Heading3"/>
-        <w:spacing w:after="100" w:before="200" w:lineRule="auto"/>
-        <w:jc w:val="both"/>
-        <w:rPr>
-          <w:color w:val="000000"/>
-        </w:rPr>
-      </w:pPr>
-      <w:r>
-        <w:rPr>
-          <w:color w:val="000000"/>
-          <w:rtl w:val="0"/>
-        </w:rPr>
-        <w:t xml:space="preserve">Fase posterior (fora do escopo desta versão)</w:t>
+        <w:t xml:space="preserve"> por papel (role-based).</w:t>
+      </w:r>
+      <w:r>
+        <w:rPr>
+          <w:rtl w:val="0"/>
+        </w:rPr>
       </w:r>
     </w:p>
     <w:p>
@@ -3090,14 +3026,6 @@
       </w:pPr>
       <w:r>
         <w:rPr>
-          <w:sz w:val="24"/>
-          <w:szCs w:val="24"/>
-          <w:rtl w:val="0"/>
-        </w:rPr>
-        <w:t xml:space="preserve">Importação</w:t>
-      </w:r>
-      <w:r>
-        <w:rPr>
           <w:rFonts w:ascii="Times New Roman" w:cs="Times New Roman" w:eastAsia="Times New Roman" w:hAnsi="Times New Roman"/>
           <w:b w:val="0"/>
           <w:bCs w:val="0"/>
@@ -3112,15 +3040,15 @@
           <w:vertAlign w:val="baseline"/>
           <w:rtl w:val="0"/>
         </w:rPr>
-        <w:t xml:space="preserve"> do Acervo Procedimental </w:t>
-      </w:r>
-      <w:r>
-        <w:rPr>
-          <w:sz w:val="24"/>
-          <w:szCs w:val="24"/>
-          <w:rtl w:val="0"/>
-        </w:rPr>
-        <w:t xml:space="preserve">histórico</w:t>
+        <w:t xml:space="preserve">Cadastro de </w:t>
+      </w:r>
+      <w:r>
+        <w:rPr>
+          <w:sz w:val="24"/>
+          <w:szCs w:val="24"/>
+          <w:rtl w:val="0"/>
+        </w:rPr>
+        <w:t xml:space="preserve">usuários</w:t>
       </w:r>
       <w:r>
         <w:rPr>
@@ -3138,15 +3066,15 @@
           <w:vertAlign w:val="baseline"/>
           <w:rtl w:val="0"/>
         </w:rPr>
-        <w:t xml:space="preserve"> via CSV (</w:t>
-      </w:r>
-      <w:r>
-        <w:rPr>
-          <w:sz w:val="24"/>
-          <w:szCs w:val="24"/>
-          <w:rtl w:val="0"/>
-        </w:rPr>
-        <w:t xml:space="preserve">tolerância a</w:t>
+        <w:t xml:space="preserve"> com fluxo de </w:t>
+      </w:r>
+      <w:r>
+        <w:rPr>
+          <w:sz w:val="24"/>
+          <w:szCs w:val="24"/>
+          <w:rtl w:val="0"/>
+        </w:rPr>
+        <w:t xml:space="preserve">aprovação</w:t>
       </w:r>
       <w:r>
         <w:rPr>
@@ -3164,15 +3092,15 @@
           <w:vertAlign w:val="baseline"/>
           <w:rtl w:val="0"/>
         </w:rPr>
-        <w:t xml:space="preserve"> erro por linha, com tabela de log de </w:t>
-      </w:r>
-      <w:r>
-        <w:rPr>
-          <w:sz w:val="24"/>
-          <w:szCs w:val="24"/>
-          <w:rtl w:val="0"/>
-        </w:rPr>
-        <w:t xml:space="preserve">importação</w:t>
+        <w:t xml:space="preserve"> (</w:t>
+      </w:r>
+      <w:r>
+        <w:rPr>
+          <w:sz w:val="24"/>
+          <w:szCs w:val="24"/>
+          <w:rtl w:val="0"/>
+        </w:rPr>
+        <w:t xml:space="preserve">Estagiário</w:t>
       </w:r>
       <w:r>
         <w:rPr>
@@ -3190,12 +3118,29 @@
           <w:vertAlign w:val="baseline"/>
           <w:rtl w:val="0"/>
         </w:rPr>
-        <w:t xml:space="preserve">).</w:t>
-      </w:r>
-      <w:r>
-        <w:rPr>
-          <w:rtl w:val="0"/>
-        </w:rPr>
+        <w:t xml:space="preserve">/Policial/Delegado -&gt; pendente -&gt; aprovado por Admin).</w:t>
+      </w:r>
+      <w:r>
+        <w:rPr>
+          <w:rtl w:val="0"/>
+        </w:rPr>
+      </w:r>
+    </w:p>
+    <w:p>
+      <w:pPr>
+        <w:pStyle w:val="Heading3"/>
+        <w:spacing w:after="100" w:before="200" w:lineRule="auto"/>
+        <w:jc w:val="both"/>
+        <w:rPr>
+          <w:color w:val="000000"/>
+        </w:rPr>
+      </w:pPr>
+      <w:r>
+        <w:rPr>
+          <w:color w:val="000000"/>
+          <w:rtl w:val="0"/>
+        </w:rPr>
+        <w:t xml:space="preserve">Fase posterior (fora do escopo desta versão)</w:t>
       </w:r>
     </w:p>
     <w:p>
@@ -3230,7 +3175,7 @@
           <w:szCs w:val="24"/>
           <w:rtl w:val="0"/>
         </w:rPr>
-        <w:t xml:space="preserve">Ampliação</w:t>
+        <w:t xml:space="preserve">Importação</w:t>
       </w:r>
       <w:r>
         <w:rPr>
@@ -3248,15 +3193,15 @@
           <w:vertAlign w:val="baseline"/>
           <w:rtl w:val="0"/>
         </w:rPr>
-        <w:t xml:space="preserve"> da </w:t>
-      </w:r>
-      <w:r>
-        <w:rPr>
-          <w:sz w:val="24"/>
-          <w:szCs w:val="24"/>
-          <w:rtl w:val="0"/>
-        </w:rPr>
-        <w:t xml:space="preserve">exportação</w:t>
+        <w:t xml:space="preserve"> do Acervo Procedimental </w:t>
+      </w:r>
+      <w:r>
+        <w:rPr>
+          <w:sz w:val="24"/>
+          <w:szCs w:val="24"/>
+          <w:rtl w:val="0"/>
+        </w:rPr>
+        <w:t xml:space="preserve">histórico</w:t>
       </w:r>
       <w:r>
         <w:rPr>
@@ -3274,15 +3219,15 @@
           <w:vertAlign w:val="baseline"/>
           <w:rtl w:val="0"/>
         </w:rPr>
-        <w:t xml:space="preserve"> de </w:t>
-      </w:r>
-      <w:r>
-        <w:rPr>
-          <w:sz w:val="24"/>
-          <w:szCs w:val="24"/>
-          <w:rtl w:val="0"/>
-        </w:rPr>
-        <w:t xml:space="preserve">relatórios</w:t>
+        <w:t xml:space="preserve"> via CSV (</w:t>
+      </w:r>
+      <w:r>
+        <w:rPr>
+          <w:sz w:val="24"/>
+          <w:szCs w:val="24"/>
+          <w:rtl w:val="0"/>
+        </w:rPr>
+        <w:t xml:space="preserve">tolerância a</w:t>
       </w:r>
       <w:r>
         <w:rPr>
@@ -3300,15 +3245,15 @@
           <w:vertAlign w:val="baseline"/>
           <w:rtl w:val="0"/>
         </w:rPr>
-        <w:t xml:space="preserve"> para incluir </w:t>
-      </w:r>
-      <w:r>
-        <w:rPr>
-          <w:sz w:val="24"/>
-          <w:szCs w:val="24"/>
-          <w:rtl w:val="0"/>
-        </w:rPr>
-        <w:t xml:space="preserve">também</w:t>
+        <w:t xml:space="preserve"> erro por linha, com tabela de log de </w:t>
+      </w:r>
+      <w:r>
+        <w:rPr>
+          <w:sz w:val="24"/>
+          <w:szCs w:val="24"/>
+          <w:rtl w:val="0"/>
+        </w:rPr>
+        <w:t xml:space="preserve">importação</w:t>
       </w:r>
       <w:r>
         <w:rPr>
@@ -3326,7 +3271,7 @@
           <w:vertAlign w:val="baseline"/>
           <w:rtl w:val="0"/>
         </w:rPr>
-        <w:t xml:space="preserve"> os dados importados via CSV (dependente do item anterior).</w:t>
+        <w:t xml:space="preserve">).</w:t>
       </w:r>
       <w:r>
         <w:rPr>
@@ -3362,6 +3307,14 @@
       </w:pPr>
       <w:r>
         <w:rPr>
+          <w:sz w:val="24"/>
+          <w:szCs w:val="24"/>
+          <w:rtl w:val="0"/>
+        </w:rPr>
+        <w:t xml:space="preserve">Ampliação</w:t>
+      </w:r>
+      <w:r>
+        <w:rPr>
           <w:rFonts w:ascii="Times New Roman" w:cs="Times New Roman" w:eastAsia="Times New Roman" w:hAnsi="Times New Roman"/>
           <w:b w:val="0"/>
           <w:bCs w:val="0"/>
@@ -3376,14 +3329,15 @@
           <w:vertAlign w:val="baseline"/>
           <w:rtl w:val="0"/>
         </w:rPr>
-        <w:t>Implantação institucional centralizada (multi-tenant, com login integrado ao provedor de identidade da Polícia Civil), conforme a evolução prevista na seção 1.8.</w:t>
-      </w:r>
-      <w:r>
-        <w:rPr>
-          <w:sz w:val="24"/>
-          <w:szCs w:val="24"/>
-          <w:rtl w:val="0"/>
-        </w:rPr>
+        <w:t xml:space="preserve"> da </w:t>
+      </w:r>
+      <w:r>
+        <w:rPr>
+          <w:sz w:val="24"/>
+          <w:szCs w:val="24"/>
+          <w:rtl w:val="0"/>
+        </w:rPr>
+        <w:t xml:space="preserve">exportação</w:t>
       </w:r>
       <w:r>
         <w:rPr>
@@ -3401,6 +3355,59 @@
           <w:vertAlign w:val="baseline"/>
           <w:rtl w:val="0"/>
         </w:rPr>
+        <w:t xml:space="preserve"> de </w:t>
+      </w:r>
+      <w:r>
+        <w:rPr>
+          <w:sz w:val="24"/>
+          <w:szCs w:val="24"/>
+          <w:rtl w:val="0"/>
+        </w:rPr>
+        <w:t xml:space="preserve">relatórios</w:t>
+      </w:r>
+      <w:r>
+        <w:rPr>
+          <w:rFonts w:ascii="Times New Roman" w:cs="Times New Roman" w:eastAsia="Times New Roman" w:hAnsi="Times New Roman"/>
+          <w:b w:val="0"/>
+          <w:bCs w:val="0"/>
+          <w:i w:val="0"/>
+          <w:iCs w:val="0"/>
+          <w:smallCaps w:val="0"/>
+          <w:strike w:val="0"/>
+          <w:sz w:val="24"/>
+          <w:szCs w:val="24"/>
+          <w:u w:val="none"/>
+          <w:shd w:fill="auto" w:val="clear"/>
+          <w:vertAlign w:val="baseline"/>
+          <w:rtl w:val="0"/>
+        </w:rPr>
+        <w:t xml:space="preserve"> para incluir </w:t>
+      </w:r>
+      <w:r>
+        <w:rPr>
+          <w:sz w:val="24"/>
+          <w:szCs w:val="24"/>
+          <w:rtl w:val="0"/>
+        </w:rPr>
+        <w:t xml:space="preserve">também</w:t>
+      </w:r>
+      <w:r>
+        <w:rPr>
+          <w:rFonts w:ascii="Times New Roman" w:cs="Times New Roman" w:eastAsia="Times New Roman" w:hAnsi="Times New Roman"/>
+          <w:b w:val="0"/>
+          <w:bCs w:val="0"/>
+          <w:i w:val="0"/>
+          <w:iCs w:val="0"/>
+          <w:smallCaps w:val="0"/>
+          <w:strike w:val="0"/>
+          <w:sz w:val="24"/>
+          <w:szCs w:val="24"/>
+          <w:u w:val="none"/>
+          <w:shd w:fill="auto" w:val="clear"/>
+          <w:vertAlign w:val="baseline"/>
+          <w:rtl w:val="0"/>
+        </w:rPr>
+        <w:t xml:space="preserve"> os dados importados via CSV (dependente do item anterior).</w:t>
       </w:r>
       <w:r>
         <w:rPr>
@@ -3450,7 +3457,7 @@
           <w:vertAlign w:val="baseline"/>
           <w:rtl w:val="0"/>
         </w:rPr>
-        <w:t>Gestão patrimonial da delegacia: registro dos bens (número de tombamento, categoria, setor/localização e servidor responsável), movimentações com histórico e baixa, completando a substituição de livros e planilhas.</w:t>
+        <w:t>Implantação institucional centralizada (multi-tenant, com login integrado ao provedor de identidade da Polícia Civil), conforme a evolução prevista na seção 1.8.</w:t>
       </w:r>
       <w:r>
         <w:rPr>
@@ -3524,7 +3531,7 @@
           <w:vertAlign w:val="baseline"/>
           <w:rtl w:val="0"/>
         </w:rPr>
-        <w:t>Anexo do arquivo do ofício (PDF) ao registro.</w:t>
+        <w:t>Gestão patrimonial da delegacia: registro dos bens (número de tombamento, categoria, setor/localização e servidor responsável), movimentações com histórico e baixa, completando a substituição de livros e planilhas.</w:t>
       </w:r>
       <w:r>
         <w:rPr>
@@ -3598,7 +3605,7 @@
           <w:vertAlign w:val="baseline"/>
           <w:rtl w:val="0"/>
         </w:rPr>
-        <w:t>Assistente virtual com IA (em desenvolvimento): resumo do procedimento e consultas em linguagem natural, seguindo as diretrizes de sigilo da seção 1.9.</w:t>
+        <w:t>Anexo do arquivo do ofício (PDF) ao registro.</w:t>
       </w:r>
       <w:r>
         <w:rPr>
@@ -3672,7 +3679,81 @@
           <w:vertAlign w:val="baseline"/>
           <w:rtl w:val="0"/>
         </w:rPr>
-        <w:t>Módulo de vínculos (em desenvolvimento): cadastro de pessoas e grafo que relaciona pessoas, procedimentos, veículos e oitivas, como apoio à investigação. Exige que as partes da oitiva passem a referenciar a pessoa cadastrada e que dados pessoais (ex.: CPF) sejam mascarados na API (RNF15).</w:t>
+        <w:t>Assistente virtual com IA (em desenvolvimento): resumo do procedimento e consultas em linguagem natural, seguindo as diretrizes de sigilo da seção 1.9.</w:t>
+      </w:r>
+      <w:r>
+        <w:rPr>
+          <w:sz w:val="24"/>
+          <w:szCs w:val="24"/>
+          <w:rtl w:val="0"/>
+        </w:rPr>
+      </w:r>
+      <w:r>
+        <w:rPr>
+          <w:rFonts w:ascii="Times New Roman" w:cs="Times New Roman" w:eastAsia="Times New Roman" w:hAnsi="Times New Roman"/>
+          <w:b w:val="0"/>
+          <w:bCs w:val="0"/>
+          <w:i w:val="0"/>
+          <w:iCs w:val="0"/>
+          <w:smallCaps w:val="0"/>
+          <w:strike w:val="0"/>
+          <w:sz w:val="24"/>
+          <w:szCs w:val="24"/>
+          <w:u w:val="none"/>
+          <w:shd w:fill="auto" w:val="clear"/>
+          <w:vertAlign w:val="baseline"/>
+          <w:rtl w:val="0"/>
+        </w:rPr>
+      </w:r>
+      <w:r>
+        <w:rPr>
+          <w:rtl w:val="0"/>
+        </w:rPr>
+      </w:r>
+    </w:p>
+    <w:p>
+      <w:pPr>
+        <w:keepNext w:val="0"/>
+        <w:keepLines w:val="0"/>
+        <w:pageBreakBefore w:val="0"/>
+        <w:widowControl w:val="1"/>
+        <w:numPr>
+          <w:ilvl w:val="0"/>
+          <w:numId w:val="1"/>
+        </w:numPr>
+        <w:pBdr>
+          <w:top w:space="0" w:sz="0" w:val="nil"/>
+          <w:left w:space="0" w:sz="0" w:val="nil"/>
+          <w:bottom w:space="0" w:sz="0" w:val="nil"/>
+          <w:right w:space="0" w:sz="0" w:val="nil"/>
+          <w:between w:space="0" w:sz="0" w:val="nil"/>
+        </w:pBdr>
+        <w:shd w:fill="auto" w:val="clear"/>
+        <w:spacing w:after="60" w:before="0" w:line="240" w:lineRule="auto"/>
+        <w:ind w:left="720" w:right="0" w:hanging="360"/>
+        <w:jc w:val="both"/>
+        <w:rPr>
+          <w:sz w:val="24"/>
+          <w:szCs w:val="24"/>
+        </w:rPr>
+      </w:pPr>
+      <w:r>
+        <w:rPr>
+          <w:rFonts w:ascii="Times New Roman" w:cs="Times New Roman" w:eastAsia="Times New Roman" w:hAnsi="Times New Roman"/>
+          <w:b w:val="0"/>
+          <w:bCs w:val="0"/>
+          <w:i w:val="0"/>
+          <w:iCs w:val="0"/>
+          <w:smallCaps w:val="0"/>
+          <w:strike w:val="0"/>
+          <w:sz w:val="24"/>
+          <w:szCs w:val="24"/>
+          <w:u w:val="none"/>
+          <w:shd w:fill="auto" w:val="clear"/>
+          <w:vertAlign w:val="baseline"/>
+          <w:rtl w:val="0"/>
+        </w:rPr>
+        <w:t>Módulo de vínculos (em desenvolvimento): grafo que relaciona pessoas, procedimentos, veículos e oitivas, como apoio à investigação, a partir do cadastro de pessoas e das participações já registradas. Evolução: ligação direta entre pessoa e veículo (ex.: proprietário, condutor).</w:t>
       </w:r>
       <w:r>
         <w:rPr>
@@ -5217,6 +5298,111 @@
           <w:rtl w:val="0"/>
         </w:rPr>
         <w:t>Fotos da apreensão: envio por Delegado/Policial; visualização por todos os papéis operacionais.</w:t>
+      </w:r>
+      <w:r>
+        <w:rPr>
+          <w:rFonts w:ascii="Times New Roman" w:cs="Times New Roman" w:eastAsia="Times New Roman" w:hAnsi="Times New Roman"/>
+          <w:b w:val="0"/>
+          <w:bCs w:val="0"/>
+          <w:i w:val="0"/>
+          <w:iCs w:val="0"/>
+          <w:smallCaps w:val="0"/>
+          <w:strike w:val="0"/>
+          <w:sz w:val="24"/>
+          <w:szCs w:val="24"/>
+          <w:u w:val="none"/>
+          <w:shd w:fill="auto" w:val="clear"/>
+          <w:vertAlign w:val="baseline"/>
+          <w:rtl w:val="0"/>
+        </w:rPr>
+      </w:r>
+      <w:r>
+        <w:rPr>
+          <w:sz w:val="24"/>
+          <w:szCs w:val="24"/>
+          <w:rtl w:val="0"/>
+        </w:rPr>
+      </w:r>
+      <w:r>
+        <w:rPr>
+          <w:rFonts w:ascii="Times New Roman" w:cs="Times New Roman" w:eastAsia="Times New Roman" w:hAnsi="Times New Roman"/>
+          <w:b w:val="0"/>
+          <w:bCs w:val="0"/>
+          <w:i w:val="0"/>
+          <w:iCs w:val="0"/>
+          <w:smallCaps w:val="0"/>
+          <w:strike w:val="0"/>
+          <w:sz w:val="24"/>
+          <w:szCs w:val="24"/>
+          <w:u w:val="none"/>
+          <w:shd w:fill="auto" w:val="clear"/>
+          <w:vertAlign w:val="baseline"/>
+          <w:rtl w:val="0"/>
+        </w:rPr>
+      </w:r>
+      <w:r>
+        <w:rPr>
+          <w:sz w:val="24"/>
+          <w:szCs w:val="24"/>
+          <w:rtl w:val="0"/>
+        </w:rPr>
+      </w:r>
+      <w:r>
+        <w:rPr>
+          <w:rFonts w:ascii="Times New Roman" w:cs="Times New Roman" w:eastAsia="Times New Roman" w:hAnsi="Times New Roman"/>
+          <w:b w:val="0"/>
+          <w:bCs w:val="0"/>
+          <w:i w:val="0"/>
+          <w:iCs w:val="0"/>
+          <w:smallCaps w:val="0"/>
+          <w:strike w:val="0"/>
+          <w:sz w:val="24"/>
+          <w:szCs w:val="24"/>
+          <w:u w:val="none"/>
+          <w:shd w:fill="auto" w:val="clear"/>
+          <w:vertAlign w:val="baseline"/>
+          <w:rtl w:val="0"/>
+        </w:rPr>
+      </w:r>
+      <w:r>
+        <w:rPr>
+          <w:rtl w:val="0"/>
+        </w:rPr>
+      </w:r>
+    </w:p>
+    <w:p>
+      <w:pPr>
+        <w:keepNext w:val="0"/>
+        <w:keepLines w:val="0"/>
+        <w:pageBreakBefore w:val="0"/>
+        <w:widowControl w:val="1"/>
+        <w:numPr>
+          <w:ilvl w:val="0"/>
+          <w:numId w:val="1"/>
+        </w:numPr>
+        <w:pBdr>
+          <w:top w:space="0" w:sz="0" w:val="nil"/>
+          <w:left w:space="0" w:sz="0" w:val="nil"/>
+          <w:bottom w:space="0" w:sz="0" w:val="nil"/>
+          <w:right w:space="0" w:sz="0" w:val="nil"/>
+          <w:between w:space="0" w:sz="0" w:val="nil"/>
+        </w:pBdr>
+        <w:shd w:fill="auto" w:val="clear"/>
+        <w:spacing w:after="60" w:before="0" w:line="240" w:lineRule="auto"/>
+        <w:ind w:left="720" w:right="0" w:hanging="360"/>
+        <w:jc w:val="both"/>
+        <w:rPr>
+          <w:sz w:val="24"/>
+          <w:szCs w:val="24"/>
+        </w:rPr>
+      </w:pPr>
+      <w:r>
+        <w:rPr>
+          <w:sz w:val="24"/>
+          <w:szCs w:val="24"/>
+          <w:rtl w:val="0"/>
+        </w:rPr>
+        <w:t>Pessoas (cadastrar, consultar, editar e ver participações): Delegado, Policial e Estagiário.</w:t>
       </w:r>
       <w:r>
         <w:rPr>
@@ -13387,7 +13573,7 @@
                 <w:szCs w:val="19"/>
                 <w:rtl w:val="0"/>
               </w:rPr>
-              <w:t xml:space="preserve">Toda mudanca gera registro imutavel em historico_situacao_veiculo (situacao anterior, nova, motivo, responsavel e data). A propria situacao indica onde o veiculo se encontra (NA_DEPOL: na delegacia; EM_PATIO: no patio), sem controle de posicao interna no patio. As transicoes nao sao bloqueadas pelo sistema: reverter DEVOLVIDO/DESCARTADO exige confirmacao e fica rastreada no historico.</w:t>
+              <w:t>Toda mudanca gera registro imutavel em historico_situacao_veiculo (situacao anterior, nova, motivo, responsavel e data). A propria situacao indica onde o veiculo se encontra (NA_DEPOL: na delegacia; EM_PATIO: em patio, que pode ser de outro orgao ou de uso da delegacia, como o patio municipal), sem controle de posicao interna no patio. As transicoes nao sao bloqueadas pelo sistema: reverter DEVOLVIDO/DESCARTADO exige confirmacao e fica rastreada no historico.</w:t>
             </w:r>
             <w:r>
               <w:rPr>
@@ -15529,7 +15715,7 @@
                 <w:szCs w:val="19"/>
                 <w:rtl w:val="0"/>
               </w:rPr>
-              <w:t>O sistema deve exibir um painel com as oitivas do dia, os repasses pendentes (recebidos e enviados pelo usuario), os veiculos sob responsabilidade da delegacia (na DEPOL, no patio e com pericia pendente) e os procedimentos parados do usuario.</w:t>
+              <w:t>O sistema deve exibir um painel com as oitivas do dia, os repasses pendentes (recebidos e enviados pelo usuario), os veiculos na DEPOL (total, sem pericia e com pericia em andamento) e os procedimentos parados do usuario.</w:t>
             </w:r>
             <w:r>
               <w:rPr>
@@ -16550,6 +16736,192 @@
                 <w:rtl w:val="0"/>
               </w:rPr>
               <w:t>Somente o detentor atual solicita; dados minimizados e resposta identificada como gerada por IA (secao 1.9 e RNF14).</w:t>
+            </w:r>
+            <w:r>
+              <w:rPr>
+                <w:rtl w:val="0"/>
+              </w:rPr>
+            </w:r>
+          </w:p>
+        </w:tc>
+      </w:tr>
+      <w:tr>
+        <w:trPr>
+          <w:cantSplit w:val="0"/>
+          <w:tblHeader w:val="0"/>
+        </w:trPr>
+        <w:tc>
+          <w:tcPr>
+            <w:tcMar>
+              <w:top w:w="80.0" w:type="dxa"/>
+              <w:left w:w="100.0" w:type="dxa"/>
+              <w:bottom w:w="80.0" w:type="dxa"/>
+              <w:right w:w="100.0" w:type="dxa"/>
+            </w:tcMar>
+          </w:tcPr>
+          <w:p>
+            <w:pPr>
+              <w:rPr/>
+            </w:pPr>
+            <w:r>
+              <w:rPr>
+                <w:b w:val="0"/>
+                <w:bCs w:val="0"/>
+                <w:sz w:val="19"/>
+                <w:szCs w:val="19"/>
+                <w:rtl w:val="0"/>
+              </w:rPr>
+              <w:t>RF43</w:t>
+            </w:r>
+            <w:r>
+              <w:rPr>
+                <w:rtl w:val="0"/>
+              </w:rPr>
+            </w:r>
+          </w:p>
+        </w:tc>
+        <w:tc>
+          <w:tcPr>
+            <w:tcMar>
+              <w:top w:w="80.0" w:type="dxa"/>
+              <w:left w:w="100.0" w:type="dxa"/>
+              <w:bottom w:w="80.0" w:type="dxa"/>
+              <w:right w:w="100.0" w:type="dxa"/>
+            </w:tcMar>
+          </w:tcPr>
+          <w:p>
+            <w:pPr>
+              <w:rPr/>
+            </w:pPr>
+            <w:r>
+              <w:rPr>
+                <w:b w:val="0"/>
+                <w:bCs w:val="0"/>
+                <w:sz w:val="19"/>
+                <w:szCs w:val="19"/>
+                <w:rtl w:val="0"/>
+              </w:rPr>
+              <w:t>Cadastrar e consultar pessoas</w:t>
+            </w:r>
+            <w:r>
+              <w:rPr>
+                <w:rtl w:val="0"/>
+              </w:rPr>
+            </w:r>
+          </w:p>
+        </w:tc>
+        <w:tc>
+          <w:tcPr>
+            <w:tcMar>
+              <w:top w:w="80.0" w:type="dxa"/>
+              <w:left w:w="100.0" w:type="dxa"/>
+              <w:bottom w:w="80.0" w:type="dxa"/>
+              <w:right w:w="100.0" w:type="dxa"/>
+            </w:tcMar>
+          </w:tcPr>
+          <w:p>
+            <w:pPr>
+              <w:rPr/>
+            </w:pPr>
+            <w:r>
+              <w:rPr>
+                <w:b w:val="0"/>
+                <w:bCs w:val="0"/>
+                <w:sz w:val="19"/>
+                <w:szCs w:val="19"/>
+                <w:rtl w:val="0"/>
+              </w:rPr>
+              <w:t>O sistema deve permitir cadastrar, buscar (por nome, alcunha ou CPF), editar e consultar as participacoes de pessoas envolvidas nos procedimentos, e vincular a pessoa as partes da oitiva.</w:t>
+            </w:r>
+            <w:r>
+              <w:rPr>
+                <w:rtl w:val="0"/>
+              </w:rPr>
+            </w:r>
+          </w:p>
+        </w:tc>
+        <w:tc>
+          <w:tcPr>
+            <w:tcMar>
+              <w:top w:w="80.0" w:type="dxa"/>
+              <w:left w:w="100.0" w:type="dxa"/>
+              <w:bottom w:w="80.0" w:type="dxa"/>
+              <w:right w:w="100.0" w:type="dxa"/>
+            </w:tcMar>
+          </w:tcPr>
+          <w:p>
+            <w:pPr>
+              <w:rPr/>
+            </w:pPr>
+            <w:r>
+              <w:rPr>
+                <w:b w:val="0"/>
+                <w:bCs w:val="0"/>
+                <w:sz w:val="19"/>
+                <w:szCs w:val="19"/>
+                <w:rtl w:val="0"/>
+              </w:rPr>
+              <w:t>Delegado, Policial, Estagiario</w:t>
+            </w:r>
+            <w:r>
+              <w:rPr>
+                <w:rtl w:val="0"/>
+              </w:rPr>
+            </w:r>
+          </w:p>
+        </w:tc>
+        <w:tc>
+          <w:tcPr>
+            <w:tcMar>
+              <w:top w:w="80.0" w:type="dxa"/>
+              <w:left w:w="100.0" w:type="dxa"/>
+              <w:bottom w:w="80.0" w:type="dxa"/>
+              <w:right w:w="100.0" w:type="dxa"/>
+            </w:tcMar>
+          </w:tcPr>
+          <w:p>
+            <w:pPr>
+              <w:rPr/>
+            </w:pPr>
+            <w:r>
+              <w:rPr>
+                <w:b w:val="0"/>
+                <w:bCs w:val="0"/>
+                <w:sz w:val="19"/>
+                <w:szCs w:val="19"/>
+                <w:rtl w:val="0"/>
+              </w:rPr>
+              <w:t>Should</w:t>
+            </w:r>
+            <w:r>
+              <w:rPr>
+                <w:rtl w:val="0"/>
+              </w:rPr>
+            </w:r>
+          </w:p>
+        </w:tc>
+        <w:tc>
+          <w:tcPr>
+            <w:tcMar>
+              <w:top w:w="80.0" w:type="dxa"/>
+              <w:left w:w="100.0" w:type="dxa"/>
+              <w:bottom w:w="80.0" w:type="dxa"/>
+              <w:right w:w="100.0" w:type="dxa"/>
+            </w:tcMar>
+          </w:tcPr>
+          <w:p>
+            <w:pPr>
+              <w:rPr/>
+            </w:pPr>
+            <w:r>
+              <w:rPr>
+                <w:b w:val="0"/>
+                <w:bCs w:val="0"/>
+                <w:sz w:val="19"/>
+                <w:szCs w:val="19"/>
+                <w:rtl w:val="0"/>
+              </w:rPr>
+              <w:t>Nome obrigatorio; data de nascimento, CPF (unico, com digitos verificadores conferidos), alcunha, telefone e endereco opcionais. CPF sempre mascarado na API; telefone e endereco so na ficha (RNF15). O vinculo com a parte da oitiva e opcional: a parte continua com o nome informado.</w:t>
             </w:r>
             <w:r>
               <w:rPr>
@@ -26377,6 +26749,34 @@
     </w:p>
     <w:p>
       <w:pPr>
+        <w:pStyle w:val="Heading2"/>
+        <w:spacing w:after="150" w:before="300" w:lineRule="auto"/>
+        <w:rPr>
+          <w:color w:val="000000"/>
+        </w:rPr>
+      </w:pPr>
+      <w:r>
+        <w:rPr>
+          <w:color w:val="000000"/>
+          <w:rtl w:val="0"/>
+        </w:rPr>
+        <w:t>UC36 - Gerenciar Pessoas (RF43)</w:t>
+      </w:r>
+    </w:p>
+    <w:p>
+      <w:pPr>
+        <w:spacing w:after="120" w:lineRule="auto"/>
+        <w:rPr/>
+      </w:pPr>
+      <w:r>
+        <w:rPr>
+          <w:rtl w:val="0"/>
+        </w:rPr>
+        <w:t>Usuario cadastra a pessoa (nome e, se souber, data de nascimento, CPF, alcunha, telefone e endereco); na oitiva, busca a pessoa pelo nome ou alcunha e a vincula a parte. Na ficha da pessoa, o sistema lista as participacoes (procedimento, oitiva e papel). Excecoes: CPF invalido ou ja cadastrado - sistema rejeita; pessoa inexistente ao vincular - sistema informa que nao foi encontrada.</w:t>
+      </w:r>
+    </w:p>
+    <w:p>
+      <w:pPr>
         <w:rPr/>
       </w:pPr>
       <w:r>
@@ -27202,7 +27602,7 @@
         <w:rPr/>
         <w:drawing>
           <wp:inline distB="0" distT="0" distL="0" distR="0">
-            <wp:extent cx="5731510" cy="4027189"/>
+            <wp:extent cx="5731510" cy="4180408"/>
             <wp:effectExtent b="0" l="0" r="0" t="0"/>
             <wp:docPr id="27" name="image9.png"/>
             <a:graphic>
@@ -27222,7 +27622,7 @@
                   <pic:spPr>
                     <a:xfrm>
                       <a:off x="0" y="0"/>
-                      <a:ext cx="5731510" cy="4027189"/>
+                      <a:ext cx="5731510" cy="4180408"/>
                     </a:xfrm>
                     <a:prstGeom prst="rect"/>
                     <a:ln/>
@@ -27316,13 +27716,13 @@
           <w:szCs w:val="24"/>
           <w:rtl w:val="0"/>
         </w:rPr>
-        <w:t xml:space="preserve">O MER espelha o diagrama de classes no "sotaque" de banco de dados relacional, com chaves primárias, chaves estrangeiras, constraints de unicidade e regras de integridade referencial explícitas. Note que role.acesso recebe UNIQUE (nao ha dois papeis com a mesma authority, ex.: ROLE_ADMIN), enquanto matrícula e login em usuário também são UNIQUE por serem identificadores administrativo e de acesso, respectivamente. As entidades veiculo e historico_situacao_veiculo foram incorporadas ao modelo para dar suporte ao controle de veículos apreendidos, com rastreabilidade de mudanças de situação (na DEPOL, em pátio, devolvido, descartado) via histórico dedicado, seguindo o mesmo padrão de auditoria já usado em historico_status_procedimento. Em procedimento, a unicidade é composta por (tipo, numero, ano), pois cada tipo de procedimento (BO - Boletim de Ocorrência, IP - Inquérito Policial, TCO - Termo Circunstanciado de Ocorrência, APF - Auto de Prisão em Flagrante, AIAI - Auto de Investigação de Ato Infracional, AAFAI - Auto de Apreensão em Flagrante de Ato Infracional, ROP - Registro de Ocorrência Policial da PM) possui numeração própria, que reinicia a cada ano e pode coincidir entre tipos. O número é armazenado como valor numérico (bigint), o que garante ordenação correta e evita duplicidades causadas por zeros à esquerda; a formatação para exibição fica a cargo da interface. Em oitiva, responsavel_id indica o servidor que conduz a oitiva (e que recebe a notificação de oitiva próxima), enquanto cadastrado_por_id e data_cadastro registram a autoria do agendamento e alterado_por_id, o último usuário que editou, remarcou, desmarcou ou concluiu a oitiva. O lacre do veículo é gerado automaticamente pela camada de serviço no formato LAC-AAAA-NNNNNN (ano corrente + sequencial de seis dígitos obtido de uma sequence dedicada do banco), garantindo a unicidade exigida pela constraint. Em notificacao, referencia_id guarda o id do registro que originou o aviso, cuja tabela é determinada pelo tipo (OITIVA_PROXIMA, OITIVA_SEM_BAIXA e OITIVA_ATRIBUIDA apontam para oitiva; REPASSE_RECEBIDO, REPASSE_ACEITO e REPASSE_RECUSADO para repasse; CADASTRO_PENDENTE para usuario); por apontar para tabelas diferentes, não possui chave estrangeira. O índice (usuario_destinatario_id, lida) acelera a consulta de notificações não lidas exibidas no cabeçalho. A tabela oficio registra os ofícios expedidos: a unicidade é composta por (numero, ano), pois a numeração reinicia a cada ano; a tabela numeracao_oficio guarda, por ano, o último número utilizado, e sua linha é bloqueada durante a geração do próximo número (SELECT ... FOR UPDATE), evitando números repetidos em registros simultâneos. Ofícios cancelados não são excluídos nem têm o número reaproveitado. </w:t>
+        <w:t xml:space="preserve">O MER espelha o diagrama de classes no "sotaque" de banco de dados relacional, com chaves primárias, chaves estrangeiras, constraints de unicidade e regras de integridade referencial explícitas. Note que role.acesso recebe UNIQUE (nao ha dois papeis com a mesma authority, ex.: ROLE_ADMIN), enquanto matrícula e login em usuário também são UNIQUE por serem identificadores administrativo e de acesso, respectivamente. As entidades veiculo e historico_situacao_veiculo foram incorporadas ao modelo para dar suporte ao controle de veículos apreendidos, com rastreabilidade de mudanças de situação (na DEPOL, em pátio, devolvido, descartado) via histórico dedicado, seguindo o mesmo padrão de auditoria já usado em historico_status_procedimento. Em procedimento, a unicidade é composta por (tipo, numero, ano), pois cada tipo de procedimento (BO - Boletim de Ocorrência, IP - Inquérito Policial, TCO - Termo Circunstanciado de Ocorrência, APF - Auto de Prisão em Flagrante, AIAI - Auto de Investigação de Ato Infracional, AAFAI - Auto de Apreensão em Flagrante de Ato Infracional, ROP - Registro de Ocorrência Policial da PM) possui numeração própria, que reinicia a cada ano e pode coincidir entre tipos. O número é armazenado como valor numérico (bigint), o que garante ordenação correta e evita duplicidades causadas por zeros à esquerda; a formatação para exibição fica a cargo da interface. Em oitiva, responsavel_id indica o servidor que conduz a oitiva (e que recebe a notificação de oitiva próxima), enquanto cadastrado_por_id e data_cadastro registram a autoria do agendamento e alterado_por_id, o último usuário que editou, remarcou, desmarcou ou concluiu a oitiva. O lacre do veículo é gerado automaticamente pela camada de serviço no formato LAC-AAAA-NNNNNN (ano corrente + sequencial de seis dígitos obtido de uma sequence dedicada do banco), garantindo a unicidade exigida pela constraint. Em notificacao, referencia_id guarda o id do registro que originou o aviso, cuja tabela é determinada pelo tipo (OITIVA_PROXIMA, OITIVA_SEM_BAIXA e OITIVA_ATRIBUIDA apontam para oitiva; REPASSE_RECEBIDO, REPASSE_ACEITO e REPASSE_RECUSADO para repasse; CADASTRO_PENDENTE para usuario); por apontar para tabelas diferentes, não possui chave estrangeira. O índice (usuario_destinatario_id, lida) acelera a consulta de notificações não lidas exibidas no cabeçalho. A tabela oficio registra os ofícios expedidos: a unicidade é composta por (numero, ano), pois a numeração reinicia a cada ano; a tabela numeracao_oficio guarda, por ano, o último número utilizado, e sua linha é bloqueada durante a geração do próximo número (SELECT ... FOR UPDATE), evitando números repetidos em registros simultâneos. Ofícios cancelados não são excluídos nem têm o número reaproveitado. A tabela pessoa guarda as pessoas envolvidas nos procedimentos: o CPF é opcional e único (o PostgreSQL permite vários nulos numa coluna UNIQUE), armazenado apenas com os dígitos e devolvido mascarado pela API; cadastrado_por_id registra quem incluiu os dados pessoais. Em oitiva_parte, pessoa_id (opcional) liga a parte à pessoa cadastrada, enquanto nome_parte preserva o nome informado na data da oitiva. </w:t>
       </w:r>
       <w:r>
         <w:rPr/>
         <w:drawing>
           <wp:inline distB="0" distT="0" distL="0" distR="0">
-            <wp:extent cx="5731510" cy="4204998"/>
+            <wp:extent cx="5731510" cy="4477387"/>
             <wp:effectExtent b="0" l="0" r="0" t="0"/>
             <wp:docPr id="30" name="image7.png"/>
             <a:graphic>
@@ -27342,7 +27742,7 @@
                   <pic:spPr>
                     <a:xfrm>
                       <a:off x="0" y="0"/>
-                      <a:ext cx="5731510" cy="4204998"/>
+                      <a:ext cx="5731510" cy="4477387"/>
                     </a:xfrm>
                     <a:prstGeom prst="rect"/>
                     <a:ln/>

</xml_diff>

<commit_message>
docs: README do SISGEP, integrantes e próximos passos
- README: problema, funcionalidades, destaques, arquitetura e implantação,
  tecnologias, como executar, dados de demonstração, documentação, equipe e
  link do front-end
- docx: integrantes na capa; melhorias futuras (custódia de objetos apreendidos,
  importação para a carga completa, Delegado titular, busca sem acento); regra
  de quem arquiva (Delegado ou Policial detentor) no RF14, UC10 e regras de acesso
- CLAUDE.md: equipe, front, demo e as mesmas decisões

Co-Authored-By: Claude Opus 5.5 <noreply@anthropic.com>
Claude-Session: https://claude.ai/code/session_01GMFoBKNCA64LGtSS3QvF5S
</commit_message>
<xml_diff>
--- a/docs/SISGEP_Documentacao.docx
+++ b/docs/SISGEP_Documentacao.docx
@@ -269,7 +269,7 @@
           <w:szCs w:val="22"/>
           <w:rtl w:val="0"/>
         </w:rPr>
-        <w:t xml:space="preserve">Integrantes: (a preencher)</w:t>
+        <w:t>Integrantes: Elton Ramon Alves Santos, Erick Marques Santos Bomfim, Hebert Ruan do Nascimento Feitosa e João Pedro da Silva Carvalho</w:t>
       </w:r>
       <w:r>
         <w:rPr>
@@ -583,7 +583,7 @@
         <w:rPr>
           <w:rtl w:val="0"/>
         </w:rPr>
-        <w:t>6</w:t>
+        <w:t>7</w:t>
       </w:r>
       <w:r>
         <w:rPr>
@@ -673,7 +673,7 @@
           <w:szCs w:val="22"/>
           <w:rtl w:val="0"/>
         </w:rPr>
-        <w:t>9</w:t>
+        <w:t>10</w:t>
       </w:r>
       <w:r>
         <w:rPr>
@@ -703,7 +703,7 @@
           <w:szCs w:val="22"/>
           <w:rtl w:val="0"/>
         </w:rPr>
-        <w:t>15</w:t>
+        <w:t>16</w:t>
       </w:r>
       <w:r>
         <w:rPr>
@@ -725,7 +725,7 @@
           <w:szCs w:val="22"/>
           <w:rtl w:val="0"/>
         </w:rPr>
-        <w:t>4. Casos de Uso 16</w:t>
+        <w:t>4. Casos de Uso 17</w:t>
       </w:r>
       <w:r>
         <w:rPr>
@@ -756,7 +756,7 @@
           <w:szCs w:val="22"/>
           <w:rtl w:val="0"/>
         </w:rPr>
-        <w:t>25</w:t>
+        <w:t>26</w:t>
       </w:r>
       <w:r>
         <w:rPr>
@@ -801,7 +801,7 @@
         <w:rPr>
           <w:rtl w:val="0"/>
         </w:rPr>
-        <w:t>Oitivas 25</w:t>
+        <w:t>Oitivas 26</w:t>
       </w:r>
     </w:p>
     <w:p>
@@ -857,7 +857,7 @@
         <w:rPr>
           <w:rtl w:val="0"/>
         </w:rPr>
-        <w:t>e Usuários 26</w:t>
+        <w:t>e Usuários 27</w:t>
       </w:r>
     </w:p>
     <w:p>
@@ -897,7 +897,7 @@
         <w:rPr>
           <w:rtl w:val="0"/>
         </w:rPr>
-        <w:t>Procedimentos 26</w:t>
+        <w:t>Procedimentos 27</w:t>
       </w:r>
     </w:p>
     <w:p>
@@ -953,7 +953,7 @@
         <w:rPr>
           <w:rtl w:val="0"/>
         </w:rPr>
-        <w:t>Exportacao 27</w:t>
+        <w:t>Exportacao 28</w:t>
       </w:r>
     </w:p>
     <w:p>
@@ -1009,7 +1009,7 @@
         <w:rPr>
           <w:rtl w:val="0"/>
         </w:rPr>
-        <w:t>Apreendidos 28</w:t>
+        <w:t>Apreendidos 29</w:t>
       </w:r>
     </w:p>
     <w:p>
@@ -1065,7 +1065,7 @@
         <w:rPr>
           <w:rtl w:val="0"/>
         </w:rPr>
-        <w:t>Expedidos 29</w:t>
+        <w:t>Expedidos 30</w:t>
       </w:r>
     </w:p>
     <w:p>
@@ -1091,7 +1091,7 @@
           <w:szCs w:val="22"/>
           <w:rtl w:val="0"/>
         </w:rPr>
-        <w:t>29</w:t>
+        <w:t>30</w:t>
       </w:r>
       <w:r>
         <w:rPr>
@@ -1122,7 +1122,7 @@
           <w:szCs w:val="22"/>
           <w:rtl w:val="0"/>
         </w:rPr>
-        <w:t>31</w:t>
+        <w:t>32</w:t>
       </w:r>
       <w:r>
         <w:rPr>
@@ -1151,7 +1151,7 @@
         <w:rPr>
           <w:rtl w:val="0"/>
         </w:rPr>
-        <w:t>33</w:t>
+        <w:t>34</w:t>
       </w:r>
     </w:p>
     <w:p>
@@ -1174,7 +1174,7 @@
         <w:rPr>
           <w:rtl w:val="0"/>
         </w:rPr>
-        <w:t>35</w:t>
+        <w:t>36</w:t>
       </w:r>
     </w:p>
     <w:p>
@@ -1199,7 +1199,7 @@
           <w:szCs w:val="20"/>
           <w:rtl w:val="0"/>
         </w:rPr>
-        <w:t>35</w:t>
+        <w:t>36</w:t>
       </w:r>
       <w:r>
         <w:rPr>
@@ -1229,7 +1229,7 @@
           <w:szCs w:val="20"/>
           <w:rtl w:val="0"/>
         </w:rPr>
-        <w:t>36</w:t>
+        <w:t>37</w:t>
       </w:r>
       <w:r>
         <w:rPr>
@@ -1259,7 +1259,7 @@
           <w:szCs w:val="20"/>
           <w:rtl w:val="0"/>
         </w:rPr>
-        <w:t>36</w:t>
+        <w:t>37</w:t>
       </w:r>
       <w:r>
         <w:rPr>
@@ -1289,7 +1289,7 @@
           <w:szCs w:val="20"/>
           <w:rtl w:val="0"/>
         </w:rPr>
-        <w:t>37</w:t>
+        <w:t>38</w:t>
       </w:r>
       <w:r>
         <w:rPr>
@@ -1319,7 +1319,7 @@
           <w:szCs w:val="20"/>
           <w:rtl w:val="0"/>
         </w:rPr>
-        <w:t>37</w:t>
+        <w:t>38</w:t>
       </w:r>
       <w:r>
         <w:rPr>
@@ -1349,7 +1349,7 @@
           <w:szCs w:val="20"/>
           <w:rtl w:val="0"/>
         </w:rPr>
-        <w:t>38</w:t>
+        <w:t>39</w:t>
       </w:r>
       <w:r>
         <w:rPr>
@@ -1379,7 +1379,7 @@
           <w:szCs w:val="20"/>
           <w:rtl w:val="0"/>
         </w:rPr>
-        <w:t>38</w:t>
+        <w:t>39</w:t>
       </w:r>
       <w:r>
         <w:rPr>
@@ -1409,7 +1409,7 @@
           <w:szCs w:val="22"/>
           <w:rtl w:val="0"/>
         </w:rPr>
-        <w:t>39</w:t>
+        <w:t>40</w:t>
       </w:r>
       <w:r>
         <w:rPr>
@@ -3175,7 +3175,7 @@
           <w:szCs w:val="24"/>
           <w:rtl w:val="0"/>
         </w:rPr>
-        <w:t xml:space="preserve">Importação</w:t>
+        <w:t>Importação do acervo (procedimentos e veículos) via CSV/planilha, com tolerância a erro por linha e log de importação, para que a carga completa da delegacia esteja no sistema e o relatório de carga seja gerado com um clique.</w:t>
       </w:r>
       <w:r>
         <w:rPr>
@@ -3193,15 +3193,13 @@
           <w:vertAlign w:val="baseline"/>
           <w:rtl w:val="0"/>
         </w:rPr>
-        <w:t xml:space="preserve"> do Acervo Procedimental </w:t>
-      </w:r>
-      <w:r>
-        <w:rPr>
-          <w:sz w:val="24"/>
-          <w:szCs w:val="24"/>
-          <w:rtl w:val="0"/>
-        </w:rPr>
-        <w:t xml:space="preserve">histórico</w:t>
+      </w:r>
+      <w:r>
+        <w:rPr>
+          <w:sz w:val="24"/>
+          <w:szCs w:val="24"/>
+          <w:rtl w:val="0"/>
+        </w:rPr>
       </w:r>
       <w:r>
         <w:rPr>
@@ -3219,15 +3217,13 @@
           <w:vertAlign w:val="baseline"/>
           <w:rtl w:val="0"/>
         </w:rPr>
-        <w:t xml:space="preserve"> via CSV (</w:t>
-      </w:r>
-      <w:r>
-        <w:rPr>
-          <w:sz w:val="24"/>
-          <w:szCs w:val="24"/>
-          <w:rtl w:val="0"/>
-        </w:rPr>
-        <w:t xml:space="preserve">tolerância a</w:t>
+      </w:r>
+      <w:r>
+        <w:rPr>
+          <w:sz w:val="24"/>
+          <w:szCs w:val="24"/>
+          <w:rtl w:val="0"/>
+        </w:rPr>
       </w:r>
       <w:r>
         <w:rPr>
@@ -3245,15 +3241,13 @@
           <w:vertAlign w:val="baseline"/>
           <w:rtl w:val="0"/>
         </w:rPr>
-        <w:t xml:space="preserve"> erro por linha, com tabela de log de </w:t>
-      </w:r>
-      <w:r>
-        <w:rPr>
-          <w:sz w:val="24"/>
-          <w:szCs w:val="24"/>
-          <w:rtl w:val="0"/>
-        </w:rPr>
-        <w:t xml:space="preserve">importação</w:t>
+      </w:r>
+      <w:r>
+        <w:rPr>
+          <w:sz w:val="24"/>
+          <w:szCs w:val="24"/>
+          <w:rtl w:val="0"/>
+        </w:rPr>
       </w:r>
       <w:r>
         <w:rPr>
@@ -3271,7 +3265,6 @@
           <w:vertAlign w:val="baseline"/>
           <w:rtl w:val="0"/>
         </w:rPr>
-        <w:t xml:space="preserve">).</w:t>
       </w:r>
       <w:r>
         <w:rPr>
@@ -3605,7 +3598,7 @@
           <w:vertAlign w:val="baseline"/>
           <w:rtl w:val="0"/>
         </w:rPr>
-        <w:t>Anexo do arquivo do ofício (PDF) ao registro.</w:t>
+        <w:t>Custódia de objetos apreendidos (armas, celulares, documentos e demais bens vinculados aos procedimentos), com lacre, localização e histórico de movimentações, no mesmo padrão do controle de veículos. Objetivo: centralizar a custódia e a organização interna da delegacia (ofícios, objetos apreendidos, veículos e patrimônio) num só sistema.</w:t>
       </w:r>
       <w:r>
         <w:rPr>
@@ -3679,7 +3672,7 @@
           <w:vertAlign w:val="baseline"/>
           <w:rtl w:val="0"/>
         </w:rPr>
-        <w:t>Assistente virtual com IA (em desenvolvimento): resumo do procedimento e consultas em linguagem natural, seguindo as diretrizes de sigilo da seção 1.9.</w:t>
+        <w:t>Anexo do arquivo do ofício (PDF) ao registro.</w:t>
       </w:r>
       <w:r>
         <w:rPr>
@@ -3753,7 +3746,7 @@
           <w:vertAlign w:val="baseline"/>
           <w:rtl w:val="0"/>
         </w:rPr>
-        <w:t>Módulo de vínculos (em desenvolvimento): grafo que relaciona pessoas, procedimentos, veículos e oitivas, como apoio à investigação, a partir do cadastro de pessoas e das participações já registradas. Evolução: ligação direta entre pessoa e veículo (ex.: proprietário, condutor).</w:t>
+        <w:t>Assistente virtual com IA (em desenvolvimento): resumo do procedimento e consultas em linguagem natural, seguindo as diretrizes de sigilo da seção 1.9.</w:t>
       </w:r>
       <w:r>
         <w:rPr>
@@ -3827,7 +3820,36 @@
           <w:vertAlign w:val="baseline"/>
           <w:rtl w:val="0"/>
         </w:rPr>
-        <w:t>Revogação imediata de acesso: hoje o token JWT continua válido até expirar (8h) mesmo após o usuário ser desativado, permitindo ações nesse intervalo (inclusive reativar a si mesmo). Evolução: conferir o status do usuário a cada requisição (ou lista de tokens revogados).</w:t>
+        <w:t>Módulo de vínculos (em desenvolvimento): grafo que relaciona pessoas, procedimentos, veículos e oitivas, como apoio à investigação, a partir do cadastro de pessoas e das participações já registradas. Evolução: ligação direta entre pessoa e veículo (ex.: proprietário, condutor).</w:t>
+      </w:r>
+      <w:r>
+        <w:rPr>
+          <w:sz w:val="24"/>
+          <w:szCs w:val="24"/>
+          <w:rtl w:val="0"/>
+        </w:rPr>
+      </w:r>
+      <w:r>
+        <w:rPr>
+          <w:rFonts w:ascii="Times New Roman" w:cs="Times New Roman" w:eastAsia="Times New Roman" w:hAnsi="Times New Roman"/>
+          <w:b w:val="0"/>
+          <w:bCs w:val="0"/>
+          <w:i w:val="0"/>
+          <w:iCs w:val="0"/>
+          <w:smallCaps w:val="0"/>
+          <w:strike w:val="0"/>
+          <w:sz w:val="24"/>
+          <w:szCs w:val="24"/>
+          <w:u w:val="none"/>
+          <w:shd w:fill="auto" w:val="clear"/>
+          <w:vertAlign w:val="baseline"/>
+          <w:rtl w:val="0"/>
+        </w:rPr>
+      </w:r>
+      <w:r>
+        <w:rPr>
+          <w:rtl w:val="0"/>
+        </w:rPr>
       </w:r>
     </w:p>
     <w:p>
@@ -3872,7 +3894,7 @@
           <w:vertAlign w:val="baseline"/>
           <w:rtl w:val="0"/>
         </w:rPr>
-        <w:t>Rastreabilidade completa do veículo: troca do procedimento vinculado com motivo e histórico próprio, e registro das edições de dados (placa, chassi, perícia). No MVP, apenas as mudanças de situação são rastreadas e a edição (RF26) não altera o vínculo.</w:t>
+        <w:t>Revogação imediata de acesso: hoje o token JWT continua válido até expirar (8h) mesmo após o usuário ser desativado, permitindo ações nesse intervalo (inclusive reativar a si mesmo). Evolução: conferir o status do usuário a cada requisição (ou lista de tokens revogados).</w:t>
       </w:r>
     </w:p>
     <w:p>
@@ -3917,7 +3939,200 @@
           <w:vertAlign w:val="baseline"/>
           <w:rtl w:val="0"/>
         </w:rPr>
+        <w:t>Rastreabilidade completa do veículo: troca do procedimento vinculado com motivo e histórico próprio, e registro das edições de dados (placa, chassi, perícia). No MVP, apenas as mudanças de situação são rastreadas e a edição (RF26) não altera o vínculo.</w:t>
+      </w:r>
+    </w:p>
+    <w:p>
+      <w:pPr>
+        <w:keepNext w:val="0"/>
+        <w:keepLines w:val="0"/>
+        <w:pageBreakBefore w:val="0"/>
+        <w:widowControl w:val="1"/>
+        <w:numPr>
+          <w:ilvl w:val="0"/>
+          <w:numId w:val="1"/>
+        </w:numPr>
+        <w:pBdr>
+          <w:top w:space="0" w:sz="0" w:val="nil"/>
+          <w:left w:space="0" w:sz="0" w:val="nil"/>
+          <w:bottom w:space="0" w:sz="0" w:val="nil"/>
+          <w:right w:space="0" w:sz="0" w:val="nil"/>
+          <w:between w:space="0" w:sz="0" w:val="nil"/>
+        </w:pBdr>
+        <w:shd w:fill="auto" w:val="clear"/>
+        <w:spacing w:after="60" w:before="0" w:line="240" w:lineRule="auto"/>
+        <w:ind w:left="720" w:right="0" w:hanging="360"/>
+        <w:jc w:val="both"/>
+        <w:rPr>
+          <w:sz w:val="24"/>
+          <w:szCs w:val="24"/>
+        </w:rPr>
+      </w:pPr>
+      <w:r>
+        <w:rPr>
+          <w:rFonts w:ascii="Times New Roman" w:cs="Times New Roman" w:eastAsia="Times New Roman" w:hAnsi="Times New Roman"/>
+          <w:b w:val="0"/>
+          <w:bCs w:val="0"/>
+          <w:i w:val="0"/>
+          <w:iCs w:val="0"/>
+          <w:smallCaps w:val="0"/>
+          <w:strike w:val="0"/>
+          <w:sz w:val="24"/>
+          <w:szCs w:val="24"/>
+          <w:u w:val="none"/>
+          <w:shd w:fill="auto" w:val="clear"/>
+          <w:vertAlign w:val="baseline"/>
+          <w:rtl w:val="0"/>
+        </w:rPr>
         <w:t>Auditoria técnica com Hibernate Envers: versões de todas as alterações das entidades (o quê, quando e por quem), complementando os históricos de negócio, que registram o motivo.</w:t>
+      </w:r>
+    </w:p>
+    <w:p>
+      <w:pPr>
+        <w:keepNext w:val="0"/>
+        <w:keepLines w:val="0"/>
+        <w:pageBreakBefore w:val="0"/>
+        <w:widowControl w:val="1"/>
+        <w:numPr>
+          <w:ilvl w:val="0"/>
+          <w:numId w:val="1"/>
+        </w:numPr>
+        <w:pBdr>
+          <w:top w:space="0" w:sz="0" w:val="nil"/>
+          <w:left w:space="0" w:sz="0" w:val="nil"/>
+          <w:bottom w:space="0" w:sz="0" w:val="nil"/>
+          <w:right w:space="0" w:sz="0" w:val="nil"/>
+          <w:between w:space="0" w:sz="0" w:val="nil"/>
+        </w:pBdr>
+        <w:shd w:fill="auto" w:val="clear"/>
+        <w:spacing w:after="60" w:before="0" w:line="240" w:lineRule="auto"/>
+        <w:ind w:left="720" w:right="0" w:hanging="360"/>
+        <w:jc w:val="both"/>
+        <w:rPr>
+          <w:sz w:val="24"/>
+          <w:szCs w:val="24"/>
+        </w:rPr>
+      </w:pPr>
+      <w:r>
+        <w:rPr>
+          <w:rFonts w:ascii="Times New Roman" w:cs="Times New Roman" w:eastAsia="Times New Roman" w:hAnsi="Times New Roman"/>
+          <w:b w:val="0"/>
+          <w:bCs w:val="0"/>
+          <w:i w:val="0"/>
+          <w:iCs w:val="0"/>
+          <w:smallCaps w:val="0"/>
+          <w:strike w:val="0"/>
+          <w:sz w:val="24"/>
+          <w:szCs w:val="24"/>
+          <w:u w:val="none"/>
+          <w:shd w:fill="auto" w:val="clear"/>
+          <w:vertAlign w:val="baseline"/>
+          <w:rtl w:val="0"/>
+        </w:rPr>
+        <w:t>Distinção do Delegado titular: hoje qualquer Delegado tem as permissões de autoridade (ex.: arquivar qualquer procedimento), o que atende às delegacias municipais, com um único delegado. Em unidades maiores, restringir essas ações ao titular.</w:t>
+      </w:r>
+      <w:r>
+        <w:rPr>
+          <w:sz w:val="24"/>
+          <w:szCs w:val="24"/>
+          <w:rtl w:val="0"/>
+        </w:rPr>
+      </w:r>
+      <w:r>
+        <w:rPr>
+          <w:rFonts w:ascii="Times New Roman" w:cs="Times New Roman" w:eastAsia="Times New Roman" w:hAnsi="Times New Roman"/>
+          <w:b w:val="0"/>
+          <w:bCs w:val="0"/>
+          <w:i w:val="0"/>
+          <w:iCs w:val="0"/>
+          <w:smallCaps w:val="0"/>
+          <w:strike w:val="0"/>
+          <w:sz w:val="24"/>
+          <w:szCs w:val="24"/>
+          <w:u w:val="none"/>
+          <w:shd w:fill="auto" w:val="clear"/>
+          <w:vertAlign w:val="baseline"/>
+          <w:rtl w:val="0"/>
+        </w:rPr>
+      </w:r>
+      <w:r>
+        <w:rPr>
+          <w:rtl w:val="0"/>
+        </w:rPr>
+      </w:r>
+    </w:p>
+    <w:p>
+      <w:pPr>
+        <w:keepNext w:val="0"/>
+        <w:keepLines w:val="0"/>
+        <w:pageBreakBefore w:val="0"/>
+        <w:widowControl w:val="1"/>
+        <w:numPr>
+          <w:ilvl w:val="0"/>
+          <w:numId w:val="1"/>
+        </w:numPr>
+        <w:pBdr>
+          <w:top w:space="0" w:sz="0" w:val="nil"/>
+          <w:left w:space="0" w:sz="0" w:val="nil"/>
+          <w:bottom w:space="0" w:sz="0" w:val="nil"/>
+          <w:right w:space="0" w:sz="0" w:val="nil"/>
+          <w:between w:space="0" w:sz="0" w:val="nil"/>
+        </w:pBdr>
+        <w:shd w:fill="auto" w:val="clear"/>
+        <w:spacing w:after="60" w:before="0" w:line="240" w:lineRule="auto"/>
+        <w:ind w:left="720" w:right="0" w:hanging="360"/>
+        <w:jc w:val="both"/>
+        <w:rPr>
+          <w:sz w:val="24"/>
+          <w:szCs w:val="24"/>
+        </w:rPr>
+      </w:pPr>
+      <w:r>
+        <w:rPr>
+          <w:rFonts w:ascii="Times New Roman" w:cs="Times New Roman" w:eastAsia="Times New Roman" w:hAnsi="Times New Roman"/>
+          <w:b w:val="0"/>
+          <w:bCs w:val="0"/>
+          <w:i w:val="0"/>
+          <w:iCs w:val="0"/>
+          <w:smallCaps w:val="0"/>
+          <w:strike w:val="0"/>
+          <w:sz w:val="24"/>
+          <w:szCs w:val="24"/>
+          <w:u w:val="none"/>
+          <w:shd w:fill="auto" w:val="clear"/>
+          <w:vertAlign w:val="baseline"/>
+          <w:rtl w:val="0"/>
+        </w:rPr>
+        <w:t>Busca de pessoas sem diferenciar acentos (ex.: "joao" encontra "João"), com a extensão unaccent do PostgreSQL.</w:t>
+      </w:r>
+      <w:r>
+        <w:rPr>
+          <w:sz w:val="24"/>
+          <w:szCs w:val="24"/>
+          <w:rtl w:val="0"/>
+        </w:rPr>
+      </w:r>
+      <w:r>
+        <w:rPr>
+          <w:rFonts w:ascii="Times New Roman" w:cs="Times New Roman" w:eastAsia="Times New Roman" w:hAnsi="Times New Roman"/>
+          <w:b w:val="0"/>
+          <w:bCs w:val="0"/>
+          <w:i w:val="0"/>
+          <w:iCs w:val="0"/>
+          <w:smallCaps w:val="0"/>
+          <w:strike w:val="0"/>
+          <w:sz w:val="24"/>
+          <w:szCs w:val="24"/>
+          <w:u w:val="none"/>
+          <w:shd w:fill="auto" w:val="clear"/>
+          <w:vertAlign w:val="baseline"/>
+          <w:rtl w:val="0"/>
+        </w:rPr>
+      </w:r>
+      <w:r>
+        <w:rPr>
+          <w:rtl w:val="0"/>
+        </w:rPr>
       </w:r>
     </w:p>
     <w:p>
@@ -4649,7 +4864,7 @@
           <w:vertAlign w:val="baseline"/>
           <w:rtl w:val="0"/>
         </w:rPr>
-        <w:t xml:space="preserve">Arquivamento, remessa final e reabertura: restrito a Delegado/Policial.</w:t>
+        <w:t>Arquivamento, remessa final e reabertura: restrito a Delegado/Policial. Arquivar: o Delegado, em qualquer procedimento; o Policial, apenas no que está em sua posse.</w:t>
       </w:r>
       <w:r>
         <w:rPr>
@@ -11527,7 +11742,7 @@
                 <w:szCs w:val="19"/>
                 <w:rtl w:val="0"/>
               </w:rPr>
-              <w:t>Procedimento arquivado nao pode receber nova solicitacao de repasse nem nova oitiva. O arquivamento exige que nao haja repasse pendente nem oitiva agendada.</w:t>
+              <w:t>Procedimento arquivado nao pode receber nova solicitacao de repasse nem nova oitiva. O arquivamento exige que nao haja repasse pendente nem oitiva agendada. Delegado arquiva qualquer procedimento; Policial, apenas o que detem.</w:t>
             </w:r>
             <w:r>
               <w:rPr>
@@ -23359,13 +23574,12 @@
           <w:bCs w:val="1"/>
           <w:rtl w:val="0"/>
         </w:rPr>
-        <w:t xml:space="preserve">Pre-condicoes: </w:t>
-      </w:r>
-      <w:r>
-        <w:rPr>
-          <w:rtl w:val="0"/>
-        </w:rPr>
-        <w:t xml:space="preserve">Procedimento existe e nao esta arquivado.</w:t>
+        <w:t>Pre-condicoes: Procedimento existe e nao esta arquivado; o usuario e Delegado ou o Policial detentor atual.</w:t>
+      </w:r>
+      <w:r>
+        <w:rPr>
+          <w:rtl w:val="0"/>
+        </w:rPr>
       </w:r>
     </w:p>
     <w:p>

</xml_diff>

<commit_message>
docs: documentação atualizada para a apresentação
- docx: sai o Anexo A e as menções ao sistema anterior; requisitos e casos de
  uso com o que mudou (exportação com vários tipos, listagem com período e
  ordenação, abas de repasses, troca da própria senha, busca com pessoas, 403
  por falta de permissão sobre o registro); sumário com as páginas novas
- endpoints.md: rotas novas (servidores operacionais, própria senha, listagem,
  detalhe e históricos de procedimento, arquivar, reabrir, remessa, listar,
  aceitar e recusar repasse, busca global) com exemplos reais dos dados de
  demonstração; observação no repasse, usuário logado com id e matrícula, CPF
  mantido no PUT de pessoa, tipo repetível na exportação e Admin sem veículos
- CLAUDE.md: situação atual das rotas, AcessoNegadoException e pendências do front

Co-Authored-By: Claude Opus 5.5 <noreply@anthropic.com>
Claude-Session: https://claude.ai/code/session_01GMFoBKNCA64LGtSS3QvF5S
</commit_message>
<xml_diff>
--- a/docs/SISGEP_Documentacao.docx
+++ b/docs/SISGEP_Documentacao.docx
@@ -703,7 +703,7 @@
           <w:szCs w:val="22"/>
           <w:rtl w:val="0"/>
         </w:rPr>
-        <w:t>16</w:t>
+        <w:t>17</w:t>
       </w:r>
       <w:r>
         <w:rPr>
@@ -725,7 +725,7 @@
           <w:szCs w:val="22"/>
           <w:rtl w:val="0"/>
         </w:rPr>
-        <w:t>4. Casos de Uso 17</w:t>
+        <w:t>4. Casos de Uso 18</w:t>
       </w:r>
       <w:r>
         <w:rPr>
@@ -756,7 +756,7 @@
           <w:szCs w:val="22"/>
           <w:rtl w:val="0"/>
         </w:rPr>
-        <w:t>26</w:t>
+        <w:t>27</w:t>
       </w:r>
       <w:r>
         <w:rPr>
@@ -801,7 +801,7 @@
         <w:rPr>
           <w:rtl w:val="0"/>
         </w:rPr>
-        <w:t>Oitivas 26</w:t>
+        <w:t>Oitivas 27</w:t>
       </w:r>
     </w:p>
     <w:p>
@@ -857,7 +857,7 @@
         <w:rPr>
           <w:rtl w:val="0"/>
         </w:rPr>
-        <w:t>e Usuários 27</w:t>
+        <w:t>e Usuários 28</w:t>
       </w:r>
     </w:p>
     <w:p>
@@ -897,7 +897,7 @@
         <w:rPr>
           <w:rtl w:val="0"/>
         </w:rPr>
-        <w:t>Procedimentos 27</w:t>
+        <w:t>Procedimentos 28</w:t>
       </w:r>
     </w:p>
     <w:p>
@@ -953,7 +953,7 @@
         <w:rPr>
           <w:rtl w:val="0"/>
         </w:rPr>
-        <w:t>Exportacao 28</w:t>
+        <w:t>Exportacao 29</w:t>
       </w:r>
     </w:p>
     <w:p>
@@ -1009,7 +1009,7 @@
         <w:rPr>
           <w:rtl w:val="0"/>
         </w:rPr>
-        <w:t>Apreendidos 29</w:t>
+        <w:t>Apreendidos 30</w:t>
       </w:r>
     </w:p>
     <w:p>
@@ -1065,7 +1065,7 @@
         <w:rPr>
           <w:rtl w:val="0"/>
         </w:rPr>
-        <w:t>Expedidos 30</w:t>
+        <w:t>Expedidos 31</w:t>
       </w:r>
     </w:p>
     <w:p>
@@ -1091,7 +1091,7 @@
           <w:szCs w:val="22"/>
           <w:rtl w:val="0"/>
         </w:rPr>
-        <w:t>30</w:t>
+        <w:t>31</w:t>
       </w:r>
       <w:r>
         <w:rPr>
@@ -1122,7 +1122,7 @@
           <w:szCs w:val="22"/>
           <w:rtl w:val="0"/>
         </w:rPr>
-        <w:t>32</w:t>
+        <w:t>33</w:t>
       </w:r>
       <w:r>
         <w:rPr>
@@ -1151,7 +1151,7 @@
         <w:rPr>
           <w:rtl w:val="0"/>
         </w:rPr>
-        <w:t>34</w:t>
+        <w:t>35</w:t>
       </w:r>
     </w:p>
     <w:p>
@@ -1174,7 +1174,7 @@
         <w:rPr>
           <w:rtl w:val="0"/>
         </w:rPr>
-        <w:t>36</w:t>
+        <w:t>37</w:t>
       </w:r>
     </w:p>
     <w:p>
@@ -1199,7 +1199,7 @@
           <w:szCs w:val="20"/>
           <w:rtl w:val="0"/>
         </w:rPr>
-        <w:t>36</w:t>
+        <w:t>37</w:t>
       </w:r>
       <w:r>
         <w:rPr>
@@ -1229,7 +1229,7 @@
           <w:szCs w:val="20"/>
           <w:rtl w:val="0"/>
         </w:rPr>
-        <w:t>37</w:t>
+        <w:t>38</w:t>
       </w:r>
       <w:r>
         <w:rPr>
@@ -1259,7 +1259,7 @@
           <w:szCs w:val="20"/>
           <w:rtl w:val="0"/>
         </w:rPr>
-        <w:t>37</w:t>
+        <w:t>38</w:t>
       </w:r>
       <w:r>
         <w:rPr>
@@ -1289,7 +1289,7 @@
           <w:szCs w:val="20"/>
           <w:rtl w:val="0"/>
         </w:rPr>
-        <w:t>38</w:t>
+        <w:t>39</w:t>
       </w:r>
       <w:r>
         <w:rPr>
@@ -1319,7 +1319,7 @@
           <w:szCs w:val="20"/>
           <w:rtl w:val="0"/>
         </w:rPr>
-        <w:t>38</w:t>
+        <w:t>39</w:t>
       </w:r>
       <w:r>
         <w:rPr>
@@ -1349,7 +1349,7 @@
           <w:szCs w:val="20"/>
           <w:rtl w:val="0"/>
         </w:rPr>
-        <w:t>39</w:t>
+        <w:t>40</w:t>
       </w:r>
       <w:r>
         <w:rPr>
@@ -1377,36 +1377,6 @@
         <w:rPr>
           <w:sz w:val="20"/>
           <w:szCs w:val="20"/>
-          <w:rtl w:val="0"/>
-        </w:rPr>
-        <w:t>39</w:t>
-      </w:r>
-      <w:r>
-        <w:rPr>
-          <w:rtl w:val="0"/>
-        </w:rPr>
-      </w:r>
-    </w:p>
-    <w:p>
-      <w:pPr>
-        <w:spacing w:after="120" w:lineRule="auto"/>
-        <w:ind w:left="0" w:firstLine="0"/>
-        <w:rPr/>
-      </w:pPr>
-      <w:r>
-        <w:rPr>
-          <w:b w:val="1"/>
-          <w:bCs w:val="1"/>
-          <w:sz w:val="22"/>
-          <w:szCs w:val="22"/>
-          <w:rtl w:val="0"/>
-        </w:rPr>
-        <w:t xml:space="preserve">Anexo A - Referência Visual do Sistema Anterior (v1) </w:t>
-      </w:r>
-      <w:r>
-        <w:rPr>
-          <w:sz w:val="22"/>
-          <w:szCs w:val="22"/>
           <w:rtl w:val="0"/>
         </w:rPr>
         <w:t>40</w:t>
@@ -1486,7 +1456,7 @@
           <w:szCs w:val="24"/>
           <w:rtl w:val="0"/>
         </w:rPr>
-        <w:t xml:space="preserve">O sistema atual de gestão de delegacia (v1) resolve, de forma funcional porém artesanal (Java puro, sem framework, HttpServer nativo, JDBC/PostgreSQL), dois problemas centrais do trabalho cartorário policial: o controle de oitivas (agendamento e acompanhamento de uma oitiva policial) e o controle de documentos/procedimentos (rastreabilidade de posse e repasse de procedimentos entre servidores, com histórico de custódia e arquivamento).</w:t>
+        <w:t>O controle interno de uma delegacia não tem hoje um sistema próprio. Dois problemas centrais do trabalho cartorário policial dependem de anotações manuais: o controle de oitivas (agendamento e acompanhamento de uma oitiva policial) e o controle de documentos/procedimentos (rastreabilidade de posse e repasse de procedimentos entre servidores, com histórico de custódia e arquivamento).</w:t>
       </w:r>
     </w:p>
     <w:p>
@@ -1505,7 +1475,7 @@
           <w:szCs w:val="24"/>
           <w:rtl w:val="0"/>
         </w:rPr>
-        <w:t>Esse controle hoje depende de planilhas e papel, gerando risco de perda de rastreabilidade e retrabalho manual. A versão 2 (v2) não muda o problema de negócio - muda a arquitetura e a maturidade de engenharia da solução, servindo como projeto de portfolio que aplica Spring Boot, Spring Security (JWT) e React sobre o mesmo domínio já validado na v1, aproveitando a oportunidade de corrigir limitações estruturais da v1 (ex.: repasse unilateral de custódia) por se tratar de um projeto greenfield.</w:t>
+        <w:t>Esse controle hoje depende de livros, planilhas e papel, gerando risco de perda de rastreabilidade, retrabalho manual e dificuldade na conferência da carga da unidade. O SISGEP foi desenvolvido do zero para esse domínio, com arquitetura em camadas (Spring Boot, Spring Security com JWT e React) e com o repasse de custódia baseado em aceite: o procedimento só muda de mãos quando o destinatário aceita.</w:t>
       </w:r>
     </w:p>
     <w:p>
@@ -1524,7 +1494,7 @@
           <w:szCs w:val="24"/>
           <w:rtl w:val="0"/>
         </w:rPr>
-        <w:t>Além desses dois controles, a v2 incorpora o controle de veículos apreendidos e o registro de ofícios expedidos, hoje feito em livro cartorário, com o objetivo de substituir os livros e planilhas da rotina cartorária. Na v2 o sistema passou a se chamar SISGEP - Sistema Interno de Gestão Policial.</w:t>
+        <w:t>Além desses dois controles, o SISGEP incorpora o controle de veículos apreendidos e o registro de ofícios expedidos, hoje feito em livro cartorário, com o objetivo de substituir os livros e planilhas da rotina cartorária.</w:t>
       </w:r>
     </w:p>
     <w:p>
@@ -1589,90 +1559,7 @@
           <w:vertAlign w:val="baseline"/>
           <w:rtl w:val="0"/>
         </w:rPr>
-        <w:t xml:space="preserve">Reescrever o sistema com arquitetura em camadas (API REST + SPA), </w:t>
-      </w:r>
-      <w:r>
-        <w:rPr>
-          <w:sz w:val="24"/>
-          <w:szCs w:val="24"/>
-          <w:rtl w:val="0"/>
-        </w:rPr>
-        <w:t xml:space="preserve">autenticação</w:t>
-      </w:r>
-      <w:r>
-        <w:rPr>
-          <w:rFonts w:ascii="Times New Roman" w:cs="Times New Roman" w:eastAsia="Times New Roman" w:hAnsi="Times New Roman"/>
-          <w:b w:val="0"/>
-          <w:bCs w:val="0"/>
-          <w:i w:val="0"/>
-          <w:iCs w:val="0"/>
-          <w:smallCaps w:val="0"/>
-          <w:strike w:val="0"/>
-          <w:sz w:val="24"/>
-          <w:szCs w:val="24"/>
-          <w:u w:val="none"/>
-          <w:shd w:fill="auto" w:val="clear"/>
-          <w:vertAlign w:val="baseline"/>
-          <w:rtl w:val="0"/>
-        </w:rPr>
-        <w:t xml:space="preserve">/</w:t>
-      </w:r>
-      <w:r>
-        <w:rPr>
-          <w:sz w:val="24"/>
-          <w:szCs w:val="24"/>
-          <w:rtl w:val="0"/>
-        </w:rPr>
-        <w:t xml:space="preserve">autorização</w:t>
-      </w:r>
-      <w:r>
-        <w:rPr>
-          <w:rFonts w:ascii="Times New Roman" w:cs="Times New Roman" w:eastAsia="Times New Roman" w:hAnsi="Times New Roman"/>
-          <w:b w:val="0"/>
-          <w:bCs w:val="0"/>
-          <w:i w:val="0"/>
-          <w:iCs w:val="0"/>
-          <w:smallCaps w:val="0"/>
-          <w:strike w:val="0"/>
-          <w:sz w:val="24"/>
-          <w:szCs w:val="24"/>
-          <w:u w:val="none"/>
-          <w:shd w:fill="auto" w:val="clear"/>
-          <w:vertAlign w:val="baseline"/>
-          <w:rtl w:val="0"/>
-        </w:rPr>
-        <w:t xml:space="preserve"> robusta via Spring Security, e </w:t>
-      </w:r>
-      <w:r>
-        <w:rPr>
-          <w:sz w:val="24"/>
-          <w:szCs w:val="24"/>
-          <w:rtl w:val="0"/>
-        </w:rPr>
-        <w:t xml:space="preserve">persistência</w:t>
-      </w:r>
-      <w:r>
-        <w:rPr>
-          <w:rFonts w:ascii="Times New Roman" w:cs="Times New Roman" w:eastAsia="Times New Roman" w:hAnsi="Times New Roman"/>
-          <w:b w:val="0"/>
-          <w:bCs w:val="0"/>
-          <w:i w:val="0"/>
-          <w:iCs w:val="0"/>
-          <w:smallCaps w:val="0"/>
-          <w:strike w:val="0"/>
-          <w:sz w:val="24"/>
-          <w:szCs w:val="24"/>
-          <w:u w:val="none"/>
-          <w:shd w:fill="auto" w:val="clear"/>
-          <w:vertAlign w:val="baseline"/>
-          <w:rtl w:val="0"/>
-        </w:rPr>
-        <w:t xml:space="preserve"> via Spring Data JPA.</w:t>
-      </w:r>
-      <w:r>
-        <w:rPr>
-          <w:rtl w:val="0"/>
-        </w:rPr>
+        <w:t>Desenvolver o sistema com arquitetura em camadas (API REST + SPA), autenticação/autorização robusta via Spring Security e persistência via Spring Data JPA.</w:t>
       </w:r>
     </w:p>
     <w:p>
@@ -1717,64 +1604,7 @@
           <w:vertAlign w:val="baseline"/>
           <w:rtl w:val="0"/>
         </w:rPr>
-        <w:t xml:space="preserve">Manter paridade funcional com a v1 nos </w:t>
-      </w:r>
-      <w:r>
-        <w:rPr>
-          <w:sz w:val="24"/>
-          <w:szCs w:val="24"/>
-          <w:rtl w:val="0"/>
-        </w:rPr>
-        <w:t xml:space="preserve">módulos</w:t>
-      </w:r>
-      <w:r>
-        <w:rPr>
-          <w:rFonts w:ascii="Times New Roman" w:cs="Times New Roman" w:eastAsia="Times New Roman" w:hAnsi="Times New Roman"/>
-          <w:b w:val="0"/>
-          <w:bCs w:val="0"/>
-          <w:i w:val="0"/>
-          <w:iCs w:val="0"/>
-          <w:smallCaps w:val="0"/>
-          <w:strike w:val="0"/>
-          <w:sz w:val="24"/>
-          <w:szCs w:val="24"/>
-          <w:u w:val="none"/>
-          <w:shd w:fill="auto" w:val="clear"/>
-          <w:vertAlign w:val="baseline"/>
-          <w:rtl w:val="0"/>
-        </w:rPr>
-        <w:t xml:space="preserve"> de Oitivas e Documentos, evoluindo o fluxo de repasse de </w:t>
-      </w:r>
-      <w:r>
-        <w:rPr>
-          <w:sz w:val="24"/>
-          <w:szCs w:val="24"/>
-          <w:rtl w:val="0"/>
-        </w:rPr>
-        <w:t xml:space="preserve">custódia</w:t>
-      </w:r>
-      <w:r>
-        <w:rPr>
-          <w:rFonts w:ascii="Times New Roman" w:cs="Times New Roman" w:eastAsia="Times New Roman" w:hAnsi="Times New Roman"/>
-          <w:b w:val="0"/>
-          <w:bCs w:val="0"/>
-          <w:i w:val="0"/>
-          <w:iCs w:val="0"/>
-          <w:smallCaps w:val="0"/>
-          <w:strike w:val="0"/>
-          <w:sz w:val="24"/>
-          <w:szCs w:val="24"/>
-          <w:u w:val="none"/>
-          <w:shd w:fill="auto" w:val="clear"/>
-          <w:vertAlign w:val="baseline"/>
-          <w:rtl w:val="0"/>
-        </w:rPr>
-        <w:t xml:space="preserve"> para um modelo com estado (pendente/aceito/recusado).</w:t>
-      </w:r>
-      <w:r>
-        <w:rPr>
-          <w:rtl w:val="0"/>
-        </w:rPr>
+        <w:t>Cobrir os controles de Oitivas e de Procedimentos, com o repasse de custódia baseado em estado (pendente/aceito/recusado): a custódia só é transferida com o aceite do destinatário.</w:t>
       </w:r>
     </w:p>
     <w:p>
@@ -6970,6 +6800,34 @@
     </w:p>
     <w:p>
       <w:pPr>
+        <w:spacing w:after="120" w:lineRule="auto"/>
+        <w:ind w:firstLine="720"/>
+        <w:jc w:val="both"/>
+        <w:rPr>
+          <w:sz w:val="24"/>
+          <w:szCs w:val="24"/>
+        </w:rPr>
+      </w:pPr>
+      <w:r>
+        <w:rPr>
+          <w:b/>
+          <w:sz w:val="24"/>
+          <w:szCs w:val="24"/>
+          <w:rtl w:val="0"/>
+        </w:rPr>
+        <w:t>Como funciona a implantação (Figura 10):</w:t>
+      </w:r>
+      <w:r>
+        <w:rPr>
+          <w:b w:val="0"/>
+          <w:sz w:val="24"/>
+          <w:szCs w:val="24"/>
+          <w:rtl w:val="0"/>
+        </w:rPr>
+      </w:r>
+    </w:p>
+    <w:p>
+      <w:pPr>
         <w:keepNext w:val="0"/>
         <w:keepLines w:val="0"/>
         <w:pageBreakBefore w:val="0"/>
@@ -7000,7 +6858,7 @@
           <w:szCs w:val="24"/>
           <w:rtl w:val="0"/>
         </w:rPr>
-        <w:t>Continuidade: a v1 já operava localmente, na rede da delegacia.</w:t>
+        <w:t>O sistema é distribuído em três contêineres descritos em um único arquivo docker-compose.yml: front (Nginx servindo o React compilado e repassando as chamadas /api), api (Spring Boot, com o Java já embutido na imagem) e banco (PostgreSQL). O servidor precisa apenas do Docker; não é necessário instalar Java, Node ou PostgreSQL.</w:t>
       </w:r>
       <w:r>
         <w:rPr>
@@ -7045,34 +6903,6 @@
       </w:r>
       <w:r>
         <w:rPr>
-          <w:rtl w:val="0"/>
-        </w:rPr>
-      </w:r>
-    </w:p>
-    <w:p>
-      <w:pPr>
-        <w:spacing w:after="120" w:lineRule="auto"/>
-        <w:ind w:firstLine="720"/>
-        <w:jc w:val="both"/>
-        <w:rPr>
-          <w:sz w:val="24"/>
-          <w:szCs w:val="24"/>
-        </w:rPr>
-      </w:pPr>
-      <w:r>
-        <w:rPr>
-          <w:b/>
-          <w:sz w:val="24"/>
-          <w:szCs w:val="24"/>
-          <w:rtl w:val="0"/>
-        </w:rPr>
-        <w:t>Como funciona a implantação (Figura 10):</w:t>
-      </w:r>
-      <w:r>
-        <w:rPr>
-          <w:b w:val="0"/>
-          <w:sz w:val="24"/>
-          <w:szCs w:val="24"/>
           <w:rtl w:val="0"/>
         </w:rPr>
       </w:r>
@@ -7109,7 +6939,7 @@
           <w:szCs w:val="24"/>
           <w:rtl w:val="0"/>
         </w:rPr>
-        <w:t>O sistema é distribuído em três contêineres descritos em um único arquivo docker-compose.yml: front (Nginx servindo o React compilado e repassando as chamadas /api), api (Spring Boot, com o Java já embutido na imagem) e banco (PostgreSQL). O servidor precisa apenas do Docker; não é necessário instalar Java, Node ou PostgreSQL.</w:t>
+        <w:t>Instalação: copiar a pasta do sistema com o docker-compose.yml e o arquivo .env (senha do banco, JWT_SECRET, nome da unidade) e executar docker compose up -d. Os demais computadores acessam pelo navegador, no endereço interno do servidor. Um computador simples (ex.: 4 GB de memória) atende uma delegacia.</w:t>
       </w:r>
       <w:r>
         <w:rPr>
@@ -7190,7 +7020,7 @@
           <w:szCs w:val="24"/>
           <w:rtl w:val="0"/>
         </w:rPr>
-        <w:t>Instalação: copiar a pasta do sistema com o docker-compose.yml e o arquivo .env (senha do banco, JWT_SECRET, nome da unidade) e executar docker compose up -d. Os demais computadores acessam pelo navegador, no endereço interno do servidor. Um computador simples (ex.: 4 GB de memória) atende uma delegacia.</w:t>
+        <w:t>Atualização: docker compose pull seguido de docker compose up -d, preservando os dados, que ficam em volumes. Em rede sem internet, a imagem pode ser levada por mídia (docker save / docker load). Voltar a uma versão anterior é trocar a versão (tag) da imagem.</w:t>
       </w:r>
       <w:r>
         <w:rPr>
@@ -7271,7 +7101,7 @@
           <w:szCs w:val="24"/>
           <w:rtl w:val="0"/>
         </w:rPr>
-        <w:t>Atualização: docker compose pull seguido de docker compose up -d, preservando os dados, que ficam em volumes. Em rede sem internet, a imagem pode ser levada por mídia (docker save / docker load). Voltar a uma versão anterior é trocar a versão (tag) da imagem.</w:t>
+        <w:t>Resiliência e backup: os contêineres reiniciam sozinhos após queda de energia (restart: unless-stopped) e o banco é copiado diariamente (pg_dump) para mídia externa ou para o servidor da regional.</w:t>
       </w:r>
       <w:r>
         <w:rPr>
@@ -7352,7 +7182,7 @@
           <w:szCs w:val="24"/>
           <w:rtl w:val="0"/>
         </w:rPr>
-        <w:t>Resiliência e backup: os contêineres reiniciam sozinhos após queda de energia (restart: unless-stopped) e o banco é copiado diariamente (pg_dump) para mídia externa ou para o servidor da regional.</w:t>
+        <w:t>Segurança: HTTPS mesmo na rede interna, pois o token JWT trafega em toda requisição; o banco não é exposto na rede (somente a API o acessa) e os segredos ficam no .env, fora do controle de versão (RNF13).</w:t>
       </w:r>
       <w:r>
         <w:rPr>
@@ -7399,6 +7229,64 @@
         <w:rPr>
           <w:rtl w:val="0"/>
         </w:rPr>
+      </w:r>
+    </w:p>
+    <w:p>
+      <w:pPr>
+        <w:spacing w:after="120" w:lineRule="auto"/>
+        <w:ind w:firstLine="720"/>
+        <w:jc w:val="both"/>
+        <w:rPr>
+          <w:sz w:val="24"/>
+          <w:szCs w:val="24"/>
+        </w:rPr>
+      </w:pPr>
+      <w:r>
+        <w:rPr>
+          <w:b/>
+          <w:sz w:val="24"/>
+          <w:szCs w:val="24"/>
+          <w:rtl w:val="0"/>
+        </w:rPr>
+        <w:t>Consequências assumidas:</w:t>
+      </w:r>
+      <w:r>
+        <w:rPr>
+          <w:b w:val="0"/>
+          <w:sz w:val="24"/>
+          <w:szCs w:val="24"/>
+          <w:rtl w:val="0"/>
+        </w:rPr>
+        <w:t xml:space="preserve"> as atualizações precisam ser aplicadas em cada unidade (mitigado pela imagem versionada e pela atualização em um comando) e não há visão consolidada entre delegacias.</w:t>
+      </w:r>
+    </w:p>
+    <w:p>
+      <w:pPr>
+        <w:spacing w:after="120" w:lineRule="auto"/>
+        <w:ind w:firstLine="720"/>
+        <w:jc w:val="both"/>
+        <w:rPr>
+          <w:sz w:val="24"/>
+          <w:szCs w:val="24"/>
+        </w:rPr>
+      </w:pPr>
+      <w:r>
+        <w:rPr>
+          <w:b/>
+          <w:sz w:val="24"/>
+          <w:szCs w:val="24"/>
+          <w:rtl w:val="0"/>
+        </w:rPr>
+        <w:t>Evolução prevista - implantação institucional centralizada:</w:t>
+      </w:r>
+      <w:r>
+        <w:rPr>
+          <w:b w:val="0"/>
+          <w:sz w:val="24"/>
+          <w:szCs w:val="24"/>
+          <w:rtl w:val="0"/>
+        </w:rPr>
+        <w:t xml:space="preserve"> caso a Polícia Civil opte por hospedar o SISGEP em sua própria infraestrutura (data center da instituição), a solução evolui para multi-tenant por unidade policial sem reescrita, porque a API já é stateless e organizada em camadas:</w:t>
       </w:r>
     </w:p>
     <w:p>
@@ -7433,7 +7321,7 @@
           <w:szCs w:val="24"/>
           <w:rtl w:val="0"/>
         </w:rPr>
-        <w:t>Segurança: HTTPS mesmo na rede interna, pois o token JWT trafega em toda requisição; o banco não é exposto na rede (somente a API o acessa) e os segredos ficam no .env, fora do controle de versão (RNF13).</w:t>
+        <w:t>Autenticação delegada ao provedor de identidade institucional (login único da intranet, via OpenID Connect ou LDAP/Active Directory): a API já opera como OAuth2 Resource Server e passaria a validar os tokens emitidos por esse provedor, dispensando login e gestão de senhas próprios.</w:t>
       </w:r>
       <w:r>
         <w:rPr>
@@ -7480,64 +7368,6 @@
         <w:rPr>
           <w:rtl w:val="0"/>
         </w:rPr>
-      </w:r>
-    </w:p>
-    <w:p>
-      <w:pPr>
-        <w:spacing w:after="120" w:lineRule="auto"/>
-        <w:ind w:firstLine="720"/>
-        <w:jc w:val="both"/>
-        <w:rPr>
-          <w:sz w:val="24"/>
-          <w:szCs w:val="24"/>
-        </w:rPr>
-      </w:pPr>
-      <w:r>
-        <w:rPr>
-          <w:b/>
-          <w:sz w:val="24"/>
-          <w:szCs w:val="24"/>
-          <w:rtl w:val="0"/>
-        </w:rPr>
-        <w:t>Consequências assumidas:</w:t>
-      </w:r>
-      <w:r>
-        <w:rPr>
-          <w:b w:val="0"/>
-          <w:sz w:val="24"/>
-          <w:szCs w:val="24"/>
-          <w:rtl w:val="0"/>
-        </w:rPr>
-        <w:t xml:space="preserve"> as atualizações precisam ser aplicadas em cada unidade (mitigado pela imagem versionada e pela atualização em um comando) e não há visão consolidada entre delegacias.</w:t>
-      </w:r>
-    </w:p>
-    <w:p>
-      <w:pPr>
-        <w:spacing w:after="120" w:lineRule="auto"/>
-        <w:ind w:firstLine="720"/>
-        <w:jc w:val="both"/>
-        <w:rPr>
-          <w:sz w:val="24"/>
-          <w:szCs w:val="24"/>
-        </w:rPr>
-      </w:pPr>
-      <w:r>
-        <w:rPr>
-          <w:b/>
-          <w:sz w:val="24"/>
-          <w:szCs w:val="24"/>
-          <w:rtl w:val="0"/>
-        </w:rPr>
-        <w:t>Evolução prevista - implantação institucional centralizada:</w:t>
-      </w:r>
-      <w:r>
-        <w:rPr>
-          <w:b w:val="0"/>
-          <w:sz w:val="24"/>
-          <w:szCs w:val="24"/>
-          <w:rtl w:val="0"/>
-        </w:rPr>
-        <w:t xml:space="preserve"> caso a Polícia Civil opte por hospedar o SISGEP em sua própria infraestrutura (data center da instituição), a solução evolui para multi-tenant por unidade policial sem reescrita, porque a API já é stateless e organizada em camadas:</w:t>
       </w:r>
     </w:p>
     <w:p>
@@ -7572,7 +7402,7 @@
           <w:szCs w:val="24"/>
           <w:rtl w:val="0"/>
         </w:rPr>
-        <w:t>Autenticação delegada ao provedor de identidade institucional (login único da intranet, via OpenID Connect ou LDAP/Active Directory): a API já opera como OAuth2 Resource Server e passaria a validar os tokens emitidos por esse provedor, dispensando login e gestão de senhas próprios.</w:t>
+        <w:t>Autorização e lotação mantidas no SISGEP: entidade Delegacia e vínculo do servidor à unidade, definido pelo Admin da unidade, no lugar da aprovação de cadastro; o papel (Delegado, Policial, Estagiário) continua sendo definido no SISGEP.</w:t>
       </w:r>
       <w:r>
         <w:rPr>
@@ -7653,7 +7483,7 @@
           <w:szCs w:val="24"/>
           <w:rtl w:val="0"/>
         </w:rPr>
-        <w:t>Autorização e lotação mantidas no SISGEP: entidade Delegacia e vínculo do servidor à unidade, definido pelo Admin da unidade, no lugar da aprovação de cadastro; o papel (Delegado, Policial, Estagiário) continua sendo definido no SISGEP.</w:t>
+        <w:t>Segregação dos dados por unidade: coluna delegacia_id nas tabelas principais (procedimento, oitiva, veículo, ofício), preenchida a partir do usuário logado e aplicada automaticamente em todas as consultas pelo recurso de multi-tenancy do Hibernate (@TenantId); alternativa com isolamento mais forte: um schema por delegacia.</w:t>
       </w:r>
       <w:r>
         <w:rPr>
@@ -7734,7 +7564,7 @@
           <w:szCs w:val="24"/>
           <w:rtl w:val="0"/>
         </w:rPr>
-        <w:t>Segregação dos dados por unidade: coluna delegacia_id nas tabelas principais (procedimento, oitiva, veículo, ofício), preenchida a partir do usuário logado e aplicada automaticamente em todas as consultas pelo recurso de multi-tenancy do Hibernate (@TenantId); alternativa com isolamento mais forte: um schema por delegacia.</w:t>
+        <w:t>Numeração por unidade: a unicidade passa a incluir a delegacia (delegacia + tipo + número + ano no procedimento; delegacia + número + ano no ofício).</w:t>
       </w:r>
       <w:r>
         <w:rPr>
@@ -7815,7 +7645,7 @@
           <w:szCs w:val="24"/>
           <w:rtl w:val="0"/>
         </w:rPr>
-        <w:t>Numeração por unidade: a unicidade passa a incluir a delegacia (delegacia + tipo + número + ano no procedimento; delegacia + número + ano no ofício).</w:t>
+        <w:t>Situações a tratar nessa evolução: transferência de servidor (repassar os procedimentos em posse antes de trocar a lotação), redistribuição de procedimento entre delegacias e perfis com visão de várias unidades (ex.: Delegacia Regional e Corregedoria, somente leitura).</w:t>
       </w:r>
       <w:r>
         <w:rPr>
@@ -7860,6 +7690,75 @@
       </w:r>
       <w:r>
         <w:rPr>
+          <w:rtl w:val="0"/>
+        </w:rPr>
+      </w:r>
+    </w:p>
+    <w:p>
+      <w:pPr>
+        <w:pStyle w:val="Heading2"/>
+        <w:keepNext/>
+        <w:spacing w:after="150" w:before="300" w:lineRule="auto"/>
+        <w:rPr>
+          <w:b w:val="1"/>
+          <w:bCs w:val="1"/>
+          <w:color w:val="000000"/>
+        </w:rPr>
+      </w:pPr>
+      <w:r>
+        <w:rPr>
+          <w:b w:val="1"/>
+          <w:bCs w:val="1"/>
+          <w:color w:val="000000"/>
+          <w:rtl w:val="0"/>
+        </w:rPr>
+        <w:t>1.9 Assistente Virtual com IA - Diretrizes de Sigilo</w:t>
+      </w:r>
+    </w:p>
+    <w:p>
+      <w:pPr>
+        <w:spacing w:after="120" w:lineRule="auto"/>
+        <w:ind w:firstLine="720"/>
+        <w:jc w:val="both"/>
+        <w:rPr>
+          <w:sz w:val="24"/>
+          <w:szCs w:val="24"/>
+        </w:rPr>
+      </w:pPr>
+      <w:r>
+        <w:rPr>
+          <w:b w:val="0"/>
+          <w:sz w:val="24"/>
+          <w:szCs w:val="24"/>
+          <w:rtl w:val="0"/>
+        </w:rPr>
+        <w:t>O assistente virtual (em desenvolvimento) gera, sob demanda, um resumo de um procedimento a partir dos dados registrados no sistema. Como os dados de investigação são sigilosos, o fluxo e as salvaguardas abaixo fazem parte do requisito (RF42 e RNF14).</w:t>
+      </w:r>
+    </w:p>
+    <w:p>
+      <w:pPr>
+        <w:spacing w:after="120" w:lineRule="auto"/>
+        <w:ind w:firstLine="720"/>
+        <w:jc w:val="both"/>
+        <w:rPr>
+          <w:sz w:val="24"/>
+          <w:szCs w:val="24"/>
+        </w:rPr>
+      </w:pPr>
+      <w:r>
+        <w:rPr>
+          <w:b/>
+          <w:sz w:val="24"/>
+          <w:szCs w:val="24"/>
+          <w:rtl w:val="0"/>
+        </w:rPr>
+        <w:t>Fluxo:</w:t>
+      </w:r>
+      <w:r>
+        <w:rPr>
+          <w:b w:val="0"/>
+          <w:sz w:val="24"/>
+          <w:szCs w:val="24"/>
           <w:rtl w:val="0"/>
         </w:rPr>
       </w:r>
@@ -7896,7 +7795,7 @@
           <w:szCs w:val="24"/>
           <w:rtl w:val="0"/>
         </w:rPr>
-        <w:t>Situações a tratar nessa evolução: transferência de servidor (repassar os procedimentos em posse antes de trocar a lotação), redistribuição de procedimento entre delegacias e perfis com visão de várias unidades (ex.: Delegacia Regional e Corregedoria, somente leitura).</w:t>
+        <w:t>O usuário solicita o resumo de um procedimento.</w:t>
       </w:r>
       <w:r>
         <w:rPr>
@@ -7941,75 +7840,6 @@
       </w:r>
       <w:r>
         <w:rPr>
-          <w:rtl w:val="0"/>
-        </w:rPr>
-      </w:r>
-    </w:p>
-    <w:p>
-      <w:pPr>
-        <w:pStyle w:val="Heading2"/>
-        <w:keepNext/>
-        <w:spacing w:after="150" w:before="300" w:lineRule="auto"/>
-        <w:rPr>
-          <w:b w:val="1"/>
-          <w:bCs w:val="1"/>
-          <w:color w:val="000000"/>
-        </w:rPr>
-      </w:pPr>
-      <w:r>
-        <w:rPr>
-          <w:b w:val="1"/>
-          <w:bCs w:val="1"/>
-          <w:color w:val="000000"/>
-          <w:rtl w:val="0"/>
-        </w:rPr>
-        <w:t>1.9 Assistente Virtual com IA - Diretrizes de Sigilo</w:t>
-      </w:r>
-    </w:p>
-    <w:p>
-      <w:pPr>
-        <w:spacing w:after="120" w:lineRule="auto"/>
-        <w:ind w:firstLine="720"/>
-        <w:jc w:val="both"/>
-        <w:rPr>
-          <w:sz w:val="24"/>
-          <w:szCs w:val="24"/>
-        </w:rPr>
-      </w:pPr>
-      <w:r>
-        <w:rPr>
-          <w:b w:val="0"/>
-          <w:sz w:val="24"/>
-          <w:szCs w:val="24"/>
-          <w:rtl w:val="0"/>
-        </w:rPr>
-        <w:t>O assistente virtual (em desenvolvimento) gera, sob demanda, um resumo de um procedimento a partir dos dados registrados no sistema. Como os dados de investigação são sigilosos, o fluxo e as salvaguardas abaixo fazem parte do requisito (RF42 e RNF14).</w:t>
-      </w:r>
-    </w:p>
-    <w:p>
-      <w:pPr>
-        <w:spacing w:after="120" w:lineRule="auto"/>
-        <w:ind w:firstLine="720"/>
-        <w:jc w:val="both"/>
-        <w:rPr>
-          <w:sz w:val="24"/>
-          <w:szCs w:val="24"/>
-        </w:rPr>
-      </w:pPr>
-      <w:r>
-        <w:rPr>
-          <w:b/>
-          <w:sz w:val="24"/>
-          <w:szCs w:val="24"/>
-          <w:rtl w:val="0"/>
-        </w:rPr>
-        <w:t>Fluxo:</w:t>
-      </w:r>
-      <w:r>
-        <w:rPr>
-          <w:b w:val="0"/>
-          <w:sz w:val="24"/>
-          <w:szCs w:val="24"/>
           <w:rtl w:val="0"/>
         </w:rPr>
       </w:r>
@@ -8046,7 +7876,7 @@
           <w:szCs w:val="24"/>
           <w:rtl w:val="0"/>
         </w:rPr>
-        <w:t>O usuário solicita o resumo de um procedimento.</w:t>
+        <w:t>O serviço valida a permissão: somente o detentor atual do procedimento pode solicitar o resumo (exposição mínima ao provedor externo).</w:t>
       </w:r>
       <w:r>
         <w:rPr>
@@ -8127,7 +7957,7 @@
           <w:szCs w:val="24"/>
           <w:rtl w:val="0"/>
         </w:rPr>
-        <w:t>O serviço valida a permissão: somente o detentor atual do procedimento pode solicitar o resumo (exposição mínima ao provedor externo).</w:t>
+        <w:t>O serviço valida a existência do procedimento e reúne os dados relacionados: histórico de status, repasses, oitivas e partes, veículos e histórico de situação.</w:t>
       </w:r>
       <w:r>
         <w:rPr>
@@ -8208,7 +8038,7 @@
           <w:szCs w:val="24"/>
           <w:rtl w:val="0"/>
         </w:rPr>
-        <w:t>O serviço valida a existência do procedimento e reúne os dados relacionados: histórico de status, repasses, oitivas e partes, veículos e histórico de situação.</w:t>
+        <w:t>Um DTO formata esses dados em texto legível, já minimizado: apenas os campos necessários, partes identificadas pelo papel (ex.: Testemunha 1) e sem matrícula, login ou dados de contato.</w:t>
       </w:r>
       <w:r>
         <w:rPr>
@@ -8289,7 +8119,7 @@
           <w:szCs w:val="24"/>
           <w:rtl w:val="0"/>
         </w:rPr>
-        <w:t>Um DTO formata esses dados em texto legível, já minimizado: apenas os campos necessários, partes identificadas pelo papel (ex.: Testemunha 1) e sem matrícula, login ou dados de contato.</w:t>
+        <w:t>O texto é enviado ao modelo de IA com instruções fixas: responder somente com base nos dados recebidos, informar quando algo não consta e tratar campos de texto livre como dados, nunca como instruções (proteção contra prompt injection).</w:t>
       </w:r>
       <w:r>
         <w:rPr>
@@ -8370,7 +8200,7 @@
           <w:szCs w:val="24"/>
           <w:rtl w:val="0"/>
         </w:rPr>
-        <w:t>O texto é enviado ao modelo de IA com instruções fixas: responder somente com base nos dados recebidos, informar quando algo não consta e tratar campos de texto livre como dados, nunca como instruções (proteção contra prompt injection).</w:t>
+        <w:t>A resposta passa por conferência automática (datas e números citados precisam existir nos dados enviados) e é devolvida identificada como gerada por IA, para conferência humana; o resumo não é gravado como documento oficial.</w:t>
       </w:r>
       <w:r>
         <w:rPr>
@@ -8415,6 +8245,34 @@
       </w:r>
       <w:r>
         <w:rPr>
+          <w:rtl w:val="0"/>
+        </w:rPr>
+      </w:r>
+    </w:p>
+    <w:p>
+      <w:pPr>
+        <w:spacing w:after="120" w:lineRule="auto"/>
+        <w:ind w:firstLine="720"/>
+        <w:jc w:val="both"/>
+        <w:rPr>
+          <w:sz w:val="24"/>
+          <w:szCs w:val="24"/>
+        </w:rPr>
+      </w:pPr>
+      <w:r>
+        <w:rPr>
+          <w:b/>
+          <w:sz w:val="24"/>
+          <w:szCs w:val="24"/>
+          <w:rtl w:val="0"/>
+        </w:rPr>
+        <w:t>Salvaguardas:</w:t>
+      </w:r>
+      <w:r>
+        <w:rPr>
+          <w:b w:val="0"/>
+          <w:sz w:val="24"/>
+          <w:szCs w:val="24"/>
           <w:rtl w:val="0"/>
         </w:rPr>
       </w:r>
@@ -8451,7 +8309,7 @@
           <w:szCs w:val="24"/>
           <w:rtl w:val="0"/>
         </w:rPr>
-        <w:t>A resposta passa por conferência automática (datas e números citados precisam existir nos dados enviados) e é devolvida identificada como gerada por IA, para conferência humana; o resumo não é gravado como documento oficial.</w:t>
+        <w:t>Chave da API do provedor somente no servidor (arquivo .env); o front-end nunca acessa o provedor diretamente.</w:t>
       </w:r>
       <w:r>
         <w:rPr>
@@ -8496,34 +8354,6 @@
       </w:r>
       <w:r>
         <w:rPr>
-          <w:rtl w:val="0"/>
-        </w:rPr>
-      </w:r>
-    </w:p>
-    <w:p>
-      <w:pPr>
-        <w:spacing w:after="120" w:lineRule="auto"/>
-        <w:ind w:firstLine="720"/>
-        <w:jc w:val="both"/>
-        <w:rPr>
-          <w:sz w:val="24"/>
-          <w:szCs w:val="24"/>
-        </w:rPr>
-      </w:pPr>
-      <w:r>
-        <w:rPr>
-          <w:b/>
-          <w:sz w:val="24"/>
-          <w:szCs w:val="24"/>
-          <w:rtl w:val="0"/>
-        </w:rPr>
-        <w:t>Salvaguardas:</w:t>
-      </w:r>
-      <w:r>
-        <w:rPr>
-          <w:b w:val="0"/>
-          <w:sz w:val="24"/>
-          <w:szCs w:val="24"/>
           <w:rtl w:val="0"/>
         </w:rPr>
       </w:r>
@@ -8560,7 +8390,7 @@
           <w:szCs w:val="24"/>
           <w:rtl w:val="0"/>
         </w:rPr>
-        <w:t>Chave da API do provedor somente no servidor (arquivo .env); o front-end nunca acessa o provedor diretamente.</w:t>
+        <w:t>Registro de uso (quem solicitou, qual procedimento e quando), sem armazenar o conteúdo enviado ou recebido, e limite de solicitações por usuário.</w:t>
       </w:r>
       <w:r>
         <w:rPr>
@@ -8641,7 +8471,7 @@
           <w:szCs w:val="24"/>
           <w:rtl w:val="0"/>
         </w:rPr>
-        <w:t>Registro de uso (quem solicitou, qual procedimento e quando), sem armazenar o conteúdo enviado ou recebido, e limite de solicitações por usuário.</w:t>
+        <w:t>Demonstração somente com dados fictícios; em produção, contratação sem retenção nem uso dos dados para treinamento, ou modelo executado localmente, coerente com a implantação local da seção 1.8.</w:t>
       </w:r>
       <w:r>
         <w:rPr>
@@ -8722,7 +8552,7 @@
           <w:szCs w:val="24"/>
           <w:rtl w:val="0"/>
         </w:rPr>
-        <w:t>Demonstração somente com dados fictícios; em produção, contratação sem retenção nem uso dos dados para treinamento, ou modelo executado localmente, coerente com a implantação local da seção 1.8.</w:t>
+        <w:t>Sem internet ou com o provedor indisponível, o restante do sistema continua funcionando; apenas o resumo fica indisponível, com mensagem amigável.</w:t>
       </w:r>
       <w:r>
         <w:rPr>
@@ -8773,87 +8603,6 @@
     </w:p>
     <w:p>
       <w:pPr>
-        <w:keepNext w:val="0"/>
-        <w:keepLines w:val="0"/>
-        <w:pageBreakBefore w:val="0"/>
-        <w:widowControl w:val="1"/>
-        <w:numPr>
-          <w:ilvl w:val="0"/>
-          <w:numId w:val="1"/>
-        </w:numPr>
-        <w:pBdr>
-          <w:top w:space="0" w:sz="0" w:val="nil"/>
-          <w:left w:space="0" w:sz="0" w:val="nil"/>
-          <w:bottom w:space="0" w:sz="0" w:val="nil"/>
-          <w:right w:space="0" w:sz="0" w:val="nil"/>
-          <w:between w:space="0" w:sz="0" w:val="nil"/>
-        </w:pBdr>
-        <w:shd w:fill="auto" w:val="clear"/>
-        <w:spacing w:after="60" w:before="0" w:line="240" w:lineRule="auto"/>
-        <w:ind w:left="720" w:right="0" w:hanging="360"/>
-        <w:jc w:val="both"/>
-        <w:rPr>
-          <w:sz w:val="24"/>
-          <w:szCs w:val="24"/>
-        </w:rPr>
-      </w:pPr>
-      <w:r>
-        <w:rPr>
-          <w:sz w:val="24"/>
-          <w:szCs w:val="24"/>
-          <w:rtl w:val="0"/>
-        </w:rPr>
-        <w:t>Sem internet ou com o provedor indisponível, o restante do sistema continua funcionando; apenas o resumo fica indisponível, com mensagem amigável.</w:t>
-      </w:r>
-      <w:r>
-        <w:rPr>
-          <w:rFonts w:ascii="Times New Roman" w:cs="Times New Roman" w:eastAsia="Times New Roman" w:hAnsi="Times New Roman"/>
-          <w:b w:val="0"/>
-          <w:bCs w:val="0"/>
-          <w:i w:val="0"/>
-          <w:iCs w:val="0"/>
-          <w:smallCaps w:val="0"/>
-          <w:strike w:val="0"/>
-          <w:sz w:val="24"/>
-          <w:szCs w:val="24"/>
-          <w:u w:val="none"/>
-          <w:shd w:fill="auto" w:val="clear"/>
-          <w:vertAlign w:val="baseline"/>
-          <w:rtl w:val="0"/>
-        </w:rPr>
-      </w:r>
-      <w:r>
-        <w:rPr>
-          <w:sz w:val="24"/>
-          <w:szCs w:val="24"/>
-          <w:rtl w:val="0"/>
-        </w:rPr>
-      </w:r>
-      <w:r>
-        <w:rPr>
-          <w:rFonts w:ascii="Times New Roman" w:cs="Times New Roman" w:eastAsia="Times New Roman" w:hAnsi="Times New Roman"/>
-          <w:b w:val="0"/>
-          <w:bCs w:val="0"/>
-          <w:i w:val="0"/>
-          <w:iCs w:val="0"/>
-          <w:smallCaps w:val="0"/>
-          <w:strike w:val="0"/>
-          <w:sz w:val="24"/>
-          <w:szCs w:val="24"/>
-          <w:u w:val="none"/>
-          <w:shd w:fill="auto" w:val="clear"/>
-          <w:vertAlign w:val="baseline"/>
-          <w:rtl w:val="0"/>
-        </w:rPr>
-      </w:r>
-      <w:r>
-        <w:rPr>
-          <w:rtl w:val="0"/>
-        </w:rPr>
-      </w:r>
-    </w:p>
-    <w:p>
-      <w:pPr>
         <w:rPr/>
       </w:pPr>
       <w:r>
@@ -8901,7 +8650,7 @@
           <w:szCs w:val="24"/>
           <w:rtl w:val="0"/>
         </w:rPr>
-        <w:t xml:space="preserve">Os requisitos funcionais foram extraídos das funcionalidades já existentes no sistema v1 e das evoluções de negócio definidas para a v2, priorizados segundo o método MoScoW (Must have, Should have, Could have, Won't have).</w:t>
+        <w:t>Os requisitos funcionais foram levantados a partir da rotina cartorária da delegacia (oitivas, posse e repasse de procedimentos, veículos apreendidos e ofícios) e priorizados segundo o método MoSCoW (Must have, Should have, Could have, Won't have).</w:t>
       </w:r>
     </w:p>
     <w:tbl>
@@ -12828,12 +12577,7 @@
                 <w:szCs w:val="19"/>
                 <w:rtl w:val="0"/>
               </w:rPr>
-              <w:t xml:space="preserve">Should</w:t>
-            </w:r>
-            <w:r>
-              <w:rPr>
-                <w:rtl w:val="0"/>
-              </w:rPr>
+              <w:t>Filtros: periodo de abertura, um ou mais tipos e status. Lista vazia e informada em vez de gerar arquivo vazio. Nao inclui dados de importacao de acervo historico (fora de escopo na Fase 1).</w:t>
             </w:r>
           </w:p>
         </w:tc>
@@ -15744,12 +15488,7 @@
                 <w:szCs w:val="19"/>
                 <w:rtl w:val="0"/>
               </w:rPr>
-              <w:t>O sistema deve permitir listar procedimentos com filtros (situacao: em andamento, arquivados, remetidos ou todos; tipo; ano; detentor; texto por numero ou crime), com paginacao e contagem por situacao.</w:t>
-            </w:r>
-            <w:r>
-              <w:rPr>
-                <w:rtl w:val="0"/>
-              </w:rPr>
+              <w:t>O sistema deve permitir listar procedimentos com filtros (situacao: em andamento, arquivados, remetidos ou todos; tipo; ano; detentor; texto por numero ou crime; periodo de abertura), com ordenacao, paginacao e contagem por situacao.</w:t>
             </w:r>
           </w:p>
         </w:tc>
@@ -15834,12 +15573,7 @@
                 <w:szCs w:val="19"/>
                 <w:rtl w:val="0"/>
               </w:rPr>
-              <w:t>"Remetido" e o procedimento com remessa final registrada (RF15), sem status proprio. A linha indica repasse pendente.</w:t>
-            </w:r>
-            <w:r>
-              <w:rPr>
-                <w:rtl w:val="0"/>
-              </w:rPr>
+              <w:t>"Remetido" e o procedimento com remessa final registrada (RF15), sem status proprio. A linha indica repasse pendente e ha quanto tempo o procedimento esta com o detentor atual.</w:t>
             </w:r>
           </w:p>
         </w:tc>
@@ -16302,12 +16036,7 @@
                 <w:szCs w:val="19"/>
                 <w:rtl w:val="0"/>
               </w:rPr>
-              <w:t>O sistema deve permitir buscar, em um unico campo, procedimentos (ex.: IP 45/2026), veiculos (placa ou lacre) e oficios (ex.: 123/2026).</w:t>
-            </w:r>
-            <w:r>
-              <w:rPr>
-                <w:rtl w:val="0"/>
-              </w:rPr>
+              <w:t>O sistema deve permitir buscar, em um unico campo, procedimentos (ex.: IP 45/2026), veiculos (placa ou lacre) e pessoas (nome ou alcunha); oficios entram na busca quando o modulo for implementado.</w:t>
             </w:r>
           </w:p>
         </w:tc>
@@ -17634,12 +17363,7 @@
                 <w:szCs w:val="19"/>
                 <w:rtl w:val="0"/>
               </w:rPr>
-              <w:t xml:space="preserve">O sistema deve restringir endpoints da API por papel (role), usando Spring Security.</w:t>
-            </w:r>
-            <w:r>
-              <w:rPr>
-                <w:rtl w:val="0"/>
-              </w:rPr>
+              <w:t>O sistema deve restringir endpoints da API por papel (role), usando Spring Security; alem do papel, as acoes sobre um registro conferem o dono (ex.: so o detentor ou um Delegado arquiva; so o destinatario responde ao repasse), e a falta de permissao responde 403.</w:t>
             </w:r>
           </w:p>
         </w:tc>
@@ -23085,12 +22809,7 @@
           <w:vertAlign w:val="baseline"/>
           <w:rtl w:val="0"/>
         </w:rPr>
-        <w:t xml:space="preserve">Usuario acessa lista de solicitacoes pendentes.</w:t>
-      </w:r>
-      <w:r>
-        <w:rPr>
-          <w:rtl w:val="0"/>
-        </w:rPr>
+        <w:t>Usuario acessa a tela de repasses, com as abas Recebidos e Enviados (pendentes, com a contagem de cada uma) e Historico (aceitos e recusados), podendo buscar por numero do procedimento, crime ou nome do servidor.</w:t>
       </w:r>
     </w:p>
     <w:p>
@@ -26538,7 +26257,7 @@
         <w:rPr>
           <w:rtl w:val="0"/>
         </w:rPr>
-        <w:t xml:space="preserve">Admin localiza o usuario e define uma senha provisoria (mesmo fluxo de reset de senha do sistema v1), que e armazenada com hash (RNF03) e repassada pessoalmente ao servidor. Como o sistema nao armazena e-mail (autenticacao apenas por login), nao ha recuperacao self-service via link.</w:t>
+        <w:t>Admin localiza o usuario e define uma senha provisoria, que e armazenada com hash (RNF03) e repassada pessoalmente ao servidor. Como o sistema nao armazena e-mail (autenticacao apenas por login), nao ha recuperacao self-service via link; depois do primeiro acesso, o proprio usuario pode trocar a senha (UC34).</w:t>
       </w:r>
     </w:p>
     <w:p>
@@ -26594,7 +26313,7 @@
         <w:rPr>
           <w:rtl w:val="0"/>
         </w:rPr>
-        <w:t>Delegado/Policial seleciona filtro (periodo de abertura, tipo, status) e formato (XLSX/PDF); sistema gera o arquivo com os procedimentos nativos do sistema, informando os filtros usados, quem gerou e quando. Excecao: nenhum registro encontrado com o filtro - sistema informa lista vazia em vez de gerar arquivo vazio.</w:t>
+        <w:t>Delegado/Policial seleciona filtro (periodo de abertura, um ou mais tipos, status) e formato (XLSX/PDF); sistema gera o arquivo com os procedimentos nativos do sistema, informando os filtros usados, quem gerou e quando. Excecao: nenhum registro encontrado com o filtro - sistema informa lista vazia em vez de gerar arquivo vazio.</w:t>
       </w:r>
     </w:p>
     <w:p>
@@ -26818,7 +26537,7 @@
         <w:rPr>
           <w:rtl w:val="0"/>
         </w:rPr>
-        <w:t>Usuario acessa a listagem e escolhe a aba (em andamento, arquivados, remetidos ou todos), podendo filtrar por tipo, ano, detentor e texto; o sistema retorna a pagina solicitada com o total e a contagem por aba. Remetidos = procedimentos com remessa final registrada.</w:t>
+        <w:t>Usuario acessa a listagem e escolhe a aba (em andamento, arquivados, remetidos ou todos), podendo filtrar por tipo, ano, detentor, texto e periodo de abertura (o mesmo filtro da exportacao, UC16, o que permite a previa do relatorio na tela) e ordenar por data de abertura ou por procedimento; o sistema retorna a pagina solicitada com o total, a contagem por aba e, em cada linha, ha quanto tempo o procedimento esta com o detentor atual e se ha repasse pendente. Remetidos = procedimentos com remessa final registrada.</w:t>
       </w:r>
     </w:p>
     <w:p>
@@ -26874,7 +26593,7 @@
         <w:rPr>
           <w:rtl w:val="0"/>
         </w:rPr>
-        <w:t>Usuario digita o termo no cabecalho; o sistema reconhece numero de procedimento (tipo numero/ano), placa, lacre ou numero de oficio e devolve os resultados agrupados, levando a ficha correspondente. Excecao: nenhum resultado - sistema informa.</w:t>
+        <w:t>Usuario digita o termo no cabecalho; o sistema reconhece numero de procedimento (tipo numero/ano), placa, lacre ou nome de pessoa e devolve os resultados agrupados, levando a ficha correspondente. Excecao: nenhum resultado - sistema informa.</w:t>
       </w:r>
     </w:p>
     <w:p>
@@ -26930,7 +26649,7 @@
         <w:rPr>
           <w:rtl w:val="0"/>
         </w:rPr>
-        <w:t>Usuario informa a senha atual e a nova senha; o sistema confere a senha atual e grava a nova com hash. Excecao: senha atual incorreta - sistema rejeita sem alterar.</w:t>
+        <w:t>Usuario informa a senha atual e a nova senha; o sistema confere a senha atual e grava a nova com hash. Excecoes: senha atual incorreta ou nova senha igual a atual - sistema rejeita sem alterar.</w:t>
       </w:r>
     </w:p>
     <w:p>
@@ -28934,886 +28653,6 @@
           <w:iCs w:val="1"/>
           <w:rtl w:val="0"/>
         </w:rPr>
-      </w:r>
-      <w:r>
-        <w:rPr>
-          <w:rtl w:val="0"/>
-        </w:rPr>
-      </w:r>
-    </w:p>
-    <w:p>
-      <w:pPr>
-        <w:rPr/>
-      </w:pPr>
-      <w:r>
-        <w:br w:type="page"/>
-      </w:r>
-      <w:r>
-        <w:rPr>
-          <w:rtl w:val="0"/>
-        </w:rPr>
-      </w:r>
-    </w:p>
-    <w:p>
-      <w:pPr>
-        <w:pStyle w:val="Heading1"/>
-        <w:spacing w:after="200" w:before="400" w:lineRule="auto"/>
-        <w:rPr>
-          <w:b w:val="1"/>
-          <w:bCs w:val="1"/>
-          <w:color w:val="000000"/>
-        </w:rPr>
-      </w:pPr>
-      <w:r>
-        <w:rPr>
-          <w:b w:val="1"/>
-          <w:bCs w:val="1"/>
-          <w:color w:val="000000"/>
-          <w:rtl w:val="0"/>
-        </w:rPr>
-        <w:t xml:space="preserve">Anexo A - Referência Visual do Sistema Anterior (v1)</w:t>
-      </w:r>
-    </w:p>
-    <w:p>
-      <w:pPr>
-        <w:spacing w:after="120" w:lineRule="auto"/>
-        <w:ind w:firstLine="720"/>
-        <w:jc w:val="both"/>
-        <w:rPr>
-          <w:sz w:val="24"/>
-          <w:szCs w:val="24"/>
-        </w:rPr>
-      </w:pPr>
-      <w:r>
-        <w:rPr>
-          <w:sz w:val="24"/>
-          <w:szCs w:val="24"/>
-          <w:rtl w:val="0"/>
-        </w:rPr>
-        <w:t xml:space="preserve">As telas a seguir são capturas de tela do sistema v1, desenvolvido em Java puro (sem framework), com frontend em JavaScript vanilla e persistência via JDBC/PostgreSQL. Servem como referência de identidade visual (brasão da PC-SE, tipografia Oswald/Inter, paleta dourada) e de campos de domínio já validados em uso real, que orientam - sem determinar de forma rígida - o design de telas equivalentes na v2.</w:t>
-      </w:r>
-    </w:p>
-    <w:p>
-      <w:pPr>
-        <w:spacing w:after="100" w:lineRule="auto"/>
-        <w:jc w:val="center"/>
-        <w:rPr/>
-      </w:pPr>
-      <w:r>
-        <w:rPr/>
-        <w:drawing>
-          <wp:inline distB="0" distT="0" distL="0" distR="0">
-            <wp:extent cx="4730960" cy="2185073"/>
-            <wp:effectExtent b="0" l="0" r="0" t="0"/>
-            <wp:docPr id="34" name="image14.jpg"/>
-            <a:graphic>
-              <a:graphicData uri="http://schemas.openxmlformats.org/drawingml/2006/picture">
-                <pic:pic>
-                  <pic:nvPicPr>
-                    <pic:cNvPr id="0" name="image14.jpg"/>
-                    <pic:cNvPicPr preferRelativeResize="0"/>
-                  </pic:nvPicPr>
-                  <pic:blipFill>
-                    <a:blip r:embed="rId17"/>
-                    <a:srcRect b="0" l="0" r="0" t="0"/>
-                    <a:stretch>
-                      <a:fillRect/>
-                    </a:stretch>
-                  </pic:blipFill>
-                  <pic:spPr>
-                    <a:xfrm>
-                      <a:off x="0" y="0"/>
-                      <a:ext cx="4730960" cy="2185073"/>
-                    </a:xfrm>
-                    <a:prstGeom prst="rect"/>
-                    <a:ln/>
-                  </pic:spPr>
-                </pic:pic>
-              </a:graphicData>
-            </a:graphic>
-          </wp:inline>
-        </w:drawing>
-      </w:r>
-      <w:r>
-        <w:rPr>
-          <w:rtl w:val="0"/>
-        </w:rPr>
-      </w:r>
-    </w:p>
-    <w:p>
-      <w:pPr>
-        <w:spacing w:after="300" w:lineRule="auto"/>
-        <w:jc w:val="center"/>
-        <w:rPr/>
-      </w:pPr>
-      <w:r>
-        <w:rPr>
-          <w:i w:val="1"/>
-          <w:iCs w:val="1"/>
-          <w:sz w:val="20"/>
-          <w:szCs w:val="20"/>
-          <w:rtl w:val="0"/>
-        </w:rPr>
-        <w:t>Figura 18 - Tela de login (sistema v1)</w:t>
-      </w:r>
-      <w:r>
-        <w:rPr>
-          <w:rtl w:val="0"/>
-        </w:rPr>
-      </w:r>
-    </w:p>
-    <w:p>
-      <w:pPr>
-        <w:spacing w:after="100" w:lineRule="auto"/>
-        <w:jc w:val="center"/>
-        <w:rPr/>
-      </w:pPr>
-      <w:r>
-        <w:rPr/>
-        <w:drawing>
-          <wp:inline distB="0" distT="0" distL="0" distR="0">
-            <wp:extent cx="4730960" cy="2185073"/>
-            <wp:effectExtent b="0" l="0" r="0" t="0"/>
-            <wp:docPr id="36" name="image16.jpg"/>
-            <a:graphic>
-              <a:graphicData uri="http://schemas.openxmlformats.org/drawingml/2006/picture">
-                <pic:pic>
-                  <pic:nvPicPr>
-                    <pic:cNvPr id="0" name="image16.jpg"/>
-                    <pic:cNvPicPr preferRelativeResize="0"/>
-                  </pic:nvPicPr>
-                  <pic:blipFill>
-                    <a:blip r:embed="rId18"/>
-                    <a:srcRect b="0" l="0" r="0" t="0"/>
-                    <a:stretch>
-                      <a:fillRect/>
-                    </a:stretch>
-                  </pic:blipFill>
-                  <pic:spPr>
-                    <a:xfrm>
-                      <a:off x="0" y="0"/>
-                      <a:ext cx="4730960" cy="2185073"/>
-                    </a:xfrm>
-                    <a:prstGeom prst="rect"/>
-                    <a:ln/>
-                  </pic:spPr>
-                </pic:pic>
-              </a:graphicData>
-            </a:graphic>
-          </wp:inline>
-        </w:drawing>
-      </w:r>
-      <w:r>
-        <w:rPr>
-          <w:rtl w:val="0"/>
-        </w:rPr>
-      </w:r>
-    </w:p>
-    <w:p>
-      <w:pPr>
-        <w:spacing w:after="300" w:lineRule="auto"/>
-        <w:jc w:val="center"/>
-        <w:rPr/>
-      </w:pPr>
-      <w:r>
-        <w:rPr>
-          <w:i w:val="1"/>
-          <w:iCs w:val="1"/>
-          <w:sz w:val="20"/>
-          <w:szCs w:val="20"/>
-          <w:rtl w:val="0"/>
-        </w:rPr>
-        <w:t>Figura 19 - Painel principal (menu de modulos) (sistema v1)</w:t>
-      </w:r>
-      <w:r>
-        <w:rPr>
-          <w:rtl w:val="0"/>
-        </w:rPr>
-      </w:r>
-    </w:p>
-    <w:p>
-      <w:pPr>
-        <w:spacing w:after="100" w:lineRule="auto"/>
-        <w:jc w:val="center"/>
-        <w:rPr/>
-      </w:pPr>
-      <w:r>
-        <w:rPr/>
-        <w:drawing>
-          <wp:inline distB="0" distT="0" distL="0" distR="0">
-            <wp:extent cx="4730960" cy="2185073"/>
-            <wp:effectExtent b="0" l="0" r="0" t="0"/>
-            <wp:docPr id="38" name="image1.jpg"/>
-            <a:graphic>
-              <a:graphicData uri="http://schemas.openxmlformats.org/drawingml/2006/picture">
-                <pic:pic>
-                  <pic:nvPicPr>
-                    <pic:cNvPr id="0" name="image1.jpg"/>
-                    <pic:cNvPicPr preferRelativeResize="0"/>
-                  </pic:nvPicPr>
-                  <pic:blipFill>
-                    <a:blip r:embed="rId19"/>
-                    <a:srcRect b="0" l="0" r="0" t="0"/>
-                    <a:stretch>
-                      <a:fillRect/>
-                    </a:stretch>
-                  </pic:blipFill>
-                  <pic:spPr>
-                    <a:xfrm>
-                      <a:off x="0" y="0"/>
-                      <a:ext cx="4730960" cy="2185073"/>
-                    </a:xfrm>
-                    <a:prstGeom prst="rect"/>
-                    <a:ln/>
-                  </pic:spPr>
-                </pic:pic>
-              </a:graphicData>
-            </a:graphic>
-          </wp:inline>
-        </w:drawing>
-      </w:r>
-      <w:r>
-        <w:rPr>
-          <w:rtl w:val="0"/>
-        </w:rPr>
-      </w:r>
-    </w:p>
-    <w:p>
-      <w:pPr>
-        <w:spacing w:after="300" w:lineRule="auto"/>
-        <w:jc w:val="center"/>
-        <w:rPr/>
-      </w:pPr>
-      <w:r>
-        <w:rPr>
-          <w:i w:val="1"/>
-          <w:iCs w:val="1"/>
-          <w:sz w:val="20"/>
-          <w:szCs w:val="20"/>
-          <w:rtl w:val="0"/>
-        </w:rPr>
-        <w:t>Figura 20 - Cadastro de funcionario (sistema v1)</w:t>
-      </w:r>
-      <w:r>
-        <w:rPr>
-          <w:rtl w:val="0"/>
-        </w:rPr>
-      </w:r>
-    </w:p>
-    <w:p>
-      <w:pPr>
-        <w:spacing w:after="100" w:lineRule="auto"/>
-        <w:jc w:val="center"/>
-        <w:rPr/>
-      </w:pPr>
-      <w:r>
-        <w:rPr/>
-        <w:drawing>
-          <wp:inline distB="0" distT="0" distL="0" distR="0">
-            <wp:extent cx="4730960" cy="2185073"/>
-            <wp:effectExtent b="0" l="0" r="0" t="0"/>
-            <wp:docPr id="39" name="image18.jpg"/>
-            <a:graphic>
-              <a:graphicData uri="http://schemas.openxmlformats.org/drawingml/2006/picture">
-                <pic:pic>
-                  <pic:nvPicPr>
-                    <pic:cNvPr id="0" name="image18.jpg"/>
-                    <pic:cNvPicPr preferRelativeResize="0"/>
-                  </pic:nvPicPr>
-                  <pic:blipFill>
-                    <a:blip r:embed="rId20"/>
-                    <a:srcRect b="0" l="0" r="0" t="0"/>
-                    <a:stretch>
-                      <a:fillRect/>
-                    </a:stretch>
-                  </pic:blipFill>
-                  <pic:spPr>
-                    <a:xfrm>
-                      <a:off x="0" y="0"/>
-                      <a:ext cx="4730960" cy="2185073"/>
-                    </a:xfrm>
-                    <a:prstGeom prst="rect"/>
-                    <a:ln/>
-                  </pic:spPr>
-                </pic:pic>
-              </a:graphicData>
-            </a:graphic>
-          </wp:inline>
-        </w:drawing>
-      </w:r>
-      <w:r>
-        <w:rPr>
-          <w:rtl w:val="0"/>
-        </w:rPr>
-      </w:r>
-    </w:p>
-    <w:p>
-      <w:pPr>
-        <w:spacing w:after="300" w:lineRule="auto"/>
-        <w:jc w:val="center"/>
-        <w:rPr/>
-      </w:pPr>
-      <w:r>
-        <w:rPr>
-          <w:i w:val="1"/>
-          <w:iCs w:val="1"/>
-          <w:sz w:val="20"/>
-          <w:szCs w:val="20"/>
-          <w:rtl w:val="0"/>
-        </w:rPr>
-        <w:t>Figura 21 - Aprovacao de cadastros pendentes (sistema v1)</w:t>
-      </w:r>
-      <w:r>
-        <w:rPr>
-          <w:rtl w:val="0"/>
-        </w:rPr>
-      </w:r>
-    </w:p>
-    <w:p>
-      <w:pPr>
-        <w:spacing w:after="100" w:lineRule="auto"/>
-        <w:jc w:val="center"/>
-        <w:rPr/>
-      </w:pPr>
-      <w:r>
-        <w:rPr/>
-        <w:drawing>
-          <wp:inline distB="0" distT="0" distL="0" distR="0">
-            <wp:extent cx="4730960" cy="2185073"/>
-            <wp:effectExtent b="0" l="0" r="0" t="0"/>
-            <wp:docPr id="40" name="image15.jpg"/>
-            <a:graphic>
-              <a:graphicData uri="http://schemas.openxmlformats.org/drawingml/2006/picture">
-                <pic:pic>
-                  <pic:nvPicPr>
-                    <pic:cNvPr id="0" name="image15.jpg"/>
-                    <pic:cNvPicPr preferRelativeResize="0"/>
-                  </pic:nvPicPr>
-                  <pic:blipFill>
-                    <a:blip r:embed="rId21"/>
-                    <a:srcRect b="0" l="0" r="0" t="0"/>
-                    <a:stretch>
-                      <a:fillRect/>
-                    </a:stretch>
-                  </pic:blipFill>
-                  <pic:spPr>
-                    <a:xfrm>
-                      <a:off x="0" y="0"/>
-                      <a:ext cx="4730960" cy="2185073"/>
-                    </a:xfrm>
-                    <a:prstGeom prst="rect"/>
-                    <a:ln/>
-                  </pic:spPr>
-                </pic:pic>
-              </a:graphicData>
-            </a:graphic>
-          </wp:inline>
-        </w:drawing>
-      </w:r>
-      <w:r>
-        <w:rPr>
-          <w:rtl w:val="0"/>
-        </w:rPr>
-      </w:r>
-    </w:p>
-    <w:p>
-      <w:pPr>
-        <w:spacing w:after="300" w:lineRule="auto"/>
-        <w:jc w:val="center"/>
-        <w:rPr/>
-      </w:pPr>
-      <w:r>
-        <w:rPr>
-          <w:i w:val="1"/>
-          <w:iCs w:val="1"/>
-          <w:sz w:val="20"/>
-          <w:szCs w:val="20"/>
-          <w:rtl w:val="0"/>
-        </w:rPr>
-        <w:t>Figura 22 - Reset de senha de funcionario (sistema v1)</w:t>
-      </w:r>
-      <w:r>
-        <w:rPr>
-          <w:rtl w:val="0"/>
-        </w:rPr>
-      </w:r>
-    </w:p>
-    <w:p>
-      <w:pPr>
-        <w:spacing w:after="100" w:lineRule="auto"/>
-        <w:jc w:val="center"/>
-        <w:rPr/>
-      </w:pPr>
-      <w:r>
-        <w:rPr/>
-        <w:drawing>
-          <wp:inline distB="0" distT="0" distL="0" distR="0">
-            <wp:extent cx="4730960" cy="2185073"/>
-            <wp:effectExtent b="0" l="0" r="0" t="0"/>
-            <wp:docPr id="41" name="image13.jpg"/>
-            <a:graphic>
-              <a:graphicData uri="http://schemas.openxmlformats.org/drawingml/2006/picture">
-                <pic:pic>
-                  <pic:nvPicPr>
-                    <pic:cNvPr id="0" name="image13.jpg"/>
-                    <pic:cNvPicPr preferRelativeResize="0"/>
-                  </pic:nvPicPr>
-                  <pic:blipFill>
-                    <a:blip r:embed="rId22"/>
-                    <a:srcRect b="0" l="0" r="0" t="0"/>
-                    <a:stretch>
-                      <a:fillRect/>
-                    </a:stretch>
-                  </pic:blipFill>
-                  <pic:spPr>
-                    <a:xfrm>
-                      <a:off x="0" y="0"/>
-                      <a:ext cx="4730960" cy="2185073"/>
-                    </a:xfrm>
-                    <a:prstGeom prst="rect"/>
-                    <a:ln/>
-                  </pic:spPr>
-                </pic:pic>
-              </a:graphicData>
-            </a:graphic>
-          </wp:inline>
-        </w:drawing>
-      </w:r>
-      <w:r>
-        <w:rPr>
-          <w:rtl w:val="0"/>
-        </w:rPr>
-      </w:r>
-    </w:p>
-    <w:p>
-      <w:pPr>
-        <w:spacing w:after="300" w:lineRule="auto"/>
-        <w:jc w:val="center"/>
-        <w:rPr/>
-      </w:pPr>
-      <w:r>
-        <w:rPr>
-          <w:i w:val="1"/>
-          <w:iCs w:val="1"/>
-          <w:sz w:val="20"/>
-          <w:szCs w:val="20"/>
-          <w:rtl w:val="0"/>
-        </w:rPr>
-        <w:t>Figura 23 - Listagem geral de oitivas (sistema v1)</w:t>
-      </w:r>
-      <w:r>
-        <w:rPr>
-          <w:rtl w:val="0"/>
-        </w:rPr>
-      </w:r>
-    </w:p>
-    <w:p>
-      <w:pPr>
-        <w:spacing w:after="100" w:lineRule="auto"/>
-        <w:jc w:val="center"/>
-        <w:rPr/>
-      </w:pPr>
-      <w:r>
-        <w:rPr/>
-        <w:drawing>
-          <wp:inline distB="0" distT="0" distL="0" distR="0">
-            <wp:extent cx="4730960" cy="2185073"/>
-            <wp:effectExtent b="0" l="0" r="0" t="0"/>
-            <wp:docPr id="42" name="image20.jpg"/>
-            <a:graphic>
-              <a:graphicData uri="http://schemas.openxmlformats.org/drawingml/2006/picture">
-                <pic:pic>
-                  <pic:nvPicPr>
-                    <pic:cNvPr id="0" name="image20.jpg"/>
-                    <pic:cNvPicPr preferRelativeResize="0"/>
-                  </pic:nvPicPr>
-                  <pic:blipFill>
-                    <a:blip r:embed="rId23"/>
-                    <a:srcRect b="0" l="0" r="0" t="0"/>
-                    <a:stretch>
-                      <a:fillRect/>
-                    </a:stretch>
-                  </pic:blipFill>
-                  <pic:spPr>
-                    <a:xfrm>
-                      <a:off x="0" y="0"/>
-                      <a:ext cx="4730960" cy="2185073"/>
-                    </a:xfrm>
-                    <a:prstGeom prst="rect"/>
-                    <a:ln/>
-                  </pic:spPr>
-                </pic:pic>
-              </a:graphicData>
-            </a:graphic>
-          </wp:inline>
-        </w:drawing>
-      </w:r>
-      <w:r>
-        <w:rPr>
-          <w:rtl w:val="0"/>
-        </w:rPr>
-      </w:r>
-    </w:p>
-    <w:p>
-      <w:pPr>
-        <w:spacing w:after="300" w:lineRule="auto"/>
-        <w:jc w:val="center"/>
-        <w:rPr/>
-      </w:pPr>
-      <w:r>
-        <w:rPr>
-          <w:i w:val="1"/>
-          <w:iCs w:val="1"/>
-          <w:sz w:val="20"/>
-          <w:szCs w:val="20"/>
-          <w:rtl w:val="0"/>
-        </w:rPr>
-        <w:t>Figura 24 - Cadastro de nova oitiva (sistema v1)</w:t>
-      </w:r>
-      <w:r>
-        <w:rPr>
-          <w:rtl w:val="0"/>
-        </w:rPr>
-      </w:r>
-    </w:p>
-    <w:p>
-      <w:pPr>
-        <w:spacing w:after="100" w:lineRule="auto"/>
-        <w:jc w:val="center"/>
-        <w:rPr/>
-      </w:pPr>
-      <w:r>
-        <w:rPr/>
-        <w:drawing>
-          <wp:inline distB="0" distT="0" distL="0" distR="0">
-            <wp:extent cx="4730960" cy="2185073"/>
-            <wp:effectExtent b="0" l="0" r="0" t="0"/>
-            <wp:docPr id="43" name="image12.jpg"/>
-            <a:graphic>
-              <a:graphicData uri="http://schemas.openxmlformats.org/drawingml/2006/picture">
-                <pic:pic>
-                  <pic:nvPicPr>
-                    <pic:cNvPr id="0" name="image12.jpg"/>
-                    <pic:cNvPicPr preferRelativeResize="0"/>
-                  </pic:nvPicPr>
-                  <pic:blipFill>
-                    <a:blip r:embed="rId24"/>
-                    <a:srcRect b="0" l="0" r="0" t="0"/>
-                    <a:stretch>
-                      <a:fillRect/>
-                    </a:stretch>
-                  </pic:blipFill>
-                  <pic:spPr>
-                    <a:xfrm>
-                      <a:off x="0" y="0"/>
-                      <a:ext cx="4730960" cy="2185073"/>
-                    </a:xfrm>
-                    <a:prstGeom prst="rect"/>
-                    <a:ln/>
-                  </pic:spPr>
-                </pic:pic>
-              </a:graphicData>
-            </a:graphic>
-          </wp:inline>
-        </w:drawing>
-      </w:r>
-      <w:r>
-        <w:rPr>
-          <w:rtl w:val="0"/>
-        </w:rPr>
-      </w:r>
-    </w:p>
-    <w:p>
-      <w:pPr>
-        <w:spacing w:after="300" w:lineRule="auto"/>
-        <w:jc w:val="center"/>
-        <w:rPr/>
-      </w:pPr>
-      <w:r>
-        <w:rPr>
-          <w:i w:val="1"/>
-          <w:iCs w:val="1"/>
-          <w:sz w:val="20"/>
-          <w:szCs w:val="20"/>
-          <w:rtl w:val="0"/>
-        </w:rPr>
-        <w:t>Figura 25 - Acervo procedimental (todos os procedimentos) (sistema v1)</w:t>
-      </w:r>
-      <w:r>
-        <w:rPr>
-          <w:rtl w:val="0"/>
-        </w:rPr>
-      </w:r>
-    </w:p>
-    <w:p>
-      <w:pPr>
-        <w:spacing w:after="100" w:lineRule="auto"/>
-        <w:jc w:val="center"/>
-        <w:rPr/>
-      </w:pPr>
-      <w:r>
-        <w:rPr/>
-        <w:drawing>
-          <wp:inline distB="0" distT="0" distL="0" distR="0">
-            <wp:extent cx="4730960" cy="2185073"/>
-            <wp:effectExtent b="0" l="0" r="0" t="0"/>
-            <wp:docPr id="44" name="image22.jpg"/>
-            <a:graphic>
-              <a:graphicData uri="http://schemas.openxmlformats.org/drawingml/2006/picture">
-                <pic:pic>
-                  <pic:nvPicPr>
-                    <pic:cNvPr id="0" name="image22.jpg"/>
-                    <pic:cNvPicPr preferRelativeResize="0"/>
-                  </pic:nvPicPr>
-                  <pic:blipFill>
-                    <a:blip r:embed="rId25"/>
-                    <a:srcRect b="0" l="0" r="0" t="0"/>
-                    <a:stretch>
-                      <a:fillRect/>
-                    </a:stretch>
-                  </pic:blipFill>
-                  <pic:spPr>
-                    <a:xfrm>
-                      <a:off x="0" y="0"/>
-                      <a:ext cx="4730960" cy="2185073"/>
-                    </a:xfrm>
-                    <a:prstGeom prst="rect"/>
-                    <a:ln/>
-                  </pic:spPr>
-                </pic:pic>
-              </a:graphicData>
-            </a:graphic>
-          </wp:inline>
-        </w:drawing>
-      </w:r>
-      <w:r>
-        <w:rPr>
-          <w:rtl w:val="0"/>
-        </w:rPr>
-      </w:r>
-    </w:p>
-    <w:p>
-      <w:pPr>
-        <w:spacing w:after="300" w:lineRule="auto"/>
-        <w:jc w:val="center"/>
-        <w:rPr/>
-      </w:pPr>
-      <w:r>
-        <w:rPr>
-          <w:i w:val="1"/>
-          <w:iCs w:val="1"/>
-          <w:sz w:val="20"/>
-          <w:szCs w:val="20"/>
-          <w:rtl w:val="0"/>
-        </w:rPr>
-        <w:t>Figura 26 - Consulta de posse de procedimento (sistema v1)</w:t>
-      </w:r>
-      <w:r>
-        <w:rPr>
-          <w:rtl w:val="0"/>
-        </w:rPr>
-      </w:r>
-    </w:p>
-    <w:p>
-      <w:pPr>
-        <w:spacing w:after="100" w:lineRule="auto"/>
-        <w:jc w:val="center"/>
-        <w:rPr/>
-      </w:pPr>
-      <w:r>
-        <w:rPr/>
-        <w:drawing>
-          <wp:inline distB="0" distT="0" distL="0" distR="0">
-            <wp:extent cx="4730960" cy="2185073"/>
-            <wp:effectExtent b="0" l="0" r="0" t="0"/>
-            <wp:docPr id="45" name="image19.jpg"/>
-            <a:graphic>
-              <a:graphicData uri="http://schemas.openxmlformats.org/drawingml/2006/picture">
-                <pic:pic>
-                  <pic:nvPicPr>
-                    <pic:cNvPr id="0" name="image19.jpg"/>
-                    <pic:cNvPicPr preferRelativeResize="0"/>
-                  </pic:nvPicPr>
-                  <pic:blipFill>
-                    <a:blip r:embed="rId26"/>
-                    <a:srcRect b="0" l="0" r="0" t="0"/>
-                    <a:stretch>
-                      <a:fillRect/>
-                    </a:stretch>
-                  </pic:blipFill>
-                  <pic:spPr>
-                    <a:xfrm>
-                      <a:off x="0" y="0"/>
-                      <a:ext cx="4730960" cy="2185073"/>
-                    </a:xfrm>
-                    <a:prstGeom prst="rect"/>
-                    <a:ln/>
-                  </pic:spPr>
-                </pic:pic>
-              </a:graphicData>
-            </a:graphic>
-          </wp:inline>
-        </w:drawing>
-      </w:r>
-      <w:r>
-        <w:rPr>
-          <w:rtl w:val="0"/>
-        </w:rPr>
-      </w:r>
-    </w:p>
-    <w:p>
-      <w:pPr>
-        <w:spacing w:after="300" w:lineRule="auto"/>
-        <w:jc w:val="center"/>
-        <w:rPr/>
-      </w:pPr>
-      <w:r>
-        <w:rPr>
-          <w:i w:val="1"/>
-          <w:iCs w:val="1"/>
-          <w:sz w:val="20"/>
-          <w:szCs w:val="20"/>
-          <w:rtl w:val="0"/>
-        </w:rPr>
-        <w:t>Figura 27 - Solicitacao de repasse de procedimento (sistema v1)</w:t>
-      </w:r>
-      <w:r>
-        <w:rPr>
-          <w:rtl w:val="0"/>
-        </w:rPr>
-      </w:r>
-    </w:p>
-    <w:p>
-      <w:pPr>
-        <w:spacing w:after="100" w:lineRule="auto"/>
-        <w:jc w:val="center"/>
-        <w:rPr/>
-      </w:pPr>
-      <w:r>
-        <w:rPr/>
-        <w:drawing>
-          <wp:inline distB="0" distT="0" distL="0" distR="0">
-            <wp:extent cx="4730960" cy="2185073"/>
-            <wp:effectExtent b="0" l="0" r="0" t="0"/>
-            <wp:docPr id="32" name="image21.jpg"/>
-            <a:graphic>
-              <a:graphicData uri="http://schemas.openxmlformats.org/drawingml/2006/picture">
-                <pic:pic>
-                  <pic:nvPicPr>
-                    <pic:cNvPr id="0" name="image21.jpg"/>
-                    <pic:cNvPicPr preferRelativeResize="0"/>
-                  </pic:nvPicPr>
-                  <pic:blipFill>
-                    <a:blip r:embed="rId27"/>
-                    <a:srcRect b="0" l="0" r="0" t="0"/>
-                    <a:stretch>
-                      <a:fillRect/>
-                    </a:stretch>
-                  </pic:blipFill>
-                  <pic:spPr>
-                    <a:xfrm>
-                      <a:off x="0" y="0"/>
-                      <a:ext cx="4730960" cy="2185073"/>
-                    </a:xfrm>
-                    <a:prstGeom prst="rect"/>
-                    <a:ln/>
-                  </pic:spPr>
-                </pic:pic>
-              </a:graphicData>
-            </a:graphic>
-          </wp:inline>
-        </w:drawing>
-      </w:r>
-      <w:r>
-        <w:rPr>
-          <w:rtl w:val="0"/>
-        </w:rPr>
-      </w:r>
-    </w:p>
-    <w:p>
-      <w:pPr>
-        <w:spacing w:after="300" w:lineRule="auto"/>
-        <w:jc w:val="center"/>
-        <w:rPr/>
-      </w:pPr>
-      <w:r>
-        <w:rPr>
-          <w:i w:val="1"/>
-          <w:iCs w:val="1"/>
-          <w:sz w:val="20"/>
-          <w:szCs w:val="20"/>
-          <w:rtl w:val="0"/>
-        </w:rPr>
-        <w:t>Figura 28 - Repasses pendentes de confirmacao (sistema v1)</w:t>
-      </w:r>
-      <w:r>
-        <w:rPr>
-          <w:rtl w:val="0"/>
-        </w:rPr>
-      </w:r>
-    </w:p>
-    <w:p>
-      <w:pPr>
-        <w:spacing w:after="100" w:lineRule="auto"/>
-        <w:jc w:val="center"/>
-        <w:rPr/>
-      </w:pPr>
-      <w:r>
-        <w:rPr/>
-        <w:drawing>
-          <wp:inline distB="0" distT="0" distL="0" distR="0">
-            <wp:extent cx="4730960" cy="2185073"/>
-            <wp:effectExtent b="0" l="0" r="0" t="0"/>
-            <wp:docPr id="35" name="image10.jpg"/>
-            <a:graphic>
-              <a:graphicData uri="http://schemas.openxmlformats.org/drawingml/2006/picture">
-                <pic:pic>
-                  <pic:nvPicPr>
-                    <pic:cNvPr id="0" name="image10.jpg"/>
-                    <pic:cNvPicPr preferRelativeResize="0"/>
-                  </pic:nvPicPr>
-                  <pic:blipFill>
-                    <a:blip r:embed="rId28"/>
-                    <a:srcRect b="0" l="0" r="0" t="0"/>
-                    <a:stretch>
-                      <a:fillRect/>
-                    </a:stretch>
-                  </pic:blipFill>
-                  <pic:spPr>
-                    <a:xfrm>
-                      <a:off x="0" y="0"/>
-                      <a:ext cx="4730960" cy="2185073"/>
-                    </a:xfrm>
-                    <a:prstGeom prst="rect"/>
-                    <a:ln/>
-                  </pic:spPr>
-                </pic:pic>
-              </a:graphicData>
-            </a:graphic>
-          </wp:inline>
-        </w:drawing>
-      </w:r>
-      <w:r>
-        <w:rPr>
-          <w:rtl w:val="0"/>
-        </w:rPr>
-      </w:r>
-    </w:p>
-    <w:p>
-      <w:pPr>
-        <w:spacing w:after="300" w:lineRule="auto"/>
-        <w:jc w:val="center"/>
-        <w:rPr/>
-      </w:pPr>
-      <w:r>
-        <w:rPr>
-          <w:i w:val="1"/>
-          <w:iCs w:val="1"/>
-          <w:sz w:val="20"/>
-          <w:szCs w:val="20"/>
-          <w:rtl w:val="0"/>
-        </w:rPr>
-        <w:t>Figura 29 - Historico de solicitacoes de repasse (sistema v1)</w:t>
       </w:r>
       <w:r>
         <w:rPr>

</xml_diff>

<commit_message>
docs: documentação atualizada para a apresentação (#40)
- docx: sai o Anexo A e as menções ao sistema anterior; requisitos e casos de
  uso com o que mudou (exportação com vários tipos, listagem com período e
  ordenação, abas de repasses, troca da própria senha, busca com pessoas, 403
  por falta de permissão sobre o registro); sumário com as páginas novas
- endpoints.md: rotas novas (servidores operacionais, própria senha, listagem,
  detalhe e históricos de procedimento, arquivar, reabrir, remessa, listar,
  aceitar e recusar repasse, busca global) com exemplos reais dos dados de
  demonstração; observação no repasse, usuário logado com id e matrícula, CPF
  mantido no PUT de pessoa, tipo repetível na exportação e Admin sem veículos
- CLAUDE.md: situação atual das rotas, AcessoNegadoException e pendências do front


Claude-Session: https://claude.ai/code/session_01GMFoBKNCA64LGtSS3QvF5S

Co-authored-by: Claude <noreply@anthropic.com>
</commit_message>
<xml_diff>
--- a/docs/SISGEP_Documentacao.docx
+++ b/docs/SISGEP_Documentacao.docx
@@ -703,7 +703,7 @@
           <w:szCs w:val="22"/>
           <w:rtl w:val="0"/>
         </w:rPr>
-        <w:t>16</w:t>
+        <w:t>17</w:t>
       </w:r>
       <w:r>
         <w:rPr>
@@ -725,7 +725,7 @@
           <w:szCs w:val="22"/>
           <w:rtl w:val="0"/>
         </w:rPr>
-        <w:t>4. Casos de Uso 17</w:t>
+        <w:t>4. Casos de Uso 18</w:t>
       </w:r>
       <w:r>
         <w:rPr>
@@ -756,7 +756,7 @@
           <w:szCs w:val="22"/>
           <w:rtl w:val="0"/>
         </w:rPr>
-        <w:t>26</w:t>
+        <w:t>27</w:t>
       </w:r>
       <w:r>
         <w:rPr>
@@ -801,7 +801,7 @@
         <w:rPr>
           <w:rtl w:val="0"/>
         </w:rPr>
-        <w:t>Oitivas 26</w:t>
+        <w:t>Oitivas 27</w:t>
       </w:r>
     </w:p>
     <w:p>
@@ -857,7 +857,7 @@
         <w:rPr>
           <w:rtl w:val="0"/>
         </w:rPr>
-        <w:t>e Usuários 27</w:t>
+        <w:t>e Usuários 28</w:t>
       </w:r>
     </w:p>
     <w:p>
@@ -897,7 +897,7 @@
         <w:rPr>
           <w:rtl w:val="0"/>
         </w:rPr>
-        <w:t>Procedimentos 27</w:t>
+        <w:t>Procedimentos 28</w:t>
       </w:r>
     </w:p>
     <w:p>
@@ -953,7 +953,7 @@
         <w:rPr>
           <w:rtl w:val="0"/>
         </w:rPr>
-        <w:t>Exportacao 28</w:t>
+        <w:t>Exportacao 29</w:t>
       </w:r>
     </w:p>
     <w:p>
@@ -1009,7 +1009,7 @@
         <w:rPr>
           <w:rtl w:val="0"/>
         </w:rPr>
-        <w:t>Apreendidos 29</w:t>
+        <w:t>Apreendidos 30</w:t>
       </w:r>
     </w:p>
     <w:p>
@@ -1065,7 +1065,7 @@
         <w:rPr>
           <w:rtl w:val="0"/>
         </w:rPr>
-        <w:t>Expedidos 30</w:t>
+        <w:t>Expedidos 31</w:t>
       </w:r>
     </w:p>
     <w:p>
@@ -1091,7 +1091,7 @@
           <w:szCs w:val="22"/>
           <w:rtl w:val="0"/>
         </w:rPr>
-        <w:t>30</w:t>
+        <w:t>31</w:t>
       </w:r>
       <w:r>
         <w:rPr>
@@ -1122,7 +1122,7 @@
           <w:szCs w:val="22"/>
           <w:rtl w:val="0"/>
         </w:rPr>
-        <w:t>32</w:t>
+        <w:t>33</w:t>
       </w:r>
       <w:r>
         <w:rPr>
@@ -1151,7 +1151,7 @@
         <w:rPr>
           <w:rtl w:val="0"/>
         </w:rPr>
-        <w:t>34</w:t>
+        <w:t>35</w:t>
       </w:r>
     </w:p>
     <w:p>
@@ -1174,7 +1174,7 @@
         <w:rPr>
           <w:rtl w:val="0"/>
         </w:rPr>
-        <w:t>36</w:t>
+        <w:t>37</w:t>
       </w:r>
     </w:p>
     <w:p>
@@ -1199,7 +1199,7 @@
           <w:szCs w:val="20"/>
           <w:rtl w:val="0"/>
         </w:rPr>
-        <w:t>36</w:t>
+        <w:t>37</w:t>
       </w:r>
       <w:r>
         <w:rPr>
@@ -1229,7 +1229,7 @@
           <w:szCs w:val="20"/>
           <w:rtl w:val="0"/>
         </w:rPr>
-        <w:t>37</w:t>
+        <w:t>38</w:t>
       </w:r>
       <w:r>
         <w:rPr>
@@ -1259,7 +1259,7 @@
           <w:szCs w:val="20"/>
           <w:rtl w:val="0"/>
         </w:rPr>
-        <w:t>37</w:t>
+        <w:t>38</w:t>
       </w:r>
       <w:r>
         <w:rPr>
@@ -1289,7 +1289,7 @@
           <w:szCs w:val="20"/>
           <w:rtl w:val="0"/>
         </w:rPr>
-        <w:t>38</w:t>
+        <w:t>39</w:t>
       </w:r>
       <w:r>
         <w:rPr>
@@ -1319,7 +1319,7 @@
           <w:szCs w:val="20"/>
           <w:rtl w:val="0"/>
         </w:rPr>
-        <w:t>38</w:t>
+        <w:t>39</w:t>
       </w:r>
       <w:r>
         <w:rPr>
@@ -1349,7 +1349,7 @@
           <w:szCs w:val="20"/>
           <w:rtl w:val="0"/>
         </w:rPr>
-        <w:t>39</w:t>
+        <w:t>40</w:t>
       </w:r>
       <w:r>
         <w:rPr>
@@ -1377,36 +1377,6 @@
         <w:rPr>
           <w:sz w:val="20"/>
           <w:szCs w:val="20"/>
-          <w:rtl w:val="0"/>
-        </w:rPr>
-        <w:t>39</w:t>
-      </w:r>
-      <w:r>
-        <w:rPr>
-          <w:rtl w:val="0"/>
-        </w:rPr>
-      </w:r>
-    </w:p>
-    <w:p>
-      <w:pPr>
-        <w:spacing w:after="120" w:lineRule="auto"/>
-        <w:ind w:left="0" w:firstLine="0"/>
-        <w:rPr/>
-      </w:pPr>
-      <w:r>
-        <w:rPr>
-          <w:b w:val="1"/>
-          <w:bCs w:val="1"/>
-          <w:sz w:val="22"/>
-          <w:szCs w:val="22"/>
-          <w:rtl w:val="0"/>
-        </w:rPr>
-        <w:t xml:space="preserve">Anexo A - Referência Visual do Sistema Anterior (v1) </w:t>
-      </w:r>
-      <w:r>
-        <w:rPr>
-          <w:sz w:val="22"/>
-          <w:szCs w:val="22"/>
           <w:rtl w:val="0"/>
         </w:rPr>
         <w:t>40</w:t>
@@ -1486,7 +1456,7 @@
           <w:szCs w:val="24"/>
           <w:rtl w:val="0"/>
         </w:rPr>
-        <w:t xml:space="preserve">O sistema atual de gestão de delegacia (v1) resolve, de forma funcional porém artesanal (Java puro, sem framework, HttpServer nativo, JDBC/PostgreSQL), dois problemas centrais do trabalho cartorário policial: o controle de oitivas (agendamento e acompanhamento de uma oitiva policial) e o controle de documentos/procedimentos (rastreabilidade de posse e repasse de procedimentos entre servidores, com histórico de custódia e arquivamento).</w:t>
+        <w:t>O controle interno de uma delegacia não tem hoje um sistema próprio. Dois problemas centrais do trabalho cartorário policial dependem de anotações manuais: o controle de oitivas (agendamento e acompanhamento de uma oitiva policial) e o controle de documentos/procedimentos (rastreabilidade de posse e repasse de procedimentos entre servidores, com histórico de custódia e arquivamento).</w:t>
       </w:r>
     </w:p>
     <w:p>
@@ -1505,7 +1475,7 @@
           <w:szCs w:val="24"/>
           <w:rtl w:val="0"/>
         </w:rPr>
-        <w:t>Esse controle hoje depende de planilhas e papel, gerando risco de perda de rastreabilidade e retrabalho manual. A versão 2 (v2) não muda o problema de negócio - muda a arquitetura e a maturidade de engenharia da solução, servindo como projeto de portfolio que aplica Spring Boot, Spring Security (JWT) e React sobre o mesmo domínio já validado na v1, aproveitando a oportunidade de corrigir limitações estruturais da v1 (ex.: repasse unilateral de custódia) por se tratar de um projeto greenfield.</w:t>
+        <w:t>Esse controle hoje depende de livros, planilhas e papel, gerando risco de perda de rastreabilidade, retrabalho manual e dificuldade na conferência da carga da unidade. O SISGEP foi desenvolvido do zero para esse domínio, com arquitetura em camadas (Spring Boot, Spring Security com JWT e React) e com o repasse de custódia baseado em aceite: o procedimento só muda de mãos quando o destinatário aceita.</w:t>
       </w:r>
     </w:p>
     <w:p>
@@ -1524,7 +1494,7 @@
           <w:szCs w:val="24"/>
           <w:rtl w:val="0"/>
         </w:rPr>
-        <w:t>Além desses dois controles, a v2 incorpora o controle de veículos apreendidos e o registro de ofícios expedidos, hoje feito em livro cartorário, com o objetivo de substituir os livros e planilhas da rotina cartorária. Na v2 o sistema passou a se chamar SISGEP - Sistema Interno de Gestão Policial.</w:t>
+        <w:t>Além desses dois controles, o SISGEP incorpora o controle de veículos apreendidos e o registro de ofícios expedidos, hoje feito em livro cartorário, com o objetivo de substituir os livros e planilhas da rotina cartorária.</w:t>
       </w:r>
     </w:p>
     <w:p>
@@ -1589,90 +1559,7 @@
           <w:vertAlign w:val="baseline"/>
           <w:rtl w:val="0"/>
         </w:rPr>
-        <w:t xml:space="preserve">Reescrever o sistema com arquitetura em camadas (API REST + SPA), </w:t>
-      </w:r>
-      <w:r>
-        <w:rPr>
-          <w:sz w:val="24"/>
-          <w:szCs w:val="24"/>
-          <w:rtl w:val="0"/>
-        </w:rPr>
-        <w:t xml:space="preserve">autenticação</w:t>
-      </w:r>
-      <w:r>
-        <w:rPr>
-          <w:rFonts w:ascii="Times New Roman" w:cs="Times New Roman" w:eastAsia="Times New Roman" w:hAnsi="Times New Roman"/>
-          <w:b w:val="0"/>
-          <w:bCs w:val="0"/>
-          <w:i w:val="0"/>
-          <w:iCs w:val="0"/>
-          <w:smallCaps w:val="0"/>
-          <w:strike w:val="0"/>
-          <w:sz w:val="24"/>
-          <w:szCs w:val="24"/>
-          <w:u w:val="none"/>
-          <w:shd w:fill="auto" w:val="clear"/>
-          <w:vertAlign w:val="baseline"/>
-          <w:rtl w:val="0"/>
-        </w:rPr>
-        <w:t xml:space="preserve">/</w:t>
-      </w:r>
-      <w:r>
-        <w:rPr>
-          <w:sz w:val="24"/>
-          <w:szCs w:val="24"/>
-          <w:rtl w:val="0"/>
-        </w:rPr>
-        <w:t xml:space="preserve">autorização</w:t>
-      </w:r>
-      <w:r>
-        <w:rPr>
-          <w:rFonts w:ascii="Times New Roman" w:cs="Times New Roman" w:eastAsia="Times New Roman" w:hAnsi="Times New Roman"/>
-          <w:b w:val="0"/>
-          <w:bCs w:val="0"/>
-          <w:i w:val="0"/>
-          <w:iCs w:val="0"/>
-          <w:smallCaps w:val="0"/>
-          <w:strike w:val="0"/>
-          <w:sz w:val="24"/>
-          <w:szCs w:val="24"/>
-          <w:u w:val="none"/>
-          <w:shd w:fill="auto" w:val="clear"/>
-          <w:vertAlign w:val="baseline"/>
-          <w:rtl w:val="0"/>
-        </w:rPr>
-        <w:t xml:space="preserve"> robusta via Spring Security, e </w:t>
-      </w:r>
-      <w:r>
-        <w:rPr>
-          <w:sz w:val="24"/>
-          <w:szCs w:val="24"/>
-          <w:rtl w:val="0"/>
-        </w:rPr>
-        <w:t xml:space="preserve">persistência</w:t>
-      </w:r>
-      <w:r>
-        <w:rPr>
-          <w:rFonts w:ascii="Times New Roman" w:cs="Times New Roman" w:eastAsia="Times New Roman" w:hAnsi="Times New Roman"/>
-          <w:b w:val="0"/>
-          <w:bCs w:val="0"/>
-          <w:i w:val="0"/>
-          <w:iCs w:val="0"/>
-          <w:smallCaps w:val="0"/>
-          <w:strike w:val="0"/>
-          <w:sz w:val="24"/>
-          <w:szCs w:val="24"/>
-          <w:u w:val="none"/>
-          <w:shd w:fill="auto" w:val="clear"/>
-          <w:vertAlign w:val="baseline"/>
-          <w:rtl w:val="0"/>
-        </w:rPr>
-        <w:t xml:space="preserve"> via Spring Data JPA.</w:t>
-      </w:r>
-      <w:r>
-        <w:rPr>
-          <w:rtl w:val="0"/>
-        </w:rPr>
+        <w:t>Desenvolver o sistema com arquitetura em camadas (API REST + SPA), autenticação/autorização robusta via Spring Security e persistência via Spring Data JPA.</w:t>
       </w:r>
     </w:p>
     <w:p>
@@ -1717,64 +1604,7 @@
           <w:vertAlign w:val="baseline"/>
           <w:rtl w:val="0"/>
         </w:rPr>
-        <w:t xml:space="preserve">Manter paridade funcional com a v1 nos </w:t>
-      </w:r>
-      <w:r>
-        <w:rPr>
-          <w:sz w:val="24"/>
-          <w:szCs w:val="24"/>
-          <w:rtl w:val="0"/>
-        </w:rPr>
-        <w:t xml:space="preserve">módulos</w:t>
-      </w:r>
-      <w:r>
-        <w:rPr>
-          <w:rFonts w:ascii="Times New Roman" w:cs="Times New Roman" w:eastAsia="Times New Roman" w:hAnsi="Times New Roman"/>
-          <w:b w:val="0"/>
-          <w:bCs w:val="0"/>
-          <w:i w:val="0"/>
-          <w:iCs w:val="0"/>
-          <w:smallCaps w:val="0"/>
-          <w:strike w:val="0"/>
-          <w:sz w:val="24"/>
-          <w:szCs w:val="24"/>
-          <w:u w:val="none"/>
-          <w:shd w:fill="auto" w:val="clear"/>
-          <w:vertAlign w:val="baseline"/>
-          <w:rtl w:val="0"/>
-        </w:rPr>
-        <w:t xml:space="preserve"> de Oitivas e Documentos, evoluindo o fluxo de repasse de </w:t>
-      </w:r>
-      <w:r>
-        <w:rPr>
-          <w:sz w:val="24"/>
-          <w:szCs w:val="24"/>
-          <w:rtl w:val="0"/>
-        </w:rPr>
-        <w:t xml:space="preserve">custódia</w:t>
-      </w:r>
-      <w:r>
-        <w:rPr>
-          <w:rFonts w:ascii="Times New Roman" w:cs="Times New Roman" w:eastAsia="Times New Roman" w:hAnsi="Times New Roman"/>
-          <w:b w:val="0"/>
-          <w:bCs w:val="0"/>
-          <w:i w:val="0"/>
-          <w:iCs w:val="0"/>
-          <w:smallCaps w:val="0"/>
-          <w:strike w:val="0"/>
-          <w:sz w:val="24"/>
-          <w:szCs w:val="24"/>
-          <w:u w:val="none"/>
-          <w:shd w:fill="auto" w:val="clear"/>
-          <w:vertAlign w:val="baseline"/>
-          <w:rtl w:val="0"/>
-        </w:rPr>
-        <w:t xml:space="preserve"> para um modelo com estado (pendente/aceito/recusado).</w:t>
-      </w:r>
-      <w:r>
-        <w:rPr>
-          <w:rtl w:val="0"/>
-        </w:rPr>
+        <w:t>Cobrir os controles de Oitivas e de Procedimentos, com o repasse de custódia baseado em estado (pendente/aceito/recusado): a custódia só é transferida com o aceite do destinatário.</w:t>
       </w:r>
     </w:p>
     <w:p>
@@ -6970,6 +6800,34 @@
     </w:p>
     <w:p>
       <w:pPr>
+        <w:spacing w:after="120" w:lineRule="auto"/>
+        <w:ind w:firstLine="720"/>
+        <w:jc w:val="both"/>
+        <w:rPr>
+          <w:sz w:val="24"/>
+          <w:szCs w:val="24"/>
+        </w:rPr>
+      </w:pPr>
+      <w:r>
+        <w:rPr>
+          <w:b/>
+          <w:sz w:val="24"/>
+          <w:szCs w:val="24"/>
+          <w:rtl w:val="0"/>
+        </w:rPr>
+        <w:t>Como funciona a implantação (Figura 10):</w:t>
+      </w:r>
+      <w:r>
+        <w:rPr>
+          <w:b w:val="0"/>
+          <w:sz w:val="24"/>
+          <w:szCs w:val="24"/>
+          <w:rtl w:val="0"/>
+        </w:rPr>
+      </w:r>
+    </w:p>
+    <w:p>
+      <w:pPr>
         <w:keepNext w:val="0"/>
         <w:keepLines w:val="0"/>
         <w:pageBreakBefore w:val="0"/>
@@ -7000,7 +6858,7 @@
           <w:szCs w:val="24"/>
           <w:rtl w:val="0"/>
         </w:rPr>
-        <w:t>Continuidade: a v1 já operava localmente, na rede da delegacia.</w:t>
+        <w:t>O sistema é distribuído em três contêineres descritos em um único arquivo docker-compose.yml: front (Nginx servindo o React compilado e repassando as chamadas /api), api (Spring Boot, com o Java já embutido na imagem) e banco (PostgreSQL). O servidor precisa apenas do Docker; não é necessário instalar Java, Node ou PostgreSQL.</w:t>
       </w:r>
       <w:r>
         <w:rPr>
@@ -7045,34 +6903,6 @@
       </w:r>
       <w:r>
         <w:rPr>
-          <w:rtl w:val="0"/>
-        </w:rPr>
-      </w:r>
-    </w:p>
-    <w:p>
-      <w:pPr>
-        <w:spacing w:after="120" w:lineRule="auto"/>
-        <w:ind w:firstLine="720"/>
-        <w:jc w:val="both"/>
-        <w:rPr>
-          <w:sz w:val="24"/>
-          <w:szCs w:val="24"/>
-        </w:rPr>
-      </w:pPr>
-      <w:r>
-        <w:rPr>
-          <w:b/>
-          <w:sz w:val="24"/>
-          <w:szCs w:val="24"/>
-          <w:rtl w:val="0"/>
-        </w:rPr>
-        <w:t>Como funciona a implantação (Figura 10):</w:t>
-      </w:r>
-      <w:r>
-        <w:rPr>
-          <w:b w:val="0"/>
-          <w:sz w:val="24"/>
-          <w:szCs w:val="24"/>
           <w:rtl w:val="0"/>
         </w:rPr>
       </w:r>
@@ -7109,7 +6939,7 @@
           <w:szCs w:val="24"/>
           <w:rtl w:val="0"/>
         </w:rPr>
-        <w:t>O sistema é distribuído em três contêineres descritos em um único arquivo docker-compose.yml: front (Nginx servindo o React compilado e repassando as chamadas /api), api (Spring Boot, com o Java já embutido na imagem) e banco (PostgreSQL). O servidor precisa apenas do Docker; não é necessário instalar Java, Node ou PostgreSQL.</w:t>
+        <w:t>Instalação: copiar a pasta do sistema com o docker-compose.yml e o arquivo .env (senha do banco, JWT_SECRET, nome da unidade) e executar docker compose up -d. Os demais computadores acessam pelo navegador, no endereço interno do servidor. Um computador simples (ex.: 4 GB de memória) atende uma delegacia.</w:t>
       </w:r>
       <w:r>
         <w:rPr>
@@ -7190,7 +7020,7 @@
           <w:szCs w:val="24"/>
           <w:rtl w:val="0"/>
         </w:rPr>
-        <w:t>Instalação: copiar a pasta do sistema com o docker-compose.yml e o arquivo .env (senha do banco, JWT_SECRET, nome da unidade) e executar docker compose up -d. Os demais computadores acessam pelo navegador, no endereço interno do servidor. Um computador simples (ex.: 4 GB de memória) atende uma delegacia.</w:t>
+        <w:t>Atualização: docker compose pull seguido de docker compose up -d, preservando os dados, que ficam em volumes. Em rede sem internet, a imagem pode ser levada por mídia (docker save / docker load). Voltar a uma versão anterior é trocar a versão (tag) da imagem.</w:t>
       </w:r>
       <w:r>
         <w:rPr>
@@ -7271,7 +7101,7 @@
           <w:szCs w:val="24"/>
           <w:rtl w:val="0"/>
         </w:rPr>
-        <w:t>Atualização: docker compose pull seguido de docker compose up -d, preservando os dados, que ficam em volumes. Em rede sem internet, a imagem pode ser levada por mídia (docker save / docker load). Voltar a uma versão anterior é trocar a versão (tag) da imagem.</w:t>
+        <w:t>Resiliência e backup: os contêineres reiniciam sozinhos após queda de energia (restart: unless-stopped) e o banco é copiado diariamente (pg_dump) para mídia externa ou para o servidor da regional.</w:t>
       </w:r>
       <w:r>
         <w:rPr>
@@ -7352,7 +7182,7 @@
           <w:szCs w:val="24"/>
           <w:rtl w:val="0"/>
         </w:rPr>
-        <w:t>Resiliência e backup: os contêineres reiniciam sozinhos após queda de energia (restart: unless-stopped) e o banco é copiado diariamente (pg_dump) para mídia externa ou para o servidor da regional.</w:t>
+        <w:t>Segurança: HTTPS mesmo na rede interna, pois o token JWT trafega em toda requisição; o banco não é exposto na rede (somente a API o acessa) e os segredos ficam no .env, fora do controle de versão (RNF13).</w:t>
       </w:r>
       <w:r>
         <w:rPr>
@@ -7399,6 +7229,64 @@
         <w:rPr>
           <w:rtl w:val="0"/>
         </w:rPr>
+      </w:r>
+    </w:p>
+    <w:p>
+      <w:pPr>
+        <w:spacing w:after="120" w:lineRule="auto"/>
+        <w:ind w:firstLine="720"/>
+        <w:jc w:val="both"/>
+        <w:rPr>
+          <w:sz w:val="24"/>
+          <w:szCs w:val="24"/>
+        </w:rPr>
+      </w:pPr>
+      <w:r>
+        <w:rPr>
+          <w:b/>
+          <w:sz w:val="24"/>
+          <w:szCs w:val="24"/>
+          <w:rtl w:val="0"/>
+        </w:rPr>
+        <w:t>Consequências assumidas:</w:t>
+      </w:r>
+      <w:r>
+        <w:rPr>
+          <w:b w:val="0"/>
+          <w:sz w:val="24"/>
+          <w:szCs w:val="24"/>
+          <w:rtl w:val="0"/>
+        </w:rPr>
+        <w:t xml:space="preserve"> as atualizações precisam ser aplicadas em cada unidade (mitigado pela imagem versionada e pela atualização em um comando) e não há visão consolidada entre delegacias.</w:t>
+      </w:r>
+    </w:p>
+    <w:p>
+      <w:pPr>
+        <w:spacing w:after="120" w:lineRule="auto"/>
+        <w:ind w:firstLine="720"/>
+        <w:jc w:val="both"/>
+        <w:rPr>
+          <w:sz w:val="24"/>
+          <w:szCs w:val="24"/>
+        </w:rPr>
+      </w:pPr>
+      <w:r>
+        <w:rPr>
+          <w:b/>
+          <w:sz w:val="24"/>
+          <w:szCs w:val="24"/>
+          <w:rtl w:val="0"/>
+        </w:rPr>
+        <w:t>Evolução prevista - implantação institucional centralizada:</w:t>
+      </w:r>
+      <w:r>
+        <w:rPr>
+          <w:b w:val="0"/>
+          <w:sz w:val="24"/>
+          <w:szCs w:val="24"/>
+          <w:rtl w:val="0"/>
+        </w:rPr>
+        <w:t xml:space="preserve"> caso a Polícia Civil opte por hospedar o SISGEP em sua própria infraestrutura (data center da instituição), a solução evolui para multi-tenant por unidade policial sem reescrita, porque a API já é stateless e organizada em camadas:</w:t>
       </w:r>
     </w:p>
     <w:p>
@@ -7433,7 +7321,7 @@
           <w:szCs w:val="24"/>
           <w:rtl w:val="0"/>
         </w:rPr>
-        <w:t>Segurança: HTTPS mesmo na rede interna, pois o token JWT trafega em toda requisição; o banco não é exposto na rede (somente a API o acessa) e os segredos ficam no .env, fora do controle de versão (RNF13).</w:t>
+        <w:t>Autenticação delegada ao provedor de identidade institucional (login único da intranet, via OpenID Connect ou LDAP/Active Directory): a API já opera como OAuth2 Resource Server e passaria a validar os tokens emitidos por esse provedor, dispensando login e gestão de senhas próprios.</w:t>
       </w:r>
       <w:r>
         <w:rPr>
@@ -7480,64 +7368,6 @@
         <w:rPr>
           <w:rtl w:val="0"/>
         </w:rPr>
-      </w:r>
-    </w:p>
-    <w:p>
-      <w:pPr>
-        <w:spacing w:after="120" w:lineRule="auto"/>
-        <w:ind w:firstLine="720"/>
-        <w:jc w:val="both"/>
-        <w:rPr>
-          <w:sz w:val="24"/>
-          <w:szCs w:val="24"/>
-        </w:rPr>
-      </w:pPr>
-      <w:r>
-        <w:rPr>
-          <w:b/>
-          <w:sz w:val="24"/>
-          <w:szCs w:val="24"/>
-          <w:rtl w:val="0"/>
-        </w:rPr>
-        <w:t>Consequências assumidas:</w:t>
-      </w:r>
-      <w:r>
-        <w:rPr>
-          <w:b w:val="0"/>
-          <w:sz w:val="24"/>
-          <w:szCs w:val="24"/>
-          <w:rtl w:val="0"/>
-        </w:rPr>
-        <w:t xml:space="preserve"> as atualizações precisam ser aplicadas em cada unidade (mitigado pela imagem versionada e pela atualização em um comando) e não há visão consolidada entre delegacias.</w:t>
-      </w:r>
-    </w:p>
-    <w:p>
-      <w:pPr>
-        <w:spacing w:after="120" w:lineRule="auto"/>
-        <w:ind w:firstLine="720"/>
-        <w:jc w:val="both"/>
-        <w:rPr>
-          <w:sz w:val="24"/>
-          <w:szCs w:val="24"/>
-        </w:rPr>
-      </w:pPr>
-      <w:r>
-        <w:rPr>
-          <w:b/>
-          <w:sz w:val="24"/>
-          <w:szCs w:val="24"/>
-          <w:rtl w:val="0"/>
-        </w:rPr>
-        <w:t>Evolução prevista - implantação institucional centralizada:</w:t>
-      </w:r>
-      <w:r>
-        <w:rPr>
-          <w:b w:val="0"/>
-          <w:sz w:val="24"/>
-          <w:szCs w:val="24"/>
-          <w:rtl w:val="0"/>
-        </w:rPr>
-        <w:t xml:space="preserve"> caso a Polícia Civil opte por hospedar o SISGEP em sua própria infraestrutura (data center da instituição), a solução evolui para multi-tenant por unidade policial sem reescrita, porque a API já é stateless e organizada em camadas:</w:t>
       </w:r>
     </w:p>
     <w:p>
@@ -7572,7 +7402,7 @@
           <w:szCs w:val="24"/>
           <w:rtl w:val="0"/>
         </w:rPr>
-        <w:t>Autenticação delegada ao provedor de identidade institucional (login único da intranet, via OpenID Connect ou LDAP/Active Directory): a API já opera como OAuth2 Resource Server e passaria a validar os tokens emitidos por esse provedor, dispensando login e gestão de senhas próprios.</w:t>
+        <w:t>Autorização e lotação mantidas no SISGEP: entidade Delegacia e vínculo do servidor à unidade, definido pelo Admin da unidade, no lugar da aprovação de cadastro; o papel (Delegado, Policial, Estagiário) continua sendo definido no SISGEP.</w:t>
       </w:r>
       <w:r>
         <w:rPr>
@@ -7653,7 +7483,7 @@
           <w:szCs w:val="24"/>
           <w:rtl w:val="0"/>
         </w:rPr>
-        <w:t>Autorização e lotação mantidas no SISGEP: entidade Delegacia e vínculo do servidor à unidade, definido pelo Admin da unidade, no lugar da aprovação de cadastro; o papel (Delegado, Policial, Estagiário) continua sendo definido no SISGEP.</w:t>
+        <w:t>Segregação dos dados por unidade: coluna delegacia_id nas tabelas principais (procedimento, oitiva, veículo, ofício), preenchida a partir do usuário logado e aplicada automaticamente em todas as consultas pelo recurso de multi-tenancy do Hibernate (@TenantId); alternativa com isolamento mais forte: um schema por delegacia.</w:t>
       </w:r>
       <w:r>
         <w:rPr>
@@ -7734,7 +7564,7 @@
           <w:szCs w:val="24"/>
           <w:rtl w:val="0"/>
         </w:rPr>
-        <w:t>Segregação dos dados por unidade: coluna delegacia_id nas tabelas principais (procedimento, oitiva, veículo, ofício), preenchida a partir do usuário logado e aplicada automaticamente em todas as consultas pelo recurso de multi-tenancy do Hibernate (@TenantId); alternativa com isolamento mais forte: um schema por delegacia.</w:t>
+        <w:t>Numeração por unidade: a unicidade passa a incluir a delegacia (delegacia + tipo + número + ano no procedimento; delegacia + número + ano no ofício).</w:t>
       </w:r>
       <w:r>
         <w:rPr>
@@ -7815,7 +7645,7 @@
           <w:szCs w:val="24"/>
           <w:rtl w:val="0"/>
         </w:rPr>
-        <w:t>Numeração por unidade: a unicidade passa a incluir a delegacia (delegacia + tipo + número + ano no procedimento; delegacia + número + ano no ofício).</w:t>
+        <w:t>Situações a tratar nessa evolução: transferência de servidor (repassar os procedimentos em posse antes de trocar a lotação), redistribuição de procedimento entre delegacias e perfis com visão de várias unidades (ex.: Delegacia Regional e Corregedoria, somente leitura).</w:t>
       </w:r>
       <w:r>
         <w:rPr>
@@ -7860,6 +7690,75 @@
       </w:r>
       <w:r>
         <w:rPr>
+          <w:rtl w:val="0"/>
+        </w:rPr>
+      </w:r>
+    </w:p>
+    <w:p>
+      <w:pPr>
+        <w:pStyle w:val="Heading2"/>
+        <w:keepNext/>
+        <w:spacing w:after="150" w:before="300" w:lineRule="auto"/>
+        <w:rPr>
+          <w:b w:val="1"/>
+          <w:bCs w:val="1"/>
+          <w:color w:val="000000"/>
+        </w:rPr>
+      </w:pPr>
+      <w:r>
+        <w:rPr>
+          <w:b w:val="1"/>
+          <w:bCs w:val="1"/>
+          <w:color w:val="000000"/>
+          <w:rtl w:val="0"/>
+        </w:rPr>
+        <w:t>1.9 Assistente Virtual com IA - Diretrizes de Sigilo</w:t>
+      </w:r>
+    </w:p>
+    <w:p>
+      <w:pPr>
+        <w:spacing w:after="120" w:lineRule="auto"/>
+        <w:ind w:firstLine="720"/>
+        <w:jc w:val="both"/>
+        <w:rPr>
+          <w:sz w:val="24"/>
+          <w:szCs w:val="24"/>
+        </w:rPr>
+      </w:pPr>
+      <w:r>
+        <w:rPr>
+          <w:b w:val="0"/>
+          <w:sz w:val="24"/>
+          <w:szCs w:val="24"/>
+          <w:rtl w:val="0"/>
+        </w:rPr>
+        <w:t>O assistente virtual (em desenvolvimento) gera, sob demanda, um resumo de um procedimento a partir dos dados registrados no sistema. Como os dados de investigação são sigilosos, o fluxo e as salvaguardas abaixo fazem parte do requisito (RF42 e RNF14).</w:t>
+      </w:r>
+    </w:p>
+    <w:p>
+      <w:pPr>
+        <w:spacing w:after="120" w:lineRule="auto"/>
+        <w:ind w:firstLine="720"/>
+        <w:jc w:val="both"/>
+        <w:rPr>
+          <w:sz w:val="24"/>
+          <w:szCs w:val="24"/>
+        </w:rPr>
+      </w:pPr>
+      <w:r>
+        <w:rPr>
+          <w:b/>
+          <w:sz w:val="24"/>
+          <w:szCs w:val="24"/>
+          <w:rtl w:val="0"/>
+        </w:rPr>
+        <w:t>Fluxo:</w:t>
+      </w:r>
+      <w:r>
+        <w:rPr>
+          <w:b w:val="0"/>
+          <w:sz w:val="24"/>
+          <w:szCs w:val="24"/>
           <w:rtl w:val="0"/>
         </w:rPr>
       </w:r>
@@ -7896,7 +7795,7 @@
           <w:szCs w:val="24"/>
           <w:rtl w:val="0"/>
         </w:rPr>
-        <w:t>Situações a tratar nessa evolução: transferência de servidor (repassar os procedimentos em posse antes de trocar a lotação), redistribuição de procedimento entre delegacias e perfis com visão de várias unidades (ex.: Delegacia Regional e Corregedoria, somente leitura).</w:t>
+        <w:t>O usuário solicita o resumo de um procedimento.</w:t>
       </w:r>
       <w:r>
         <w:rPr>
@@ -7941,75 +7840,6 @@
       </w:r>
       <w:r>
         <w:rPr>
-          <w:rtl w:val="0"/>
-        </w:rPr>
-      </w:r>
-    </w:p>
-    <w:p>
-      <w:pPr>
-        <w:pStyle w:val="Heading2"/>
-        <w:keepNext/>
-        <w:spacing w:after="150" w:before="300" w:lineRule="auto"/>
-        <w:rPr>
-          <w:b w:val="1"/>
-          <w:bCs w:val="1"/>
-          <w:color w:val="000000"/>
-        </w:rPr>
-      </w:pPr>
-      <w:r>
-        <w:rPr>
-          <w:b w:val="1"/>
-          <w:bCs w:val="1"/>
-          <w:color w:val="000000"/>
-          <w:rtl w:val="0"/>
-        </w:rPr>
-        <w:t>1.9 Assistente Virtual com IA - Diretrizes de Sigilo</w:t>
-      </w:r>
-    </w:p>
-    <w:p>
-      <w:pPr>
-        <w:spacing w:after="120" w:lineRule="auto"/>
-        <w:ind w:firstLine="720"/>
-        <w:jc w:val="both"/>
-        <w:rPr>
-          <w:sz w:val="24"/>
-          <w:szCs w:val="24"/>
-        </w:rPr>
-      </w:pPr>
-      <w:r>
-        <w:rPr>
-          <w:b w:val="0"/>
-          <w:sz w:val="24"/>
-          <w:szCs w:val="24"/>
-          <w:rtl w:val="0"/>
-        </w:rPr>
-        <w:t>O assistente virtual (em desenvolvimento) gera, sob demanda, um resumo de um procedimento a partir dos dados registrados no sistema. Como os dados de investigação são sigilosos, o fluxo e as salvaguardas abaixo fazem parte do requisito (RF42 e RNF14).</w:t>
-      </w:r>
-    </w:p>
-    <w:p>
-      <w:pPr>
-        <w:spacing w:after="120" w:lineRule="auto"/>
-        <w:ind w:firstLine="720"/>
-        <w:jc w:val="both"/>
-        <w:rPr>
-          <w:sz w:val="24"/>
-          <w:szCs w:val="24"/>
-        </w:rPr>
-      </w:pPr>
-      <w:r>
-        <w:rPr>
-          <w:b/>
-          <w:sz w:val="24"/>
-          <w:szCs w:val="24"/>
-          <w:rtl w:val="0"/>
-        </w:rPr>
-        <w:t>Fluxo:</w:t>
-      </w:r>
-      <w:r>
-        <w:rPr>
-          <w:b w:val="0"/>
-          <w:sz w:val="24"/>
-          <w:szCs w:val="24"/>
           <w:rtl w:val="0"/>
         </w:rPr>
       </w:r>
@@ -8046,7 +7876,7 @@
           <w:szCs w:val="24"/>
           <w:rtl w:val="0"/>
         </w:rPr>
-        <w:t>O usuário solicita o resumo de um procedimento.</w:t>
+        <w:t>O serviço valida a permissão: somente o detentor atual do procedimento pode solicitar o resumo (exposição mínima ao provedor externo).</w:t>
       </w:r>
       <w:r>
         <w:rPr>
@@ -8127,7 +7957,7 @@
           <w:szCs w:val="24"/>
           <w:rtl w:val="0"/>
         </w:rPr>
-        <w:t>O serviço valida a permissão: somente o detentor atual do procedimento pode solicitar o resumo (exposição mínima ao provedor externo).</w:t>
+        <w:t>O serviço valida a existência do procedimento e reúne os dados relacionados: histórico de status, repasses, oitivas e partes, veículos e histórico de situação.</w:t>
       </w:r>
       <w:r>
         <w:rPr>
@@ -8208,7 +8038,7 @@
           <w:szCs w:val="24"/>
           <w:rtl w:val="0"/>
         </w:rPr>
-        <w:t>O serviço valida a existência do procedimento e reúne os dados relacionados: histórico de status, repasses, oitivas e partes, veículos e histórico de situação.</w:t>
+        <w:t>Um DTO formata esses dados em texto legível, já minimizado: apenas os campos necessários, partes identificadas pelo papel (ex.: Testemunha 1) e sem matrícula, login ou dados de contato.</w:t>
       </w:r>
       <w:r>
         <w:rPr>
@@ -8289,7 +8119,7 @@
           <w:szCs w:val="24"/>
           <w:rtl w:val="0"/>
         </w:rPr>
-        <w:t>Um DTO formata esses dados em texto legível, já minimizado: apenas os campos necessários, partes identificadas pelo papel (ex.: Testemunha 1) e sem matrícula, login ou dados de contato.</w:t>
+        <w:t>O texto é enviado ao modelo de IA com instruções fixas: responder somente com base nos dados recebidos, informar quando algo não consta e tratar campos de texto livre como dados, nunca como instruções (proteção contra prompt injection).</w:t>
       </w:r>
       <w:r>
         <w:rPr>
@@ -8370,7 +8200,7 @@
           <w:szCs w:val="24"/>
           <w:rtl w:val="0"/>
         </w:rPr>
-        <w:t>O texto é enviado ao modelo de IA com instruções fixas: responder somente com base nos dados recebidos, informar quando algo não consta e tratar campos de texto livre como dados, nunca como instruções (proteção contra prompt injection).</w:t>
+        <w:t>A resposta passa por conferência automática (datas e números citados precisam existir nos dados enviados) e é devolvida identificada como gerada por IA, para conferência humana; o resumo não é gravado como documento oficial.</w:t>
       </w:r>
       <w:r>
         <w:rPr>
@@ -8415,6 +8245,34 @@
       </w:r>
       <w:r>
         <w:rPr>
+          <w:rtl w:val="0"/>
+        </w:rPr>
+      </w:r>
+    </w:p>
+    <w:p>
+      <w:pPr>
+        <w:spacing w:after="120" w:lineRule="auto"/>
+        <w:ind w:firstLine="720"/>
+        <w:jc w:val="both"/>
+        <w:rPr>
+          <w:sz w:val="24"/>
+          <w:szCs w:val="24"/>
+        </w:rPr>
+      </w:pPr>
+      <w:r>
+        <w:rPr>
+          <w:b/>
+          <w:sz w:val="24"/>
+          <w:szCs w:val="24"/>
+          <w:rtl w:val="0"/>
+        </w:rPr>
+        <w:t>Salvaguardas:</w:t>
+      </w:r>
+      <w:r>
+        <w:rPr>
+          <w:b w:val="0"/>
+          <w:sz w:val="24"/>
+          <w:szCs w:val="24"/>
           <w:rtl w:val="0"/>
         </w:rPr>
       </w:r>
@@ -8451,7 +8309,7 @@
           <w:szCs w:val="24"/>
           <w:rtl w:val="0"/>
         </w:rPr>
-        <w:t>A resposta passa por conferência automática (datas e números citados precisam existir nos dados enviados) e é devolvida identificada como gerada por IA, para conferência humana; o resumo não é gravado como documento oficial.</w:t>
+        <w:t>Chave da API do provedor somente no servidor (arquivo .env); o front-end nunca acessa o provedor diretamente.</w:t>
       </w:r>
       <w:r>
         <w:rPr>
@@ -8496,34 +8354,6 @@
       </w:r>
       <w:r>
         <w:rPr>
-          <w:rtl w:val="0"/>
-        </w:rPr>
-      </w:r>
-    </w:p>
-    <w:p>
-      <w:pPr>
-        <w:spacing w:after="120" w:lineRule="auto"/>
-        <w:ind w:firstLine="720"/>
-        <w:jc w:val="both"/>
-        <w:rPr>
-          <w:sz w:val="24"/>
-          <w:szCs w:val="24"/>
-        </w:rPr>
-      </w:pPr>
-      <w:r>
-        <w:rPr>
-          <w:b/>
-          <w:sz w:val="24"/>
-          <w:szCs w:val="24"/>
-          <w:rtl w:val="0"/>
-        </w:rPr>
-        <w:t>Salvaguardas:</w:t>
-      </w:r>
-      <w:r>
-        <w:rPr>
-          <w:b w:val="0"/>
-          <w:sz w:val="24"/>
-          <w:szCs w:val="24"/>
           <w:rtl w:val="0"/>
         </w:rPr>
       </w:r>
@@ -8560,7 +8390,7 @@
           <w:szCs w:val="24"/>
           <w:rtl w:val="0"/>
         </w:rPr>
-        <w:t>Chave da API do provedor somente no servidor (arquivo .env); o front-end nunca acessa o provedor diretamente.</w:t>
+        <w:t>Registro de uso (quem solicitou, qual procedimento e quando), sem armazenar o conteúdo enviado ou recebido, e limite de solicitações por usuário.</w:t>
       </w:r>
       <w:r>
         <w:rPr>
@@ -8641,7 +8471,7 @@
           <w:szCs w:val="24"/>
           <w:rtl w:val="0"/>
         </w:rPr>
-        <w:t>Registro de uso (quem solicitou, qual procedimento e quando), sem armazenar o conteúdo enviado ou recebido, e limite de solicitações por usuário.</w:t>
+        <w:t>Demonstração somente com dados fictícios; em produção, contratação sem retenção nem uso dos dados para treinamento, ou modelo executado localmente, coerente com a implantação local da seção 1.8.</w:t>
       </w:r>
       <w:r>
         <w:rPr>
@@ -8722,7 +8552,7 @@
           <w:szCs w:val="24"/>
           <w:rtl w:val="0"/>
         </w:rPr>
-        <w:t>Demonstração somente com dados fictícios; em produção, contratação sem retenção nem uso dos dados para treinamento, ou modelo executado localmente, coerente com a implantação local da seção 1.8.</w:t>
+        <w:t>Sem internet ou com o provedor indisponível, o restante do sistema continua funcionando; apenas o resumo fica indisponível, com mensagem amigável.</w:t>
       </w:r>
       <w:r>
         <w:rPr>
@@ -8773,87 +8603,6 @@
     </w:p>
     <w:p>
       <w:pPr>
-        <w:keepNext w:val="0"/>
-        <w:keepLines w:val="0"/>
-        <w:pageBreakBefore w:val="0"/>
-        <w:widowControl w:val="1"/>
-        <w:numPr>
-          <w:ilvl w:val="0"/>
-          <w:numId w:val="1"/>
-        </w:numPr>
-        <w:pBdr>
-          <w:top w:space="0" w:sz="0" w:val="nil"/>
-          <w:left w:space="0" w:sz="0" w:val="nil"/>
-          <w:bottom w:space="0" w:sz="0" w:val="nil"/>
-          <w:right w:space="0" w:sz="0" w:val="nil"/>
-          <w:between w:space="0" w:sz="0" w:val="nil"/>
-        </w:pBdr>
-        <w:shd w:fill="auto" w:val="clear"/>
-        <w:spacing w:after="60" w:before="0" w:line="240" w:lineRule="auto"/>
-        <w:ind w:left="720" w:right="0" w:hanging="360"/>
-        <w:jc w:val="both"/>
-        <w:rPr>
-          <w:sz w:val="24"/>
-          <w:szCs w:val="24"/>
-        </w:rPr>
-      </w:pPr>
-      <w:r>
-        <w:rPr>
-          <w:sz w:val="24"/>
-          <w:szCs w:val="24"/>
-          <w:rtl w:val="0"/>
-        </w:rPr>
-        <w:t>Sem internet ou com o provedor indisponível, o restante do sistema continua funcionando; apenas o resumo fica indisponível, com mensagem amigável.</w:t>
-      </w:r>
-      <w:r>
-        <w:rPr>
-          <w:rFonts w:ascii="Times New Roman" w:cs="Times New Roman" w:eastAsia="Times New Roman" w:hAnsi="Times New Roman"/>
-          <w:b w:val="0"/>
-          <w:bCs w:val="0"/>
-          <w:i w:val="0"/>
-          <w:iCs w:val="0"/>
-          <w:smallCaps w:val="0"/>
-          <w:strike w:val="0"/>
-          <w:sz w:val="24"/>
-          <w:szCs w:val="24"/>
-          <w:u w:val="none"/>
-          <w:shd w:fill="auto" w:val="clear"/>
-          <w:vertAlign w:val="baseline"/>
-          <w:rtl w:val="0"/>
-        </w:rPr>
-      </w:r>
-      <w:r>
-        <w:rPr>
-          <w:sz w:val="24"/>
-          <w:szCs w:val="24"/>
-          <w:rtl w:val="0"/>
-        </w:rPr>
-      </w:r>
-      <w:r>
-        <w:rPr>
-          <w:rFonts w:ascii="Times New Roman" w:cs="Times New Roman" w:eastAsia="Times New Roman" w:hAnsi="Times New Roman"/>
-          <w:b w:val="0"/>
-          <w:bCs w:val="0"/>
-          <w:i w:val="0"/>
-          <w:iCs w:val="0"/>
-          <w:smallCaps w:val="0"/>
-          <w:strike w:val="0"/>
-          <w:sz w:val="24"/>
-          <w:szCs w:val="24"/>
-          <w:u w:val="none"/>
-          <w:shd w:fill="auto" w:val="clear"/>
-          <w:vertAlign w:val="baseline"/>
-          <w:rtl w:val="0"/>
-        </w:rPr>
-      </w:r>
-      <w:r>
-        <w:rPr>
-          <w:rtl w:val="0"/>
-        </w:rPr>
-      </w:r>
-    </w:p>
-    <w:p>
-      <w:pPr>
         <w:rPr/>
       </w:pPr>
       <w:r>
@@ -8901,7 +8650,7 @@
           <w:szCs w:val="24"/>
           <w:rtl w:val="0"/>
         </w:rPr>
-        <w:t xml:space="preserve">Os requisitos funcionais foram extraídos das funcionalidades já existentes no sistema v1 e das evoluções de negócio definidas para a v2, priorizados segundo o método MoScoW (Must have, Should have, Could have, Won't have).</w:t>
+        <w:t>Os requisitos funcionais foram levantados a partir da rotina cartorária da delegacia (oitivas, posse e repasse de procedimentos, veículos apreendidos e ofícios) e priorizados segundo o método MoSCoW (Must have, Should have, Could have, Won't have).</w:t>
       </w:r>
     </w:p>
     <w:tbl>
@@ -12828,12 +12577,7 @@
                 <w:szCs w:val="19"/>
                 <w:rtl w:val="0"/>
               </w:rPr>
-              <w:t xml:space="preserve">Should</w:t>
-            </w:r>
-            <w:r>
-              <w:rPr>
-                <w:rtl w:val="0"/>
-              </w:rPr>
+              <w:t>Filtros: periodo de abertura, um ou mais tipos e status. Lista vazia e informada em vez de gerar arquivo vazio. Nao inclui dados de importacao de acervo historico (fora de escopo na Fase 1).</w:t>
             </w:r>
           </w:p>
         </w:tc>
@@ -15744,12 +15488,7 @@
                 <w:szCs w:val="19"/>
                 <w:rtl w:val="0"/>
               </w:rPr>
-              <w:t>O sistema deve permitir listar procedimentos com filtros (situacao: em andamento, arquivados, remetidos ou todos; tipo; ano; detentor; texto por numero ou crime), com paginacao e contagem por situacao.</w:t>
-            </w:r>
-            <w:r>
-              <w:rPr>
-                <w:rtl w:val="0"/>
-              </w:rPr>
+              <w:t>O sistema deve permitir listar procedimentos com filtros (situacao: em andamento, arquivados, remetidos ou todos; tipo; ano; detentor; texto por numero ou crime; periodo de abertura), com ordenacao, paginacao e contagem por situacao.</w:t>
             </w:r>
           </w:p>
         </w:tc>
@@ -15834,12 +15573,7 @@
                 <w:szCs w:val="19"/>
                 <w:rtl w:val="0"/>
               </w:rPr>
-              <w:t>"Remetido" e o procedimento com remessa final registrada (RF15), sem status proprio. A linha indica repasse pendente.</w:t>
-            </w:r>
-            <w:r>
-              <w:rPr>
-                <w:rtl w:val="0"/>
-              </w:rPr>
+              <w:t>"Remetido" e o procedimento com remessa final registrada (RF15), sem status proprio. A linha indica repasse pendente e ha quanto tempo o procedimento esta com o detentor atual.</w:t>
             </w:r>
           </w:p>
         </w:tc>
@@ -16302,12 +16036,7 @@
                 <w:szCs w:val="19"/>
                 <w:rtl w:val="0"/>
               </w:rPr>
-              <w:t>O sistema deve permitir buscar, em um unico campo, procedimentos (ex.: IP 45/2026), veiculos (placa ou lacre) e oficios (ex.: 123/2026).</w:t>
-            </w:r>
-            <w:r>
-              <w:rPr>
-                <w:rtl w:val="0"/>
-              </w:rPr>
+              <w:t>O sistema deve permitir buscar, em um unico campo, procedimentos (ex.: IP 45/2026), veiculos (placa ou lacre) e pessoas (nome ou alcunha); oficios entram na busca quando o modulo for implementado.</w:t>
             </w:r>
           </w:p>
         </w:tc>
@@ -17634,12 +17363,7 @@
                 <w:szCs w:val="19"/>
                 <w:rtl w:val="0"/>
               </w:rPr>
-              <w:t xml:space="preserve">O sistema deve restringir endpoints da API por papel (role), usando Spring Security.</w:t>
-            </w:r>
-            <w:r>
-              <w:rPr>
-                <w:rtl w:val="0"/>
-              </w:rPr>
+              <w:t>O sistema deve restringir endpoints da API por papel (role), usando Spring Security; alem do papel, as acoes sobre um registro conferem o dono (ex.: so o detentor ou um Delegado arquiva; so o destinatario responde ao repasse), e a falta de permissao responde 403.</w:t>
             </w:r>
           </w:p>
         </w:tc>
@@ -23085,12 +22809,7 @@
           <w:vertAlign w:val="baseline"/>
           <w:rtl w:val="0"/>
         </w:rPr>
-        <w:t xml:space="preserve">Usuario acessa lista de solicitacoes pendentes.</w:t>
-      </w:r>
-      <w:r>
-        <w:rPr>
-          <w:rtl w:val="0"/>
-        </w:rPr>
+        <w:t>Usuario acessa a tela de repasses, com as abas Recebidos e Enviados (pendentes, com a contagem de cada uma) e Historico (aceitos e recusados), podendo buscar por numero do procedimento, crime ou nome do servidor.</w:t>
       </w:r>
     </w:p>
     <w:p>
@@ -26538,7 +26257,7 @@
         <w:rPr>
           <w:rtl w:val="0"/>
         </w:rPr>
-        <w:t xml:space="preserve">Admin localiza o usuario e define uma senha provisoria (mesmo fluxo de reset de senha do sistema v1), que e armazenada com hash (RNF03) e repassada pessoalmente ao servidor. Como o sistema nao armazena e-mail (autenticacao apenas por login), nao ha recuperacao self-service via link.</w:t>
+        <w:t>Admin localiza o usuario e define uma senha provisoria, que e armazenada com hash (RNF03) e repassada pessoalmente ao servidor. Como o sistema nao armazena e-mail (autenticacao apenas por login), nao ha recuperacao self-service via link; depois do primeiro acesso, o proprio usuario pode trocar a senha (UC34).</w:t>
       </w:r>
     </w:p>
     <w:p>
@@ -26594,7 +26313,7 @@
         <w:rPr>
           <w:rtl w:val="0"/>
         </w:rPr>
-        <w:t>Delegado/Policial seleciona filtro (periodo de abertura, tipo, status) e formato (XLSX/PDF); sistema gera o arquivo com os procedimentos nativos do sistema, informando os filtros usados, quem gerou e quando. Excecao: nenhum registro encontrado com o filtro - sistema informa lista vazia em vez de gerar arquivo vazio.</w:t>
+        <w:t>Delegado/Policial seleciona filtro (periodo de abertura, um ou mais tipos, status) e formato (XLSX/PDF); sistema gera o arquivo com os procedimentos nativos do sistema, informando os filtros usados, quem gerou e quando. Excecao: nenhum registro encontrado com o filtro - sistema informa lista vazia em vez de gerar arquivo vazio.</w:t>
       </w:r>
     </w:p>
     <w:p>
@@ -26818,7 +26537,7 @@
         <w:rPr>
           <w:rtl w:val="0"/>
         </w:rPr>
-        <w:t>Usuario acessa a listagem e escolhe a aba (em andamento, arquivados, remetidos ou todos), podendo filtrar por tipo, ano, detentor e texto; o sistema retorna a pagina solicitada com o total e a contagem por aba. Remetidos = procedimentos com remessa final registrada.</w:t>
+        <w:t>Usuario acessa a listagem e escolhe a aba (em andamento, arquivados, remetidos ou todos), podendo filtrar por tipo, ano, detentor, texto e periodo de abertura (o mesmo filtro da exportacao, UC16, o que permite a previa do relatorio na tela) e ordenar por data de abertura ou por procedimento; o sistema retorna a pagina solicitada com o total, a contagem por aba e, em cada linha, ha quanto tempo o procedimento esta com o detentor atual e se ha repasse pendente. Remetidos = procedimentos com remessa final registrada.</w:t>
       </w:r>
     </w:p>
     <w:p>
@@ -26874,7 +26593,7 @@
         <w:rPr>
           <w:rtl w:val="0"/>
         </w:rPr>
-        <w:t>Usuario digita o termo no cabecalho; o sistema reconhece numero de procedimento (tipo numero/ano), placa, lacre ou numero de oficio e devolve os resultados agrupados, levando a ficha correspondente. Excecao: nenhum resultado - sistema informa.</w:t>
+        <w:t>Usuario digita o termo no cabecalho; o sistema reconhece numero de procedimento (tipo numero/ano), placa, lacre ou nome de pessoa e devolve os resultados agrupados, levando a ficha correspondente. Excecao: nenhum resultado - sistema informa.</w:t>
       </w:r>
     </w:p>
     <w:p>
@@ -26930,7 +26649,7 @@
         <w:rPr>
           <w:rtl w:val="0"/>
         </w:rPr>
-        <w:t>Usuario informa a senha atual e a nova senha; o sistema confere a senha atual e grava a nova com hash. Excecao: senha atual incorreta - sistema rejeita sem alterar.</w:t>
+        <w:t>Usuario informa a senha atual e a nova senha; o sistema confere a senha atual e grava a nova com hash. Excecoes: senha atual incorreta ou nova senha igual a atual - sistema rejeita sem alterar.</w:t>
       </w:r>
     </w:p>
     <w:p>
@@ -28934,886 +28653,6 @@
           <w:iCs w:val="1"/>
           <w:rtl w:val="0"/>
         </w:rPr>
-      </w:r>
-      <w:r>
-        <w:rPr>
-          <w:rtl w:val="0"/>
-        </w:rPr>
-      </w:r>
-    </w:p>
-    <w:p>
-      <w:pPr>
-        <w:rPr/>
-      </w:pPr>
-      <w:r>
-        <w:br w:type="page"/>
-      </w:r>
-      <w:r>
-        <w:rPr>
-          <w:rtl w:val="0"/>
-        </w:rPr>
-      </w:r>
-    </w:p>
-    <w:p>
-      <w:pPr>
-        <w:pStyle w:val="Heading1"/>
-        <w:spacing w:after="200" w:before="400" w:lineRule="auto"/>
-        <w:rPr>
-          <w:b w:val="1"/>
-          <w:bCs w:val="1"/>
-          <w:color w:val="000000"/>
-        </w:rPr>
-      </w:pPr>
-      <w:r>
-        <w:rPr>
-          <w:b w:val="1"/>
-          <w:bCs w:val="1"/>
-          <w:color w:val="000000"/>
-          <w:rtl w:val="0"/>
-        </w:rPr>
-        <w:t xml:space="preserve">Anexo A - Referência Visual do Sistema Anterior (v1)</w:t>
-      </w:r>
-    </w:p>
-    <w:p>
-      <w:pPr>
-        <w:spacing w:after="120" w:lineRule="auto"/>
-        <w:ind w:firstLine="720"/>
-        <w:jc w:val="both"/>
-        <w:rPr>
-          <w:sz w:val="24"/>
-          <w:szCs w:val="24"/>
-        </w:rPr>
-      </w:pPr>
-      <w:r>
-        <w:rPr>
-          <w:sz w:val="24"/>
-          <w:szCs w:val="24"/>
-          <w:rtl w:val="0"/>
-        </w:rPr>
-        <w:t xml:space="preserve">As telas a seguir são capturas de tela do sistema v1, desenvolvido em Java puro (sem framework), com frontend em JavaScript vanilla e persistência via JDBC/PostgreSQL. Servem como referência de identidade visual (brasão da PC-SE, tipografia Oswald/Inter, paleta dourada) e de campos de domínio já validados em uso real, que orientam - sem determinar de forma rígida - o design de telas equivalentes na v2.</w:t>
-      </w:r>
-    </w:p>
-    <w:p>
-      <w:pPr>
-        <w:spacing w:after="100" w:lineRule="auto"/>
-        <w:jc w:val="center"/>
-        <w:rPr/>
-      </w:pPr>
-      <w:r>
-        <w:rPr/>
-        <w:drawing>
-          <wp:inline distB="0" distT="0" distL="0" distR="0">
-            <wp:extent cx="4730960" cy="2185073"/>
-            <wp:effectExtent b="0" l="0" r="0" t="0"/>
-            <wp:docPr id="34" name="image14.jpg"/>
-            <a:graphic>
-              <a:graphicData uri="http://schemas.openxmlformats.org/drawingml/2006/picture">
-                <pic:pic>
-                  <pic:nvPicPr>
-                    <pic:cNvPr id="0" name="image14.jpg"/>
-                    <pic:cNvPicPr preferRelativeResize="0"/>
-                  </pic:nvPicPr>
-                  <pic:blipFill>
-                    <a:blip r:embed="rId17"/>
-                    <a:srcRect b="0" l="0" r="0" t="0"/>
-                    <a:stretch>
-                      <a:fillRect/>
-                    </a:stretch>
-                  </pic:blipFill>
-                  <pic:spPr>
-                    <a:xfrm>
-                      <a:off x="0" y="0"/>
-                      <a:ext cx="4730960" cy="2185073"/>
-                    </a:xfrm>
-                    <a:prstGeom prst="rect"/>
-                    <a:ln/>
-                  </pic:spPr>
-                </pic:pic>
-              </a:graphicData>
-            </a:graphic>
-          </wp:inline>
-        </w:drawing>
-      </w:r>
-      <w:r>
-        <w:rPr>
-          <w:rtl w:val="0"/>
-        </w:rPr>
-      </w:r>
-    </w:p>
-    <w:p>
-      <w:pPr>
-        <w:spacing w:after="300" w:lineRule="auto"/>
-        <w:jc w:val="center"/>
-        <w:rPr/>
-      </w:pPr>
-      <w:r>
-        <w:rPr>
-          <w:i w:val="1"/>
-          <w:iCs w:val="1"/>
-          <w:sz w:val="20"/>
-          <w:szCs w:val="20"/>
-          <w:rtl w:val="0"/>
-        </w:rPr>
-        <w:t>Figura 18 - Tela de login (sistema v1)</w:t>
-      </w:r>
-      <w:r>
-        <w:rPr>
-          <w:rtl w:val="0"/>
-        </w:rPr>
-      </w:r>
-    </w:p>
-    <w:p>
-      <w:pPr>
-        <w:spacing w:after="100" w:lineRule="auto"/>
-        <w:jc w:val="center"/>
-        <w:rPr/>
-      </w:pPr>
-      <w:r>
-        <w:rPr/>
-        <w:drawing>
-          <wp:inline distB="0" distT="0" distL="0" distR="0">
-            <wp:extent cx="4730960" cy="2185073"/>
-            <wp:effectExtent b="0" l="0" r="0" t="0"/>
-            <wp:docPr id="36" name="image16.jpg"/>
-            <a:graphic>
-              <a:graphicData uri="http://schemas.openxmlformats.org/drawingml/2006/picture">
-                <pic:pic>
-                  <pic:nvPicPr>
-                    <pic:cNvPr id="0" name="image16.jpg"/>
-                    <pic:cNvPicPr preferRelativeResize="0"/>
-                  </pic:nvPicPr>
-                  <pic:blipFill>
-                    <a:blip r:embed="rId18"/>
-                    <a:srcRect b="0" l="0" r="0" t="0"/>
-                    <a:stretch>
-                      <a:fillRect/>
-                    </a:stretch>
-                  </pic:blipFill>
-                  <pic:spPr>
-                    <a:xfrm>
-                      <a:off x="0" y="0"/>
-                      <a:ext cx="4730960" cy="2185073"/>
-                    </a:xfrm>
-                    <a:prstGeom prst="rect"/>
-                    <a:ln/>
-                  </pic:spPr>
-                </pic:pic>
-              </a:graphicData>
-            </a:graphic>
-          </wp:inline>
-        </w:drawing>
-      </w:r>
-      <w:r>
-        <w:rPr>
-          <w:rtl w:val="0"/>
-        </w:rPr>
-      </w:r>
-    </w:p>
-    <w:p>
-      <w:pPr>
-        <w:spacing w:after="300" w:lineRule="auto"/>
-        <w:jc w:val="center"/>
-        <w:rPr/>
-      </w:pPr>
-      <w:r>
-        <w:rPr>
-          <w:i w:val="1"/>
-          <w:iCs w:val="1"/>
-          <w:sz w:val="20"/>
-          <w:szCs w:val="20"/>
-          <w:rtl w:val="0"/>
-        </w:rPr>
-        <w:t>Figura 19 - Painel principal (menu de modulos) (sistema v1)</w:t>
-      </w:r>
-      <w:r>
-        <w:rPr>
-          <w:rtl w:val="0"/>
-        </w:rPr>
-      </w:r>
-    </w:p>
-    <w:p>
-      <w:pPr>
-        <w:spacing w:after="100" w:lineRule="auto"/>
-        <w:jc w:val="center"/>
-        <w:rPr/>
-      </w:pPr>
-      <w:r>
-        <w:rPr/>
-        <w:drawing>
-          <wp:inline distB="0" distT="0" distL="0" distR="0">
-            <wp:extent cx="4730960" cy="2185073"/>
-            <wp:effectExtent b="0" l="0" r="0" t="0"/>
-            <wp:docPr id="38" name="image1.jpg"/>
-            <a:graphic>
-              <a:graphicData uri="http://schemas.openxmlformats.org/drawingml/2006/picture">
-                <pic:pic>
-                  <pic:nvPicPr>
-                    <pic:cNvPr id="0" name="image1.jpg"/>
-                    <pic:cNvPicPr preferRelativeResize="0"/>
-                  </pic:nvPicPr>
-                  <pic:blipFill>
-                    <a:blip r:embed="rId19"/>
-                    <a:srcRect b="0" l="0" r="0" t="0"/>
-                    <a:stretch>
-                      <a:fillRect/>
-                    </a:stretch>
-                  </pic:blipFill>
-                  <pic:spPr>
-                    <a:xfrm>
-                      <a:off x="0" y="0"/>
-                      <a:ext cx="4730960" cy="2185073"/>
-                    </a:xfrm>
-                    <a:prstGeom prst="rect"/>
-                    <a:ln/>
-                  </pic:spPr>
-                </pic:pic>
-              </a:graphicData>
-            </a:graphic>
-          </wp:inline>
-        </w:drawing>
-      </w:r>
-      <w:r>
-        <w:rPr>
-          <w:rtl w:val="0"/>
-        </w:rPr>
-      </w:r>
-    </w:p>
-    <w:p>
-      <w:pPr>
-        <w:spacing w:after="300" w:lineRule="auto"/>
-        <w:jc w:val="center"/>
-        <w:rPr/>
-      </w:pPr>
-      <w:r>
-        <w:rPr>
-          <w:i w:val="1"/>
-          <w:iCs w:val="1"/>
-          <w:sz w:val="20"/>
-          <w:szCs w:val="20"/>
-          <w:rtl w:val="0"/>
-        </w:rPr>
-        <w:t>Figura 20 - Cadastro de funcionario (sistema v1)</w:t>
-      </w:r>
-      <w:r>
-        <w:rPr>
-          <w:rtl w:val="0"/>
-        </w:rPr>
-      </w:r>
-    </w:p>
-    <w:p>
-      <w:pPr>
-        <w:spacing w:after="100" w:lineRule="auto"/>
-        <w:jc w:val="center"/>
-        <w:rPr/>
-      </w:pPr>
-      <w:r>
-        <w:rPr/>
-        <w:drawing>
-          <wp:inline distB="0" distT="0" distL="0" distR="0">
-            <wp:extent cx="4730960" cy="2185073"/>
-            <wp:effectExtent b="0" l="0" r="0" t="0"/>
-            <wp:docPr id="39" name="image18.jpg"/>
-            <a:graphic>
-              <a:graphicData uri="http://schemas.openxmlformats.org/drawingml/2006/picture">
-                <pic:pic>
-                  <pic:nvPicPr>
-                    <pic:cNvPr id="0" name="image18.jpg"/>
-                    <pic:cNvPicPr preferRelativeResize="0"/>
-                  </pic:nvPicPr>
-                  <pic:blipFill>
-                    <a:blip r:embed="rId20"/>
-                    <a:srcRect b="0" l="0" r="0" t="0"/>
-                    <a:stretch>
-                      <a:fillRect/>
-                    </a:stretch>
-                  </pic:blipFill>
-                  <pic:spPr>
-                    <a:xfrm>
-                      <a:off x="0" y="0"/>
-                      <a:ext cx="4730960" cy="2185073"/>
-                    </a:xfrm>
-                    <a:prstGeom prst="rect"/>
-                    <a:ln/>
-                  </pic:spPr>
-                </pic:pic>
-              </a:graphicData>
-            </a:graphic>
-          </wp:inline>
-        </w:drawing>
-      </w:r>
-      <w:r>
-        <w:rPr>
-          <w:rtl w:val="0"/>
-        </w:rPr>
-      </w:r>
-    </w:p>
-    <w:p>
-      <w:pPr>
-        <w:spacing w:after="300" w:lineRule="auto"/>
-        <w:jc w:val="center"/>
-        <w:rPr/>
-      </w:pPr>
-      <w:r>
-        <w:rPr>
-          <w:i w:val="1"/>
-          <w:iCs w:val="1"/>
-          <w:sz w:val="20"/>
-          <w:szCs w:val="20"/>
-          <w:rtl w:val="0"/>
-        </w:rPr>
-        <w:t>Figura 21 - Aprovacao de cadastros pendentes (sistema v1)</w:t>
-      </w:r>
-      <w:r>
-        <w:rPr>
-          <w:rtl w:val="0"/>
-        </w:rPr>
-      </w:r>
-    </w:p>
-    <w:p>
-      <w:pPr>
-        <w:spacing w:after="100" w:lineRule="auto"/>
-        <w:jc w:val="center"/>
-        <w:rPr/>
-      </w:pPr>
-      <w:r>
-        <w:rPr/>
-        <w:drawing>
-          <wp:inline distB="0" distT="0" distL="0" distR="0">
-            <wp:extent cx="4730960" cy="2185073"/>
-            <wp:effectExtent b="0" l="0" r="0" t="0"/>
-            <wp:docPr id="40" name="image15.jpg"/>
-            <a:graphic>
-              <a:graphicData uri="http://schemas.openxmlformats.org/drawingml/2006/picture">
-                <pic:pic>
-                  <pic:nvPicPr>
-                    <pic:cNvPr id="0" name="image15.jpg"/>
-                    <pic:cNvPicPr preferRelativeResize="0"/>
-                  </pic:nvPicPr>
-                  <pic:blipFill>
-                    <a:blip r:embed="rId21"/>
-                    <a:srcRect b="0" l="0" r="0" t="0"/>
-                    <a:stretch>
-                      <a:fillRect/>
-                    </a:stretch>
-                  </pic:blipFill>
-                  <pic:spPr>
-                    <a:xfrm>
-                      <a:off x="0" y="0"/>
-                      <a:ext cx="4730960" cy="2185073"/>
-                    </a:xfrm>
-                    <a:prstGeom prst="rect"/>
-                    <a:ln/>
-                  </pic:spPr>
-                </pic:pic>
-              </a:graphicData>
-            </a:graphic>
-          </wp:inline>
-        </w:drawing>
-      </w:r>
-      <w:r>
-        <w:rPr>
-          <w:rtl w:val="0"/>
-        </w:rPr>
-      </w:r>
-    </w:p>
-    <w:p>
-      <w:pPr>
-        <w:spacing w:after="300" w:lineRule="auto"/>
-        <w:jc w:val="center"/>
-        <w:rPr/>
-      </w:pPr>
-      <w:r>
-        <w:rPr>
-          <w:i w:val="1"/>
-          <w:iCs w:val="1"/>
-          <w:sz w:val="20"/>
-          <w:szCs w:val="20"/>
-          <w:rtl w:val="0"/>
-        </w:rPr>
-        <w:t>Figura 22 - Reset de senha de funcionario (sistema v1)</w:t>
-      </w:r>
-      <w:r>
-        <w:rPr>
-          <w:rtl w:val="0"/>
-        </w:rPr>
-      </w:r>
-    </w:p>
-    <w:p>
-      <w:pPr>
-        <w:spacing w:after="100" w:lineRule="auto"/>
-        <w:jc w:val="center"/>
-        <w:rPr/>
-      </w:pPr>
-      <w:r>
-        <w:rPr/>
-        <w:drawing>
-          <wp:inline distB="0" distT="0" distL="0" distR="0">
-            <wp:extent cx="4730960" cy="2185073"/>
-            <wp:effectExtent b="0" l="0" r="0" t="0"/>
-            <wp:docPr id="41" name="image13.jpg"/>
-            <a:graphic>
-              <a:graphicData uri="http://schemas.openxmlformats.org/drawingml/2006/picture">
-                <pic:pic>
-                  <pic:nvPicPr>
-                    <pic:cNvPr id="0" name="image13.jpg"/>
-                    <pic:cNvPicPr preferRelativeResize="0"/>
-                  </pic:nvPicPr>
-                  <pic:blipFill>
-                    <a:blip r:embed="rId22"/>
-                    <a:srcRect b="0" l="0" r="0" t="0"/>
-                    <a:stretch>
-                      <a:fillRect/>
-                    </a:stretch>
-                  </pic:blipFill>
-                  <pic:spPr>
-                    <a:xfrm>
-                      <a:off x="0" y="0"/>
-                      <a:ext cx="4730960" cy="2185073"/>
-                    </a:xfrm>
-                    <a:prstGeom prst="rect"/>
-                    <a:ln/>
-                  </pic:spPr>
-                </pic:pic>
-              </a:graphicData>
-            </a:graphic>
-          </wp:inline>
-        </w:drawing>
-      </w:r>
-      <w:r>
-        <w:rPr>
-          <w:rtl w:val="0"/>
-        </w:rPr>
-      </w:r>
-    </w:p>
-    <w:p>
-      <w:pPr>
-        <w:spacing w:after="300" w:lineRule="auto"/>
-        <w:jc w:val="center"/>
-        <w:rPr/>
-      </w:pPr>
-      <w:r>
-        <w:rPr>
-          <w:i w:val="1"/>
-          <w:iCs w:val="1"/>
-          <w:sz w:val="20"/>
-          <w:szCs w:val="20"/>
-          <w:rtl w:val="0"/>
-        </w:rPr>
-        <w:t>Figura 23 - Listagem geral de oitivas (sistema v1)</w:t>
-      </w:r>
-      <w:r>
-        <w:rPr>
-          <w:rtl w:val="0"/>
-        </w:rPr>
-      </w:r>
-    </w:p>
-    <w:p>
-      <w:pPr>
-        <w:spacing w:after="100" w:lineRule="auto"/>
-        <w:jc w:val="center"/>
-        <w:rPr/>
-      </w:pPr>
-      <w:r>
-        <w:rPr/>
-        <w:drawing>
-          <wp:inline distB="0" distT="0" distL="0" distR="0">
-            <wp:extent cx="4730960" cy="2185073"/>
-            <wp:effectExtent b="0" l="0" r="0" t="0"/>
-            <wp:docPr id="42" name="image20.jpg"/>
-            <a:graphic>
-              <a:graphicData uri="http://schemas.openxmlformats.org/drawingml/2006/picture">
-                <pic:pic>
-                  <pic:nvPicPr>
-                    <pic:cNvPr id="0" name="image20.jpg"/>
-                    <pic:cNvPicPr preferRelativeResize="0"/>
-                  </pic:nvPicPr>
-                  <pic:blipFill>
-                    <a:blip r:embed="rId23"/>
-                    <a:srcRect b="0" l="0" r="0" t="0"/>
-                    <a:stretch>
-                      <a:fillRect/>
-                    </a:stretch>
-                  </pic:blipFill>
-                  <pic:spPr>
-                    <a:xfrm>
-                      <a:off x="0" y="0"/>
-                      <a:ext cx="4730960" cy="2185073"/>
-                    </a:xfrm>
-                    <a:prstGeom prst="rect"/>
-                    <a:ln/>
-                  </pic:spPr>
-                </pic:pic>
-              </a:graphicData>
-            </a:graphic>
-          </wp:inline>
-        </w:drawing>
-      </w:r>
-      <w:r>
-        <w:rPr>
-          <w:rtl w:val="0"/>
-        </w:rPr>
-      </w:r>
-    </w:p>
-    <w:p>
-      <w:pPr>
-        <w:spacing w:after="300" w:lineRule="auto"/>
-        <w:jc w:val="center"/>
-        <w:rPr/>
-      </w:pPr>
-      <w:r>
-        <w:rPr>
-          <w:i w:val="1"/>
-          <w:iCs w:val="1"/>
-          <w:sz w:val="20"/>
-          <w:szCs w:val="20"/>
-          <w:rtl w:val="0"/>
-        </w:rPr>
-        <w:t>Figura 24 - Cadastro de nova oitiva (sistema v1)</w:t>
-      </w:r>
-      <w:r>
-        <w:rPr>
-          <w:rtl w:val="0"/>
-        </w:rPr>
-      </w:r>
-    </w:p>
-    <w:p>
-      <w:pPr>
-        <w:spacing w:after="100" w:lineRule="auto"/>
-        <w:jc w:val="center"/>
-        <w:rPr/>
-      </w:pPr>
-      <w:r>
-        <w:rPr/>
-        <w:drawing>
-          <wp:inline distB="0" distT="0" distL="0" distR="0">
-            <wp:extent cx="4730960" cy="2185073"/>
-            <wp:effectExtent b="0" l="0" r="0" t="0"/>
-            <wp:docPr id="43" name="image12.jpg"/>
-            <a:graphic>
-              <a:graphicData uri="http://schemas.openxmlformats.org/drawingml/2006/picture">
-                <pic:pic>
-                  <pic:nvPicPr>
-                    <pic:cNvPr id="0" name="image12.jpg"/>
-                    <pic:cNvPicPr preferRelativeResize="0"/>
-                  </pic:nvPicPr>
-                  <pic:blipFill>
-                    <a:blip r:embed="rId24"/>
-                    <a:srcRect b="0" l="0" r="0" t="0"/>
-                    <a:stretch>
-                      <a:fillRect/>
-                    </a:stretch>
-                  </pic:blipFill>
-                  <pic:spPr>
-                    <a:xfrm>
-                      <a:off x="0" y="0"/>
-                      <a:ext cx="4730960" cy="2185073"/>
-                    </a:xfrm>
-                    <a:prstGeom prst="rect"/>
-                    <a:ln/>
-                  </pic:spPr>
-                </pic:pic>
-              </a:graphicData>
-            </a:graphic>
-          </wp:inline>
-        </w:drawing>
-      </w:r>
-      <w:r>
-        <w:rPr>
-          <w:rtl w:val="0"/>
-        </w:rPr>
-      </w:r>
-    </w:p>
-    <w:p>
-      <w:pPr>
-        <w:spacing w:after="300" w:lineRule="auto"/>
-        <w:jc w:val="center"/>
-        <w:rPr/>
-      </w:pPr>
-      <w:r>
-        <w:rPr>
-          <w:i w:val="1"/>
-          <w:iCs w:val="1"/>
-          <w:sz w:val="20"/>
-          <w:szCs w:val="20"/>
-          <w:rtl w:val="0"/>
-        </w:rPr>
-        <w:t>Figura 25 - Acervo procedimental (todos os procedimentos) (sistema v1)</w:t>
-      </w:r>
-      <w:r>
-        <w:rPr>
-          <w:rtl w:val="0"/>
-        </w:rPr>
-      </w:r>
-    </w:p>
-    <w:p>
-      <w:pPr>
-        <w:spacing w:after="100" w:lineRule="auto"/>
-        <w:jc w:val="center"/>
-        <w:rPr/>
-      </w:pPr>
-      <w:r>
-        <w:rPr/>
-        <w:drawing>
-          <wp:inline distB="0" distT="0" distL="0" distR="0">
-            <wp:extent cx="4730960" cy="2185073"/>
-            <wp:effectExtent b="0" l="0" r="0" t="0"/>
-            <wp:docPr id="44" name="image22.jpg"/>
-            <a:graphic>
-              <a:graphicData uri="http://schemas.openxmlformats.org/drawingml/2006/picture">
-                <pic:pic>
-                  <pic:nvPicPr>
-                    <pic:cNvPr id="0" name="image22.jpg"/>
-                    <pic:cNvPicPr preferRelativeResize="0"/>
-                  </pic:nvPicPr>
-                  <pic:blipFill>
-                    <a:blip r:embed="rId25"/>
-                    <a:srcRect b="0" l="0" r="0" t="0"/>
-                    <a:stretch>
-                      <a:fillRect/>
-                    </a:stretch>
-                  </pic:blipFill>
-                  <pic:spPr>
-                    <a:xfrm>
-                      <a:off x="0" y="0"/>
-                      <a:ext cx="4730960" cy="2185073"/>
-                    </a:xfrm>
-                    <a:prstGeom prst="rect"/>
-                    <a:ln/>
-                  </pic:spPr>
-                </pic:pic>
-              </a:graphicData>
-            </a:graphic>
-          </wp:inline>
-        </w:drawing>
-      </w:r>
-      <w:r>
-        <w:rPr>
-          <w:rtl w:val="0"/>
-        </w:rPr>
-      </w:r>
-    </w:p>
-    <w:p>
-      <w:pPr>
-        <w:spacing w:after="300" w:lineRule="auto"/>
-        <w:jc w:val="center"/>
-        <w:rPr/>
-      </w:pPr>
-      <w:r>
-        <w:rPr>
-          <w:i w:val="1"/>
-          <w:iCs w:val="1"/>
-          <w:sz w:val="20"/>
-          <w:szCs w:val="20"/>
-          <w:rtl w:val="0"/>
-        </w:rPr>
-        <w:t>Figura 26 - Consulta de posse de procedimento (sistema v1)</w:t>
-      </w:r>
-      <w:r>
-        <w:rPr>
-          <w:rtl w:val="0"/>
-        </w:rPr>
-      </w:r>
-    </w:p>
-    <w:p>
-      <w:pPr>
-        <w:spacing w:after="100" w:lineRule="auto"/>
-        <w:jc w:val="center"/>
-        <w:rPr/>
-      </w:pPr>
-      <w:r>
-        <w:rPr/>
-        <w:drawing>
-          <wp:inline distB="0" distT="0" distL="0" distR="0">
-            <wp:extent cx="4730960" cy="2185073"/>
-            <wp:effectExtent b="0" l="0" r="0" t="0"/>
-            <wp:docPr id="45" name="image19.jpg"/>
-            <a:graphic>
-              <a:graphicData uri="http://schemas.openxmlformats.org/drawingml/2006/picture">
-                <pic:pic>
-                  <pic:nvPicPr>
-                    <pic:cNvPr id="0" name="image19.jpg"/>
-                    <pic:cNvPicPr preferRelativeResize="0"/>
-                  </pic:nvPicPr>
-                  <pic:blipFill>
-                    <a:blip r:embed="rId26"/>
-                    <a:srcRect b="0" l="0" r="0" t="0"/>
-                    <a:stretch>
-                      <a:fillRect/>
-                    </a:stretch>
-                  </pic:blipFill>
-                  <pic:spPr>
-                    <a:xfrm>
-                      <a:off x="0" y="0"/>
-                      <a:ext cx="4730960" cy="2185073"/>
-                    </a:xfrm>
-                    <a:prstGeom prst="rect"/>
-                    <a:ln/>
-                  </pic:spPr>
-                </pic:pic>
-              </a:graphicData>
-            </a:graphic>
-          </wp:inline>
-        </w:drawing>
-      </w:r>
-      <w:r>
-        <w:rPr>
-          <w:rtl w:val="0"/>
-        </w:rPr>
-      </w:r>
-    </w:p>
-    <w:p>
-      <w:pPr>
-        <w:spacing w:after="300" w:lineRule="auto"/>
-        <w:jc w:val="center"/>
-        <w:rPr/>
-      </w:pPr>
-      <w:r>
-        <w:rPr>
-          <w:i w:val="1"/>
-          <w:iCs w:val="1"/>
-          <w:sz w:val="20"/>
-          <w:szCs w:val="20"/>
-          <w:rtl w:val="0"/>
-        </w:rPr>
-        <w:t>Figura 27 - Solicitacao de repasse de procedimento (sistema v1)</w:t>
-      </w:r>
-      <w:r>
-        <w:rPr>
-          <w:rtl w:val="0"/>
-        </w:rPr>
-      </w:r>
-    </w:p>
-    <w:p>
-      <w:pPr>
-        <w:spacing w:after="100" w:lineRule="auto"/>
-        <w:jc w:val="center"/>
-        <w:rPr/>
-      </w:pPr>
-      <w:r>
-        <w:rPr/>
-        <w:drawing>
-          <wp:inline distB="0" distT="0" distL="0" distR="0">
-            <wp:extent cx="4730960" cy="2185073"/>
-            <wp:effectExtent b="0" l="0" r="0" t="0"/>
-            <wp:docPr id="32" name="image21.jpg"/>
-            <a:graphic>
-              <a:graphicData uri="http://schemas.openxmlformats.org/drawingml/2006/picture">
-                <pic:pic>
-                  <pic:nvPicPr>
-                    <pic:cNvPr id="0" name="image21.jpg"/>
-                    <pic:cNvPicPr preferRelativeResize="0"/>
-                  </pic:nvPicPr>
-                  <pic:blipFill>
-                    <a:blip r:embed="rId27"/>
-                    <a:srcRect b="0" l="0" r="0" t="0"/>
-                    <a:stretch>
-                      <a:fillRect/>
-                    </a:stretch>
-                  </pic:blipFill>
-                  <pic:spPr>
-                    <a:xfrm>
-                      <a:off x="0" y="0"/>
-                      <a:ext cx="4730960" cy="2185073"/>
-                    </a:xfrm>
-                    <a:prstGeom prst="rect"/>
-                    <a:ln/>
-                  </pic:spPr>
-                </pic:pic>
-              </a:graphicData>
-            </a:graphic>
-          </wp:inline>
-        </w:drawing>
-      </w:r>
-      <w:r>
-        <w:rPr>
-          <w:rtl w:val="0"/>
-        </w:rPr>
-      </w:r>
-    </w:p>
-    <w:p>
-      <w:pPr>
-        <w:spacing w:after="300" w:lineRule="auto"/>
-        <w:jc w:val="center"/>
-        <w:rPr/>
-      </w:pPr>
-      <w:r>
-        <w:rPr>
-          <w:i w:val="1"/>
-          <w:iCs w:val="1"/>
-          <w:sz w:val="20"/>
-          <w:szCs w:val="20"/>
-          <w:rtl w:val="0"/>
-        </w:rPr>
-        <w:t>Figura 28 - Repasses pendentes de confirmacao (sistema v1)</w:t>
-      </w:r>
-      <w:r>
-        <w:rPr>
-          <w:rtl w:val="0"/>
-        </w:rPr>
-      </w:r>
-    </w:p>
-    <w:p>
-      <w:pPr>
-        <w:spacing w:after="100" w:lineRule="auto"/>
-        <w:jc w:val="center"/>
-        <w:rPr/>
-      </w:pPr>
-      <w:r>
-        <w:rPr/>
-        <w:drawing>
-          <wp:inline distB="0" distT="0" distL="0" distR="0">
-            <wp:extent cx="4730960" cy="2185073"/>
-            <wp:effectExtent b="0" l="0" r="0" t="0"/>
-            <wp:docPr id="35" name="image10.jpg"/>
-            <a:graphic>
-              <a:graphicData uri="http://schemas.openxmlformats.org/drawingml/2006/picture">
-                <pic:pic>
-                  <pic:nvPicPr>
-                    <pic:cNvPr id="0" name="image10.jpg"/>
-                    <pic:cNvPicPr preferRelativeResize="0"/>
-                  </pic:nvPicPr>
-                  <pic:blipFill>
-                    <a:blip r:embed="rId28"/>
-                    <a:srcRect b="0" l="0" r="0" t="0"/>
-                    <a:stretch>
-                      <a:fillRect/>
-                    </a:stretch>
-                  </pic:blipFill>
-                  <pic:spPr>
-                    <a:xfrm>
-                      <a:off x="0" y="0"/>
-                      <a:ext cx="4730960" cy="2185073"/>
-                    </a:xfrm>
-                    <a:prstGeom prst="rect"/>
-                    <a:ln/>
-                  </pic:spPr>
-                </pic:pic>
-              </a:graphicData>
-            </a:graphic>
-          </wp:inline>
-        </w:drawing>
-      </w:r>
-      <w:r>
-        <w:rPr>
-          <w:rtl w:val="0"/>
-        </w:rPr>
-      </w:r>
-    </w:p>
-    <w:p>
-      <w:pPr>
-        <w:spacing w:after="300" w:lineRule="auto"/>
-        <w:jc w:val="center"/>
-        <w:rPr/>
-      </w:pPr>
-      <w:r>
-        <w:rPr>
-          <w:i w:val="1"/>
-          <w:iCs w:val="1"/>
-          <w:sz w:val="20"/>
-          <w:szCs w:val="20"/>
-          <w:rtl w:val="0"/>
-        </w:rPr>
-        <w:t>Figura 29 - Historico de solicitacoes de repasse (sistema v1)</w:t>
       </w:r>
       <w:r>
         <w:rPr>

</xml_diff>

<commit_message>
docs: front-end em React Native + Expo (web), porta 8081
- README, CLAUDE.md e .env.example: o front é React Native + Expo usado no
  navegador, em http://localhost:8081 (não React + Vite na 5173);
  CORS_ORIGENS_PERMITIDAS e ETIQUETA_URL_BASE de exemplo apontam para a 8081
- README: passo para subir o front ao lado da API (npm install e npm run web)
- Diagramas de arquitetura e de implantação regerados com o front em Expo
- docx: textos e as duas figuras atualizados

Co-Authored-By: Claude Opus 5.5 <noreply@anthropic.com>
Claude-Session: https://claude.ai/code/session_01GMFoBKNCA64LGtSS3QvF5S
</commit_message>
<xml_diff>
--- a/docs/SISGEP_Documentacao.docx
+++ b/docs/SISGEP_Documentacao.docx
@@ -1559,7 +1559,7 @@
           <w:vertAlign w:val="baseline"/>
           <w:rtl w:val="0"/>
         </w:rPr>
-        <w:t>Desenvolver o sistema com arquitetura em camadas (API REST + SPA), autenticação/autorização robusta via Spring Security e persistência via Spring Data JPA.</w:t>
+        <w:t>Desenvolver o sistema com arquitetura em camadas (API REST + app web), autenticação/autorização robusta via Spring Security e persistência via Spring Data JPA.</w:t>
       </w:r>
     </w:p>
     <w:p>
@@ -5687,7 +5687,7 @@
           <w:vertAlign w:val="baseline"/>
           <w:rtl w:val="0"/>
         </w:rPr>
-        <w:t>Frontend: React (SPA, Vite), consumindo API REST.</w:t>
+        <w:t>Frontend: React Native + Expo (TypeScript), usado no navegador (versão web), consumindo a API REST.</w:t>
       </w:r>
       <w:r>
         <w:rPr>
@@ -5887,7 +5887,7 @@
           <w:vertAlign w:val="baseline"/>
           <w:rtl w:val="0"/>
         </w:rPr>
-        <w:t>Arquitetura: React -&gt; API REST (Spring Boot) -&gt; Spring Security (filtro JWT) -&gt; Camada de Servico -&gt; Spring Data JPA -&gt; PostgreSQL.</w:t>
+        <w:t>Arquitetura: React Native/Expo (web) -&gt; API REST (Spring Boot) -&gt; Spring Security (filtro JWT) -&gt; Camada de Servico -&gt; Spring Data JPA -&gt; PostgreSQL.</w:t>
       </w:r>
       <w:r>
         <w:rPr>
@@ -6858,7 +6858,7 @@
           <w:szCs w:val="24"/>
           <w:rtl w:val="0"/>
         </w:rPr>
-        <w:t>O sistema é distribuído em três contêineres descritos em um único arquivo docker-compose.yml: front (Nginx servindo o React compilado e repassando as chamadas /api), api (Spring Boot, com o Java já embutido na imagem) e banco (PostgreSQL). O servidor precisa apenas do Docker; não é necessário instalar Java, Node ou PostgreSQL.</w:t>
+        <w:t>O sistema é distribuído em três contêineres descritos em um único arquivo docker-compose.yml: front (Nginx servindo o app Expo (web) compilado e repassando as chamadas /api), api (Spring Boot, com o Java já embutido na imagem) e banco (PostgreSQL). O servidor precisa apenas do Docker; não é necessário instalar Java, Node ou PostgreSQL.</w:t>
       </w:r>
       <w:r>
         <w:rPr>
@@ -17826,7 +17826,7 @@
                 <w:szCs w:val="19"/>
                 <w:rtl w:val="0"/>
               </w:rPr>
-              <w:t>A comunicacao entre o frontend (React) e o backend deve seguir convencoes REST (verbos HTTP, status codes semanticos, JSON).</w:t>
+              <w:t>A comunicacao entre o frontend (React Native + Expo) e o backend deve seguir convencoes REST (verbos HTTP, status codes semanticos, JSON).</w:t>
             </w:r>
             <w:r>
               <w:rPr>
@@ -18108,37 +18108,37 @@
                 <w:szCs w:val="19"/>
                 <w:rtl w:val="0"/>
               </w:rPr>
-              <w:t xml:space="preserve">Responsividade da SPA</w:t>
-            </w:r>
-            <w:r>
-              <w:rPr>
-                <w:rtl w:val="0"/>
-              </w:rPr>
-            </w:r>
-          </w:p>
-        </w:tc>
-        <w:tc>
-          <w:tcPr>
-            <w:tcMar>
-              <w:top w:w="80.0" w:type="dxa"/>
-              <w:left w:w="100.0" w:type="dxa"/>
-              <w:bottom w:w="80.0" w:type="dxa"/>
-              <w:right w:w="100.0" w:type="dxa"/>
-            </w:tcMar>
-          </w:tcPr>
-          <w:p>
-            <w:pPr>
-              <w:rPr/>
-            </w:pPr>
-            <w:r>
-              <w:rPr>
-                <w:b w:val="0"/>
-                <w:bCs w:val="0"/>
-                <w:sz w:val="19"/>
-                <w:szCs w:val="19"/>
-                <w:rtl w:val="0"/>
-              </w:rPr>
-              <w:t>A interface React deve ser utilizavel em desktop e tablet, sem quebra de layout.</w:t>
+              <w:t>Responsividade da interface</w:t>
+            </w:r>
+            <w:r>
+              <w:rPr>
+                <w:rtl w:val="0"/>
+              </w:rPr>
+            </w:r>
+          </w:p>
+        </w:tc>
+        <w:tc>
+          <w:tcPr>
+            <w:tcMar>
+              <w:top w:w="80.0" w:type="dxa"/>
+              <w:left w:w="100.0" w:type="dxa"/>
+              <w:bottom w:w="80.0" w:type="dxa"/>
+              <w:right w:w="100.0" w:type="dxa"/>
+            </w:tcMar>
+          </w:tcPr>
+          <w:p>
+            <w:pPr>
+              <w:rPr/>
+            </w:pPr>
+            <w:r>
+              <w:rPr>
+                <w:b w:val="0"/>
+                <w:bCs w:val="0"/>
+                <w:sz w:val="19"/>
+                <w:szCs w:val="19"/>
+                <w:rtl w:val="0"/>
+              </w:rPr>
+              <w:t>A interface (versao web do app) deve ser utilizavel em desktop e tablet, sem quebra de layout.</w:t>
             </w:r>
             <w:r>
               <w:rPr>
@@ -27764,7 +27764,7 @@
           <w:szCs w:val="24"/>
           <w:rtl w:val="0"/>
         </w:rPr>
-        <w:t>A arquitetura segue o padrão em camadas (React como SPA no cliente, API REST em Spring Boot no servidor), com o filtro JWT do Spring Security interceptando toda requisição antes de alcançar a camada de Controllers. A integração com o assistente de IA (seção 1.9) é opcional e feita somente pela camada de serviço.</w:t>
+        <w:t>A arquitetura segue o padrão em camadas (app React Native + Expo, versão web, no cliente, API REST em Spring Boot no servidor), com o filtro JWT do Spring Security interceptando toda requisição antes de alcançar a camada de Controllers. A integração com o assistente de IA (seção 1.9) é opcional e feita somente pela camada de serviço.</w:t>
       </w:r>
     </w:p>
     <w:p>
@@ -27964,7 +27964,7 @@
           <w:szCs w:val="24"/>
           <w:rtl w:val="0"/>
         </w:rPr>
-        <w:t>As telas a seguir são do protótipo de alta fidelidade da interface React, com dados fictícios. Os indicadores de prazo que aparecem no protótipo (coluna e filtros de prazo, contadores de prazo no painel e sugestões como "Pedir prorrogação") não serão implementados: o controle de prazos processuais é feito pelo sistema institucional da Polícia Civil (seção 1.3). As telas da versão anterior (v1) estão no Anexo A.</w:t>
+        <w:t>As telas a seguir são do protótipo de alta fidelidade da interface (React Native + Expo), com dados fictícios. Os indicadores de prazo que aparecem no protótipo (coluna e filtros de prazo, contadores de prazo no painel e sugestões como "Pedir prorrogação") não serão implementados: o controle de prazos processuais é feito pelo sistema institucional da Polícia Civil (seção 1.3). As telas da versão anterior (v1) estão no Anexo A.</w:t>
       </w:r>
     </w:p>
     <w:p>

</xml_diff>

<commit_message>
docs: front-end em React Native + Expo (web), porta 8081 (#41)
- README, CLAUDE.md e .env.example: o front é React Native + Expo usado no
  navegador, em http://localhost:8081 (não React + Vite na 5173);
  CORS_ORIGENS_PERMITIDAS e ETIQUETA_URL_BASE de exemplo apontam para a 8081
- README: passo para subir o front ao lado da API (npm install e npm run web)
- Diagramas de arquitetura e de implantação regerados com o front em Expo
- docx: textos e as duas figuras atualizados


Claude-Session: https://claude.ai/code/session_01GMFoBKNCA64LGtSS3QvF5S

Co-authored-by: Claude <noreply@anthropic.com>
</commit_message>
<xml_diff>
--- a/docs/SISGEP_Documentacao.docx
+++ b/docs/SISGEP_Documentacao.docx
@@ -1559,7 +1559,7 @@
           <w:vertAlign w:val="baseline"/>
           <w:rtl w:val="0"/>
         </w:rPr>
-        <w:t>Desenvolver o sistema com arquitetura em camadas (API REST + SPA), autenticação/autorização robusta via Spring Security e persistência via Spring Data JPA.</w:t>
+        <w:t>Desenvolver o sistema com arquitetura em camadas (API REST + app web), autenticação/autorização robusta via Spring Security e persistência via Spring Data JPA.</w:t>
       </w:r>
     </w:p>
     <w:p>
@@ -5687,7 +5687,7 @@
           <w:vertAlign w:val="baseline"/>
           <w:rtl w:val="0"/>
         </w:rPr>
-        <w:t>Frontend: React (SPA, Vite), consumindo API REST.</w:t>
+        <w:t>Frontend: React Native + Expo (TypeScript), usado no navegador (versão web), consumindo a API REST.</w:t>
       </w:r>
       <w:r>
         <w:rPr>
@@ -5887,7 +5887,7 @@
           <w:vertAlign w:val="baseline"/>
           <w:rtl w:val="0"/>
         </w:rPr>
-        <w:t>Arquitetura: React -&gt; API REST (Spring Boot) -&gt; Spring Security (filtro JWT) -&gt; Camada de Servico -&gt; Spring Data JPA -&gt; PostgreSQL.</w:t>
+        <w:t>Arquitetura: React Native/Expo (web) -&gt; API REST (Spring Boot) -&gt; Spring Security (filtro JWT) -&gt; Camada de Servico -&gt; Spring Data JPA -&gt; PostgreSQL.</w:t>
       </w:r>
       <w:r>
         <w:rPr>
@@ -6858,7 +6858,7 @@
           <w:szCs w:val="24"/>
           <w:rtl w:val="0"/>
         </w:rPr>
-        <w:t>O sistema é distribuído em três contêineres descritos em um único arquivo docker-compose.yml: front (Nginx servindo o React compilado e repassando as chamadas /api), api (Spring Boot, com o Java já embutido na imagem) e banco (PostgreSQL). O servidor precisa apenas do Docker; não é necessário instalar Java, Node ou PostgreSQL.</w:t>
+        <w:t>O sistema é distribuído em três contêineres descritos em um único arquivo docker-compose.yml: front (Nginx servindo o app Expo (web) compilado e repassando as chamadas /api), api (Spring Boot, com o Java já embutido na imagem) e banco (PostgreSQL). O servidor precisa apenas do Docker; não é necessário instalar Java, Node ou PostgreSQL.</w:t>
       </w:r>
       <w:r>
         <w:rPr>
@@ -17826,7 +17826,7 @@
                 <w:szCs w:val="19"/>
                 <w:rtl w:val="0"/>
               </w:rPr>
-              <w:t>A comunicacao entre o frontend (React) e o backend deve seguir convencoes REST (verbos HTTP, status codes semanticos, JSON).</w:t>
+              <w:t>A comunicacao entre o frontend (React Native + Expo) e o backend deve seguir convencoes REST (verbos HTTP, status codes semanticos, JSON).</w:t>
             </w:r>
             <w:r>
               <w:rPr>
@@ -18108,37 +18108,37 @@
                 <w:szCs w:val="19"/>
                 <w:rtl w:val="0"/>
               </w:rPr>
-              <w:t xml:space="preserve">Responsividade da SPA</w:t>
-            </w:r>
-            <w:r>
-              <w:rPr>
-                <w:rtl w:val="0"/>
-              </w:rPr>
-            </w:r>
-          </w:p>
-        </w:tc>
-        <w:tc>
-          <w:tcPr>
-            <w:tcMar>
-              <w:top w:w="80.0" w:type="dxa"/>
-              <w:left w:w="100.0" w:type="dxa"/>
-              <w:bottom w:w="80.0" w:type="dxa"/>
-              <w:right w:w="100.0" w:type="dxa"/>
-            </w:tcMar>
-          </w:tcPr>
-          <w:p>
-            <w:pPr>
-              <w:rPr/>
-            </w:pPr>
-            <w:r>
-              <w:rPr>
-                <w:b w:val="0"/>
-                <w:bCs w:val="0"/>
-                <w:sz w:val="19"/>
-                <w:szCs w:val="19"/>
-                <w:rtl w:val="0"/>
-              </w:rPr>
-              <w:t>A interface React deve ser utilizavel em desktop e tablet, sem quebra de layout.</w:t>
+              <w:t>Responsividade da interface</w:t>
+            </w:r>
+            <w:r>
+              <w:rPr>
+                <w:rtl w:val="0"/>
+              </w:rPr>
+            </w:r>
+          </w:p>
+        </w:tc>
+        <w:tc>
+          <w:tcPr>
+            <w:tcMar>
+              <w:top w:w="80.0" w:type="dxa"/>
+              <w:left w:w="100.0" w:type="dxa"/>
+              <w:bottom w:w="80.0" w:type="dxa"/>
+              <w:right w:w="100.0" w:type="dxa"/>
+            </w:tcMar>
+          </w:tcPr>
+          <w:p>
+            <w:pPr>
+              <w:rPr/>
+            </w:pPr>
+            <w:r>
+              <w:rPr>
+                <w:b w:val="0"/>
+                <w:bCs w:val="0"/>
+                <w:sz w:val="19"/>
+                <w:szCs w:val="19"/>
+                <w:rtl w:val="0"/>
+              </w:rPr>
+              <w:t>A interface (versao web do app) deve ser utilizavel em desktop e tablet, sem quebra de layout.</w:t>
             </w:r>
             <w:r>
               <w:rPr>
@@ -27764,7 +27764,7 @@
           <w:szCs w:val="24"/>
           <w:rtl w:val="0"/>
         </w:rPr>
-        <w:t>A arquitetura segue o padrão em camadas (React como SPA no cliente, API REST em Spring Boot no servidor), com o filtro JWT do Spring Security interceptando toda requisição antes de alcançar a camada de Controllers. A integração com o assistente de IA (seção 1.9) é opcional e feita somente pela camada de serviço.</w:t>
+        <w:t>A arquitetura segue o padrão em camadas (app React Native + Expo, versão web, no cliente, API REST em Spring Boot no servidor), com o filtro JWT do Spring Security interceptando toda requisição antes de alcançar a camada de Controllers. A integração com o assistente de IA (seção 1.9) é opcional e feita somente pela camada de serviço.</w:t>
       </w:r>
     </w:p>
     <w:p>
@@ -27964,7 +27964,7 @@
           <w:szCs w:val="24"/>
           <w:rtl w:val="0"/>
         </w:rPr>
-        <w:t>As telas a seguir são do protótipo de alta fidelidade da interface React, com dados fictícios. Os indicadores de prazo que aparecem no protótipo (coluna e filtros de prazo, contadores de prazo no painel e sugestões como "Pedir prorrogação") não serão implementados: o controle de prazos processuais é feito pelo sistema institucional da Polícia Civil (seção 1.3). As telas da versão anterior (v1) estão no Anexo A.</w:t>
+        <w:t>As telas a seguir são do protótipo de alta fidelidade da interface (React Native + Expo), com dados fictícios. Os indicadores de prazo que aparecem no protótipo (coluna e filtros de prazo, contadores de prazo no painel e sugestões como "Pedir prorrogação") não serão implementados: o controle de prazos processuais é feito pelo sistema institucional da Polícia Civil (seção 1.3). As telas da versão anterior (v1) estão no Anexo A.</w:t>
       </w:r>
     </w:p>
     <w:p>

</xml_diff>